<commit_message>
vault backup: 2025-11-26 08:55:07
</commit_message>
<xml_diff>
--- a/Курс 3/Базы данных/Лабораторные/02. Физическая организация файлов баз данных/Отчёт 2.docx
+++ b/Курс 3/Базы данных/Лабораторные/02. Физическая организация файлов баз данных/Отчёт 2.docx
@@ -851,6 +851,44 @@
           <w:ilvl w:val="0"/>
           <w:numId w:val="1"/>
         </w:numPr>
+        <w:rPr>
+          <w:szCs w:val="28"/>
+          <w:lang w:val="ru-RU"/>
+        </w:rPr>
+      </w:pPr>
+      <w:r>
+        <w:rPr>
+          <w:lang w:val="ru-RU"/>
+        </w:rPr>
+        <w:t xml:space="preserve">Задание: </w:t>
+      </w:r>
+      <w:r>
+        <w:rPr>
+          <w:szCs w:val="28"/>
+        </w:rPr>
+        <w:t>Запустить программу (…\REBUS\rebus.exe)</w:t>
+      </w:r>
+      <w:r>
+        <w:rPr>
+          <w:szCs w:val="28"/>
+          <w:lang w:val="ru-RU"/>
+        </w:rPr>
+        <w:t>.</w:t>
+      </w:r>
+    </w:p>
+    <w:p>
+      <w:pPr>
+        <w:pStyle w:val="a7"/>
+        <w:ind w:left="785" w:firstLine="0"/>
+        <w:rPr>
+          <w:lang w:val="ru-RU"/>
+        </w:rPr>
+      </w:pPr>
+    </w:p>
+    <w:p>
+      <w:pPr>
+        <w:pStyle w:val="a7"/>
+        <w:ind w:left="785" w:firstLine="0"/>
         <w:rPr>
           <w:lang w:val="ru-RU"/>
         </w:rPr>
@@ -1020,14 +1058,27 @@
       <w:r>
         <w:t xml:space="preserve">Рис. </w:t>
       </w:r>
-      <w:fldSimple w:instr=" SEQ Рис. \* ARABIC ">
-        <w:r>
-          <w:rPr>
-            <w:noProof/>
-          </w:rPr>
-          <w:t>1</w:t>
-        </w:r>
-      </w:fldSimple>
+      <w:r>
+        <w:fldChar w:fldCharType="begin"/>
+      </w:r>
+      <w:r>
+        <w:instrText xml:space="preserve"> SEQ Рис. \* ARABIC </w:instrText>
+      </w:r>
+      <w:r>
+        <w:fldChar w:fldCharType="separate"/>
+      </w:r>
+      <w:r>
+        <w:rPr>
+          <w:noProof/>
+        </w:rPr>
+        <w:t>1</w:t>
+      </w:r>
+      <w:r>
+        <w:rPr>
+          <w:noProof/>
+        </w:rPr>
+        <w:fldChar w:fldCharType="end"/>
+      </w:r>
       <w:r>
         <w:rPr>
           <w:lang w:val="ru-RU"/>
@@ -1100,14 +1151,27 @@
       <w:r>
         <w:t xml:space="preserve">Рис. </w:t>
       </w:r>
-      <w:fldSimple w:instr=" SEQ Рис. \* ARABIC ">
-        <w:r>
-          <w:rPr>
-            <w:noProof/>
-          </w:rPr>
-          <w:t>2</w:t>
-        </w:r>
-      </w:fldSimple>
+      <w:r>
+        <w:fldChar w:fldCharType="begin"/>
+      </w:r>
+      <w:r>
+        <w:instrText xml:space="preserve"> SEQ Рис. \* ARABIC </w:instrText>
+      </w:r>
+      <w:r>
+        <w:fldChar w:fldCharType="separate"/>
+      </w:r>
+      <w:r>
+        <w:rPr>
+          <w:noProof/>
+        </w:rPr>
+        <w:t>2</w:t>
+      </w:r>
+      <w:r>
+        <w:rPr>
+          <w:noProof/>
+        </w:rPr>
+        <w:fldChar w:fldCharType="end"/>
+      </w:r>
       <w:r>
         <w:rPr>
           <w:lang w:val="ru-RU"/>
@@ -1295,6 +1359,15 @@
         </w:rPr>
         <w:t>.</w:t>
       </w:r>
+    </w:p>
+    <w:p>
+      <w:pPr>
+        <w:pStyle w:val="a7"/>
+        <w:ind w:left="785" w:firstLine="0"/>
+        <w:rPr>
+          <w:lang w:val="ru-RU"/>
+        </w:rPr>
+      </w:pPr>
     </w:p>
     <w:p>
       <w:pPr>
@@ -1304,19 +1377,52 @@
           <w:numId w:val="1"/>
         </w:numPr>
         <w:rPr>
-          <w:lang w:val="ru-RU"/>
-        </w:rPr>
-      </w:pPr>
-      <w:r>
-        <w:rPr>
-          <w:lang w:val="ru-RU"/>
-        </w:rPr>
+          <w:szCs w:val="28"/>
+          <w:lang w:val="ru-RU"/>
+        </w:rPr>
+      </w:pPr>
+      <w:r>
+        <w:rPr>
+          <w:szCs w:val="28"/>
+          <w:lang w:val="ru-RU"/>
+        </w:rPr>
+        <w:t xml:space="preserve">Задание: </w:t>
+      </w:r>
+      <w:r>
+        <w:rPr>
+          <w:szCs w:val="28"/>
+        </w:rPr>
+        <w:t>Рассмотреть первый кадр программы. (Рекомендуется перейти в текстовый режим работы экрана – Alt+Enter).</w:t>
+      </w:r>
+    </w:p>
+    <w:p>
+      <w:pPr>
+        <w:pStyle w:val="a7"/>
+        <w:ind w:left="785" w:firstLine="0"/>
+        <w:rPr>
+          <w:lang w:val="ru-RU"/>
+        </w:rPr>
+      </w:pPr>
+      <w:r>
+        <w:rPr>
+          <w:lang w:val="ru-RU"/>
+        </w:rPr>
+        <w:lastRenderedPageBreak/>
         <w:t>На первом кадре программы (рис. 3) находятся: большое лого в центре, командная строка под ним, ещё ниже строка состояния и подсказки по использованию.</w:t>
       </w:r>
     </w:p>
     <w:p>
       <w:pPr>
         <w:pStyle w:val="a7"/>
+        <w:ind w:left="785" w:firstLine="0"/>
+        <w:rPr>
+          <w:lang w:val="ru-RU"/>
+        </w:rPr>
+      </w:pPr>
+    </w:p>
+    <w:p>
+      <w:pPr>
+        <w:pStyle w:val="a7"/>
         <w:keepNext/>
         <w:ind w:left="785" w:firstLine="0"/>
         <w:jc w:val="center"/>
@@ -1326,7 +1432,6 @@
           <w:noProof/>
           <w:lang w:val="ru-RU"/>
         </w:rPr>
-        <w:lastRenderedPageBreak/>
         <w:drawing>
           <wp:inline distT="0" distB="0" distL="0" distR="0">
             <wp:extent cx="4840585" cy="3022564"/>
@@ -1380,14 +1485,27 @@
       <w:r>
         <w:t xml:space="preserve">Рис. </w:t>
       </w:r>
-      <w:fldSimple w:instr=" SEQ Рис. \* ARABIC ">
-        <w:r>
-          <w:rPr>
-            <w:noProof/>
-          </w:rPr>
-          <w:t>3</w:t>
-        </w:r>
-      </w:fldSimple>
+      <w:r>
+        <w:fldChar w:fldCharType="begin"/>
+      </w:r>
+      <w:r>
+        <w:instrText xml:space="preserve"> SEQ Рис. \* ARABIC </w:instrText>
+      </w:r>
+      <w:r>
+        <w:fldChar w:fldCharType="separate"/>
+      </w:r>
+      <w:r>
+        <w:rPr>
+          <w:noProof/>
+        </w:rPr>
+        <w:t>3</w:t>
+      </w:r>
+      <w:r>
+        <w:rPr>
+          <w:noProof/>
+        </w:rPr>
+        <w:fldChar w:fldCharType="end"/>
+      </w:r>
       <w:r>
         <w:rPr>
           <w:lang w:val="ru-RU"/>
@@ -1402,6 +1520,45 @@
           <w:ilvl w:val="0"/>
           <w:numId w:val="1"/>
         </w:numPr>
+        <w:rPr>
+          <w:szCs w:val="28"/>
+          <w:lang w:val="ru-RU"/>
+        </w:rPr>
+      </w:pPr>
+      <w:r>
+        <w:rPr>
+          <w:szCs w:val="28"/>
+          <w:lang w:val="ru-RU"/>
+        </w:rPr>
+        <w:t xml:space="preserve">Задание: </w:t>
+      </w:r>
+      <w:r>
+        <w:rPr>
+          <w:szCs w:val="28"/>
+        </w:rPr>
+        <w:t>Изучите организацию Справки. (Знакомьтесь с синтаксисом и описанием команд через Справку)</w:t>
+      </w:r>
+      <w:r>
+        <w:rPr>
+          <w:szCs w:val="28"/>
+          <w:lang w:val="ru-RU"/>
+        </w:rPr>
+        <w:t>.</w:t>
+      </w:r>
+    </w:p>
+    <w:p>
+      <w:pPr>
+        <w:pStyle w:val="a7"/>
+        <w:ind w:left="785" w:firstLine="0"/>
+        <w:rPr>
+          <w:lang w:val="ru-RU"/>
+        </w:rPr>
+      </w:pPr>
+    </w:p>
+    <w:p>
+      <w:pPr>
+        <w:pStyle w:val="a7"/>
+        <w:ind w:left="785" w:firstLine="0"/>
         <w:rPr>
           <w:lang w:val="ru-RU"/>
         </w:rPr>
@@ -1512,14 +1669,27 @@
       <w:r>
         <w:t xml:space="preserve">Рис. </w:t>
       </w:r>
-      <w:fldSimple w:instr=" SEQ Рис. \* ARABIC ">
-        <w:r>
-          <w:rPr>
-            <w:noProof/>
-          </w:rPr>
-          <w:t>4</w:t>
-        </w:r>
-      </w:fldSimple>
+      <w:r>
+        <w:fldChar w:fldCharType="begin"/>
+      </w:r>
+      <w:r>
+        <w:instrText xml:space="preserve"> SEQ Рис. \* ARABIC </w:instrText>
+      </w:r>
+      <w:r>
+        <w:fldChar w:fldCharType="separate"/>
+      </w:r>
+      <w:r>
+        <w:rPr>
+          <w:noProof/>
+        </w:rPr>
+        <w:t>4</w:t>
+      </w:r>
+      <w:r>
+        <w:rPr>
+          <w:noProof/>
+        </w:rPr>
+        <w:fldChar w:fldCharType="end"/>
+      </w:r>
       <w:r>
         <w:rPr>
           <w:lang w:val="ru-RU"/>
@@ -1593,14 +1763,27 @@
       <w:r>
         <w:t xml:space="preserve">Рис. </w:t>
       </w:r>
-      <w:fldSimple w:instr=" SEQ Рис. \* ARABIC ">
-        <w:r>
-          <w:rPr>
-            <w:noProof/>
-          </w:rPr>
-          <w:t>5</w:t>
-        </w:r>
-      </w:fldSimple>
+      <w:r>
+        <w:fldChar w:fldCharType="begin"/>
+      </w:r>
+      <w:r>
+        <w:instrText xml:space="preserve"> SEQ Рис. \* ARABIC </w:instrText>
+      </w:r>
+      <w:r>
+        <w:fldChar w:fldCharType="separate"/>
+      </w:r>
+      <w:r>
+        <w:rPr>
+          <w:noProof/>
+        </w:rPr>
+        <w:t>5</w:t>
+      </w:r>
+      <w:r>
+        <w:rPr>
+          <w:noProof/>
+        </w:rPr>
+        <w:fldChar w:fldCharType="end"/>
+      </w:r>
       <w:r>
         <w:rPr>
           <w:lang w:val="ru-RU"/>
@@ -1653,6 +1836,66 @@
         </w:numPr>
         <w:rPr>
           <w:color w:val="000000" w:themeColor="text1"/>
+          <w:szCs w:val="28"/>
+          <w:lang w:val="ru-RU"/>
+        </w:rPr>
+      </w:pPr>
+      <w:r>
+        <w:rPr>
+          <w:color w:val="000000" w:themeColor="text1"/>
+          <w:szCs w:val="28"/>
+          <w:lang w:val="ru-RU"/>
+        </w:rPr>
+        <w:t xml:space="preserve">Задание: </w:t>
+      </w:r>
+      <w:r>
+        <w:rPr>
+          <w:szCs w:val="28"/>
+        </w:rPr>
+        <w:t>На практике опробуйте команды в той последовательности, в какой они приведены выше; для экспериментов возьмите какую-нибудь готовую БД. Обратите внимание на  4 окна подсказок вверху экрана в командах  .append, .edit, .browse,</w:t>
+      </w:r>
+      <w:r>
+        <w:rPr>
+          <w:szCs w:val="28"/>
+          <w:lang w:val="ru-RU"/>
+        </w:rPr>
+        <w:t xml:space="preserve"> </w:t>
+      </w:r>
+      <w:r>
+        <w:rPr>
+          <w:szCs w:val="28"/>
+        </w:rPr>
+        <w:t>.modify structure: сумейте нажать правильные клавиши для того, чтобы выйти из этих команд с сохранением или с отменой сохранения.</w:t>
+      </w:r>
+      <w:r>
+        <w:rPr>
+          <w:szCs w:val="28"/>
+          <w:lang w:val="ru-RU"/>
+        </w:rPr>
+        <w:t xml:space="preserve"> </w:t>
+      </w:r>
+      <w:r>
+        <w:rPr>
+          <w:szCs w:val="28"/>
+        </w:rPr>
+        <w:t>Также заметьте, что на этих ЭВМ данная версия СУБД REBUS не «говорит по-русски».</w:t>
+      </w:r>
+    </w:p>
+    <w:p>
+      <w:pPr>
+        <w:pStyle w:val="a7"/>
+        <w:ind w:left="785" w:firstLine="0"/>
+        <w:rPr>
+          <w:color w:val="000000" w:themeColor="text1"/>
+        </w:rPr>
+      </w:pPr>
+    </w:p>
+    <w:p>
+      <w:pPr>
+        <w:pStyle w:val="a7"/>
+        <w:ind w:left="785" w:firstLine="0"/>
+        <w:rPr>
+          <w:color w:val="000000" w:themeColor="text1"/>
           <w:lang w:val="ru-RU"/>
         </w:rPr>
       </w:pPr>
@@ -1802,10 +2045,11 @@
           <w:color w:val="000000" w:themeColor="text1"/>
           <w:lang w:val="ru-RU"/>
         </w:rPr>
+        <w:lastRenderedPageBreak/>
         <w:drawing>
           <wp:inline distT="0" distB="0" distL="0" distR="0">
-            <wp:extent cx="5114505" cy="3202535"/>
-            <wp:effectExtent l="0" t="0" r="3810" b="0"/>
+            <wp:extent cx="4981575" cy="3119297"/>
+            <wp:effectExtent l="0" t="0" r="0" b="5080"/>
             <wp:docPr id="1734540035" name="Рисунок 1"/>
             <wp:cNvGraphicFramePr>
               <a:graphicFrameLocks xmlns:a="http://schemas.openxmlformats.org/drawingml/2006/main" noChangeAspect="1"/>
@@ -1832,7 +2076,7 @@
                   <pic:spPr>
                     <a:xfrm>
                       <a:off x="0" y="0"/>
-                      <a:ext cx="5147566" cy="3223236"/>
+                      <a:ext cx="5025291" cy="3146671"/>
                     </a:xfrm>
                     <a:prstGeom prst="rect">
                       <a:avLst/>
@@ -1918,7 +2162,6 @@
           <w:color w:val="000000" w:themeColor="text1"/>
           <w:lang w:val="ru-RU"/>
         </w:rPr>
-        <w:lastRenderedPageBreak/>
         <w:t>При помощи команды .</w:t>
       </w:r>
       <w:r>
@@ -1968,8 +2211,8 @@
         </w:rPr>
         <w:drawing>
           <wp:inline distT="0" distB="0" distL="0" distR="0">
-            <wp:extent cx="1851025" cy="1115361"/>
-            <wp:effectExtent l="0" t="0" r="3175" b="2540"/>
+            <wp:extent cx="1698774" cy="1023620"/>
+            <wp:effectExtent l="0" t="0" r="3175" b="5080"/>
             <wp:docPr id="343279232" name="Рисунок 2"/>
             <wp:cNvGraphicFramePr>
               <a:graphicFrameLocks xmlns:a="http://schemas.openxmlformats.org/drawingml/2006/main" noChangeAspect="1"/>
@@ -1996,7 +2239,7 @@
                   <pic:spPr>
                     <a:xfrm>
                       <a:off x="0" y="0"/>
-                      <a:ext cx="1894393" cy="1141493"/>
+                      <a:ext cx="1742932" cy="1050228"/>
                     </a:xfrm>
                     <a:prstGeom prst="rect">
                       <a:avLst/>
@@ -2204,6 +2447,7 @@
           <w:color w:val="000000" w:themeColor="text1"/>
           <w:lang w:val="ru-RU"/>
         </w:rPr>
+        <w:lastRenderedPageBreak/>
         <w:t xml:space="preserve">Выполнение команды </w:t>
       </w:r>
       <w:r>
@@ -2373,7 +2617,6 @@
           <w:color w:val="000000" w:themeColor="text1"/>
           <w:lang w:val="ru-RU"/>
         </w:rPr>
-        <w:lastRenderedPageBreak/>
         <w:t xml:space="preserve">Команда </w:t>
       </w:r>
       <w:r>
@@ -2789,6 +3032,7 @@
           <w:color w:val="000000" w:themeColor="text1"/>
           <w:lang w:val="ru-RU"/>
         </w:rPr>
+        <w:lastRenderedPageBreak/>
         <w:t xml:space="preserve">Команда </w:t>
       </w:r>
       <w:r>
@@ -3076,7 +3320,6 @@
           <w:color w:val="000000" w:themeColor="text1"/>
           <w:lang w:val="ru-RU"/>
         </w:rPr>
-        <w:lastRenderedPageBreak/>
         <w:drawing>
           <wp:inline distT="0" distB="0" distL="0" distR="0">
             <wp:extent cx="2912870" cy="749826"/>
@@ -3483,6 +3726,7 @@
           <w:color w:val="000000" w:themeColor="text1"/>
           <w:lang w:val="ru-RU"/>
         </w:rPr>
+        <w:lastRenderedPageBreak/>
         <w:drawing>
           <wp:inline distT="0" distB="0" distL="0" distR="0">
             <wp:extent cx="4234885" cy="2271670"/>
@@ -3623,6 +3867,16 @@
     <w:p>
       <w:pPr>
         <w:pStyle w:val="a7"/>
+        <w:ind w:left="785" w:firstLine="0"/>
+        <w:rPr>
+          <w:color w:val="000000" w:themeColor="text1"/>
+          <w:lang w:val="ru-RU"/>
+        </w:rPr>
+      </w:pPr>
+    </w:p>
+    <w:p>
+      <w:pPr>
+        <w:pStyle w:val="a7"/>
         <w:keepNext/>
         <w:ind w:left="785" w:firstLine="0"/>
         <w:jc w:val="center"/>
@@ -3633,7 +3887,6 @@
           <w:color w:val="000000" w:themeColor="text1"/>
           <w:lang w:val="ru-RU"/>
         </w:rPr>
-        <w:lastRenderedPageBreak/>
         <w:drawing>
           <wp:inline distT="0" distB="0" distL="0" distR="0">
             <wp:extent cx="4808151" cy="3007876"/>
@@ -3726,6 +3979,38 @@
       </w:pPr>
       <w:r>
         <w:rPr>
+          <w:szCs w:val="28"/>
+          <w:lang w:val="ru-RU"/>
+        </w:rPr>
+        <w:t xml:space="preserve">Задание: </w:t>
+      </w:r>
+      <w:r>
+        <w:rPr>
+          <w:szCs w:val="28"/>
+        </w:rPr>
+        <w:t>Создайте свою базу данных о своих сокурсниках с полями ФАМИЛИЯ, ДАТА РОЖДЕНИЯ, РОСТ. Внесите в БД пару записей. Просмотрите.</w:t>
+      </w:r>
+    </w:p>
+    <w:p>
+      <w:pPr>
+        <w:pStyle w:val="a7"/>
+        <w:ind w:left="785" w:firstLine="0"/>
+        <w:rPr>
+          <w:lang w:val="ru-RU"/>
+        </w:rPr>
+      </w:pPr>
+    </w:p>
+    <w:p>
+      <w:pPr>
+        <w:pStyle w:val="a7"/>
+        <w:ind w:left="785" w:firstLine="0"/>
+        <w:rPr>
+          <w:szCs w:val="28"/>
+          <w:lang w:val="ru-RU"/>
+        </w:rPr>
+      </w:pPr>
+      <w:r>
+        <w:rPr>
           <w:lang w:val="ru-RU"/>
         </w:rPr>
         <w:t xml:space="preserve">При помощи команды </w:t>
@@ -3976,6 +4261,7 @@
           <w:szCs w:val="28"/>
           <w:lang w:val="ru-RU"/>
         </w:rPr>
+        <w:lastRenderedPageBreak/>
         <w:drawing>
           <wp:inline distT="0" distB="0" distL="0" distR="0">
             <wp:extent cx="4884420" cy="3058464"/>
@@ -4030,14 +4316,27 @@
       <w:r>
         <w:t xml:space="preserve">Рис. </w:t>
       </w:r>
-      <w:fldSimple w:instr=" SEQ Рис. \* ARABIC ">
-        <w:r>
-          <w:rPr>
-            <w:noProof/>
-          </w:rPr>
-          <w:t>20</w:t>
-        </w:r>
-      </w:fldSimple>
+      <w:r>
+        <w:fldChar w:fldCharType="begin"/>
+      </w:r>
+      <w:r>
+        <w:instrText xml:space="preserve"> SEQ Рис. \* ARABIC </w:instrText>
+      </w:r>
+      <w:r>
+        <w:fldChar w:fldCharType="separate"/>
+      </w:r>
+      <w:r>
+        <w:rPr>
+          <w:noProof/>
+        </w:rPr>
+        <w:t>20</w:t>
+      </w:r>
+      <w:r>
+        <w:rPr>
+          <w:noProof/>
+        </w:rPr>
+        <w:fldChar w:fldCharType="end"/>
+      </w:r>
       <w:r>
         <w:rPr>
           <w:lang w:val="ru-RU"/>
@@ -4134,7 +4433,6 @@
           <w:szCs w:val="28"/>
           <w:lang w:val="ru-RU"/>
         </w:rPr>
-        <w:lastRenderedPageBreak/>
         <w:drawing>
           <wp:inline distT="0" distB="0" distL="0" distR="0">
             <wp:extent cx="5026620" cy="3132902"/>
@@ -4189,14 +4487,27 @@
       <w:r>
         <w:t xml:space="preserve">Рис. </w:t>
       </w:r>
-      <w:fldSimple w:instr=" SEQ Рис. \* ARABIC ">
-        <w:r>
-          <w:rPr>
-            <w:noProof/>
-          </w:rPr>
-          <w:t>21</w:t>
-        </w:r>
-      </w:fldSimple>
+      <w:r>
+        <w:fldChar w:fldCharType="begin"/>
+      </w:r>
+      <w:r>
+        <w:instrText xml:space="preserve"> SEQ Рис. \* ARABIC </w:instrText>
+      </w:r>
+      <w:r>
+        <w:fldChar w:fldCharType="separate"/>
+      </w:r>
+      <w:r>
+        <w:rPr>
+          <w:noProof/>
+        </w:rPr>
+        <w:t>21</w:t>
+      </w:r>
+      <w:r>
+        <w:rPr>
+          <w:noProof/>
+        </w:rPr>
+        <w:fldChar w:fldCharType="end"/>
+      </w:r>
       <w:r>
         <w:rPr>
           <w:lang w:val="ru-RU"/>
@@ -4271,31 +4582,33 @@
       <w:r>
         <w:t xml:space="preserve">Рис. </w:t>
       </w:r>
-      <w:fldSimple w:instr=" SEQ Рис. \* ARABIC ">
-        <w:r>
-          <w:rPr>
-            <w:noProof/>
-          </w:rPr>
-          <w:t>22</w:t>
-        </w:r>
-      </w:fldSimple>
+      <w:r>
+        <w:fldChar w:fldCharType="begin"/>
+      </w:r>
+      <w:r>
+        <w:instrText xml:space="preserve"> SEQ Рис. \* ARABIC </w:instrText>
+      </w:r>
+      <w:r>
+        <w:fldChar w:fldCharType="separate"/>
+      </w:r>
+      <w:r>
+        <w:rPr>
+          <w:noProof/>
+        </w:rPr>
+        <w:t>22</w:t>
+      </w:r>
+      <w:r>
+        <w:rPr>
+          <w:noProof/>
+        </w:rPr>
+        <w:fldChar w:fldCharType="end"/>
+      </w:r>
       <w:r>
         <w:rPr>
           <w:lang w:val="ru-RU"/>
         </w:rPr>
         <w:t>. Созданные записи</w:t>
       </w:r>
-    </w:p>
-    <w:p>
-      <w:pPr>
-        <w:spacing w:after="160" w:line="278" w:lineRule="auto"/>
-        <w:ind w:firstLine="0"/>
-        <w:jc w:val="left"/>
-        <w:rPr>
-          <w:szCs w:val="28"/>
-          <w:lang w:val="ru-RU"/>
-        </w:rPr>
-      </w:pPr>
       <w:r>
         <w:rPr>
           <w:szCs w:val="28"/>
@@ -4330,14 +4643,81 @@
           <w:numId w:val="2"/>
         </w:numPr>
         <w:rPr>
-          <w:lang w:val="ru-RU"/>
-        </w:rPr>
-      </w:pPr>
-      <w:r>
-        <w:rPr>
-          <w:lang w:val="ru-RU"/>
-        </w:rPr>
-        <w:t xml:space="preserve">Создан новый файл базы данных </w:t>
+          <w:szCs w:val="28"/>
+        </w:rPr>
+      </w:pPr>
+      <w:r>
+        <w:rPr>
+          <w:szCs w:val="28"/>
+          <w:lang w:val="ru-RU"/>
+        </w:rPr>
+        <w:t xml:space="preserve">Задание: </w:t>
+      </w:r>
+      <w:r>
+        <w:rPr>
+          <w:szCs w:val="28"/>
+        </w:rPr>
+        <w:t>Создайте таблицу базы данных с полями, содержание которых - фамилия, год рождения,  оценки по математике, информатике, иностранному языку.</w:t>
+      </w:r>
+    </w:p>
+    <w:p>
+      <w:pPr>
+        <w:pStyle w:val="a7"/>
+        <w:ind w:left="785" w:firstLine="0"/>
+        <w:rPr>
+          <w:lang w:val="ru-RU"/>
+        </w:rPr>
+      </w:pPr>
+    </w:p>
+    <w:p>
+      <w:pPr>
+        <w:pStyle w:val="a7"/>
+        <w:ind w:left="785" w:firstLine="0"/>
+        <w:rPr>
+          <w:szCs w:val="28"/>
+        </w:rPr>
+      </w:pPr>
+      <w:r>
+        <w:rPr>
+          <w:lang w:val="ru-RU"/>
+        </w:rPr>
+        <w:t xml:space="preserve">Командой </w:t>
+      </w:r>
+      <w:r>
+        <w:rPr>
+          <w:rFonts w:ascii="Menlo" w:hAnsi="Menlo" w:cs="Menlo"/>
+          <w:sz w:val="22"/>
+          <w:szCs w:val="22"/>
+          <w:lang w:val="ru-RU"/>
+        </w:rPr>
+        <w:t>.</w:t>
+      </w:r>
+      <w:r>
+        <w:rPr>
+          <w:rFonts w:ascii="Menlo" w:hAnsi="Menlo" w:cs="Menlo"/>
+          <w:sz w:val="22"/>
+          <w:szCs w:val="22"/>
+          <w:lang w:val="en-US"/>
+        </w:rPr>
+        <w:t>create</w:t>
+      </w:r>
+      <w:r>
+        <w:rPr>
+          <w:lang w:val="ru-RU"/>
+        </w:rPr>
+        <w:t xml:space="preserve"> </w:t>
+      </w:r>
+      <w:r>
+        <w:rPr>
+          <w:lang w:val="ru-RU"/>
+        </w:rPr>
+        <w:t>с</w:t>
+      </w:r>
+      <w:r>
+        <w:rPr>
+          <w:lang w:val="ru-RU"/>
+        </w:rPr>
+        <w:t xml:space="preserve">оздан новый файл базы данных </w:t>
       </w:r>
       <w:r>
         <w:rPr>
@@ -4367,13 +4747,7 @@
         <w:rPr>
           <w:lang w:val="ru-RU"/>
         </w:rPr>
-        <w:t>1</w:t>
-      </w:r>
-      <w:r>
-        <w:rPr>
-          <w:lang w:val="ru-RU"/>
-        </w:rPr>
-        <w:t>.</w:t>
+        <w:t>1.</w:t>
       </w:r>
       <w:r>
         <w:rPr>
@@ -4474,14 +4848,27 @@
       <w:r>
         <w:t xml:space="preserve">Рис. </w:t>
       </w:r>
-      <w:fldSimple w:instr=" SEQ Рис. \* ARABIC ">
-        <w:r>
-          <w:rPr>
-            <w:noProof/>
-          </w:rPr>
-          <w:t>23</w:t>
-        </w:r>
-      </w:fldSimple>
+      <w:r>
+        <w:fldChar w:fldCharType="begin"/>
+      </w:r>
+      <w:r>
+        <w:instrText xml:space="preserve"> SEQ Рис. \* ARABIC </w:instrText>
+      </w:r>
+      <w:r>
+        <w:fldChar w:fldCharType="separate"/>
+      </w:r>
+      <w:r>
+        <w:rPr>
+          <w:noProof/>
+        </w:rPr>
+        <w:t>23</w:t>
+      </w:r>
+      <w:r>
+        <w:rPr>
+          <w:noProof/>
+        </w:rPr>
+        <w:fldChar w:fldCharType="end"/>
+      </w:r>
       <w:r>
         <w:rPr>
           <w:lang w:val="ru-RU"/>
@@ -4496,6 +4883,52 @@
           <w:ilvl w:val="0"/>
           <w:numId w:val="2"/>
         </w:numPr>
+        <w:rPr>
+          <w:szCs w:val="28"/>
+          <w:lang w:val="ru-RU"/>
+        </w:rPr>
+      </w:pPr>
+      <w:r>
+        <w:rPr>
+          <w:szCs w:val="28"/>
+          <w:lang w:val="ru-RU"/>
+        </w:rPr>
+        <w:t>Задание:</w:t>
+      </w:r>
+      <w:r>
+        <w:rPr>
+          <w:szCs w:val="28"/>
+          <w:lang w:val="ru-RU"/>
+        </w:rPr>
+        <w:t xml:space="preserve"> </w:t>
+      </w:r>
+      <w:r>
+        <w:rPr>
+          <w:szCs w:val="28"/>
+        </w:rPr>
+        <w:t>Внесите в таблицу 5 записей</w:t>
+      </w:r>
+      <w:r>
+        <w:rPr>
+          <w:szCs w:val="28"/>
+          <w:lang w:val="ru-RU"/>
+        </w:rPr>
+        <w:t>.</w:t>
+      </w:r>
+    </w:p>
+    <w:p>
+      <w:pPr>
+        <w:pStyle w:val="a7"/>
+        <w:ind w:left="785" w:firstLine="0"/>
+        <w:rPr>
+          <w:lang w:val="ru-RU"/>
+        </w:rPr>
+      </w:pPr>
+    </w:p>
+    <w:p>
+      <w:pPr>
+        <w:pStyle w:val="a7"/>
+        <w:ind w:left="785" w:firstLine="0"/>
         <w:rPr>
           <w:lang w:val="ru-RU"/>
         </w:rPr>
@@ -4593,14 +5026,27 @@
       <w:r>
         <w:t xml:space="preserve">Рис. </w:t>
       </w:r>
-      <w:fldSimple w:instr=" SEQ Рис. \* ARABIC ">
-        <w:r>
-          <w:rPr>
-            <w:noProof/>
-          </w:rPr>
-          <w:t>24</w:t>
-        </w:r>
-      </w:fldSimple>
+      <w:r>
+        <w:fldChar w:fldCharType="begin"/>
+      </w:r>
+      <w:r>
+        <w:instrText xml:space="preserve"> SEQ Рис. \* ARABIC </w:instrText>
+      </w:r>
+      <w:r>
+        <w:fldChar w:fldCharType="separate"/>
+      </w:r>
+      <w:r>
+        <w:rPr>
+          <w:noProof/>
+        </w:rPr>
+        <w:t>24</w:t>
+      </w:r>
+      <w:r>
+        <w:rPr>
+          <w:noProof/>
+        </w:rPr>
+        <w:fldChar w:fldCharType="end"/>
+      </w:r>
       <w:r>
         <w:rPr>
           <w:lang w:val="ru-RU"/>
@@ -4616,6 +5062,45 @@
           <w:numId w:val="2"/>
         </w:numPr>
         <w:rPr>
+          <w:szCs w:val="28"/>
+          <w:lang w:val="ru-RU"/>
+        </w:rPr>
+      </w:pPr>
+      <w:r>
+        <w:rPr>
+          <w:szCs w:val="28"/>
+          <w:lang w:val="ru-RU"/>
+        </w:rPr>
+        <w:t>Задание:</w:t>
+      </w:r>
+      <w:r>
+        <w:rPr>
+          <w:szCs w:val="28"/>
+          <w:lang w:val="ru-RU"/>
+        </w:rPr>
+        <w:t xml:space="preserve"> </w:t>
+      </w:r>
+      <w:r>
+        <w:rPr>
+          <w:szCs w:val="28"/>
+        </w:rPr>
+        <w:t>Внесите изменения в структуру таблицы - создайте поле, которое будет содержать пол студента; предусмотрите возможность не ввода пола, а выбора из списка – «мужской», «женский».</w:t>
+      </w:r>
+    </w:p>
+    <w:p>
+      <w:pPr>
+        <w:pStyle w:val="a7"/>
+        <w:ind w:left="785" w:firstLine="0"/>
+        <w:rPr>
+          <w:lang w:val="ru-RU"/>
+        </w:rPr>
+      </w:pPr>
+    </w:p>
+    <w:p>
+      <w:pPr>
+        <w:pStyle w:val="a7"/>
+        <w:ind w:left="785" w:firstLine="0"/>
+        <w:rPr>
           <w:lang w:val="ru-RU"/>
         </w:rPr>
       </w:pPr>
@@ -4730,6 +5215,7 @@
           <w:noProof/>
           <w:lang w:val="ru-RU"/>
         </w:rPr>
+        <w:lastRenderedPageBreak/>
         <w:drawing>
           <wp:inline distT="0" distB="0" distL="0" distR="0">
             <wp:extent cx="3205113" cy="1316565"/>
@@ -4784,14 +5270,27 @@
       <w:r>
         <w:t xml:space="preserve">Рис. </w:t>
       </w:r>
-      <w:fldSimple w:instr=" SEQ Рис. \* ARABIC ">
-        <w:r>
-          <w:rPr>
-            <w:noProof/>
-          </w:rPr>
-          <w:t>25</w:t>
-        </w:r>
-      </w:fldSimple>
+      <w:r>
+        <w:fldChar w:fldCharType="begin"/>
+      </w:r>
+      <w:r>
+        <w:instrText xml:space="preserve"> SEQ Рис. \* ARABIC </w:instrText>
+      </w:r>
+      <w:r>
+        <w:fldChar w:fldCharType="separate"/>
+      </w:r>
+      <w:r>
+        <w:rPr>
+          <w:noProof/>
+        </w:rPr>
+        <w:t>25</w:t>
+      </w:r>
+      <w:r>
+        <w:rPr>
+          <w:noProof/>
+        </w:rPr>
+        <w:fldChar w:fldCharType="end"/>
+      </w:r>
       <w:r>
         <w:rPr>
           <w:lang w:val="ru-RU"/>
@@ -4815,6 +5314,38 @@
           <w:ilvl w:val="0"/>
           <w:numId w:val="2"/>
         </w:numPr>
+        <w:rPr>
+          <w:szCs w:val="28"/>
+          <w:lang w:val="ru-RU"/>
+        </w:rPr>
+      </w:pPr>
+      <w:r>
+        <w:rPr>
+          <w:szCs w:val="28"/>
+          <w:lang w:val="ru-RU"/>
+        </w:rPr>
+        <w:t xml:space="preserve">Задание: </w:t>
+      </w:r>
+      <w:r>
+        <w:rPr>
+          <w:szCs w:val="28"/>
+        </w:rPr>
+        <w:t>Дополните данными таблицу, указав пол каждого студента.</w:t>
+      </w:r>
+    </w:p>
+    <w:p>
+      <w:pPr>
+        <w:pStyle w:val="a7"/>
+        <w:ind w:left="785" w:firstLine="0"/>
+        <w:rPr>
+          <w:lang w:val="ru-RU"/>
+        </w:rPr>
+      </w:pPr>
+    </w:p>
+    <w:p>
+      <w:pPr>
+        <w:pStyle w:val="a7"/>
+        <w:ind w:left="785" w:firstLine="0"/>
         <w:rPr>
           <w:lang w:val="ru-RU"/>
         </w:rPr>
@@ -4915,14 +5446,27 @@
       <w:r>
         <w:t xml:space="preserve">Рис. </w:t>
       </w:r>
-      <w:fldSimple w:instr=" SEQ Рис. \* ARABIC ">
-        <w:r>
-          <w:rPr>
-            <w:noProof/>
-          </w:rPr>
-          <w:t>26</w:t>
-        </w:r>
-      </w:fldSimple>
+      <w:r>
+        <w:fldChar w:fldCharType="begin"/>
+      </w:r>
+      <w:r>
+        <w:instrText xml:space="preserve"> SEQ Рис. \* ARABIC </w:instrText>
+      </w:r>
+      <w:r>
+        <w:fldChar w:fldCharType="separate"/>
+      </w:r>
+      <w:r>
+        <w:rPr>
+          <w:noProof/>
+        </w:rPr>
+        <w:t>26</w:t>
+      </w:r>
+      <w:r>
+        <w:rPr>
+          <w:noProof/>
+        </w:rPr>
+        <w:fldChar w:fldCharType="end"/>
+      </w:r>
       <w:r>
         <w:rPr>
           <w:lang w:val="ru-RU"/>
@@ -4937,6 +5481,38 @@
           <w:ilvl w:val="0"/>
           <w:numId w:val="2"/>
         </w:numPr>
+        <w:rPr>
+          <w:szCs w:val="28"/>
+          <w:lang w:val="ru-RU"/>
+        </w:rPr>
+      </w:pPr>
+      <w:r>
+        <w:rPr>
+          <w:szCs w:val="28"/>
+          <w:lang w:val="ru-RU"/>
+        </w:rPr>
+        <w:t xml:space="preserve">Задание: </w:t>
+      </w:r>
+      <w:r>
+        <w:rPr>
+          <w:szCs w:val="28"/>
+        </w:rPr>
+        <w:t>Создайте таблицу с теми же полями – она будет содержать сведения о студентах параллельной группы. Решите это задание способом, отличным от того, каким было выполнено задание 1.</w:t>
+      </w:r>
+    </w:p>
+    <w:p>
+      <w:pPr>
+        <w:pStyle w:val="a7"/>
+        <w:ind w:left="785" w:firstLine="0"/>
+        <w:rPr>
+          <w:lang w:val="ru-RU"/>
+        </w:rPr>
+      </w:pPr>
+    </w:p>
+    <w:p>
+      <w:pPr>
+        <w:pStyle w:val="a7"/>
+        <w:ind w:left="785" w:firstLine="0"/>
         <w:rPr>
           <w:lang w:val="ru-RU"/>
         </w:rPr>
@@ -5209,14 +5785,27 @@
       <w:r>
         <w:t xml:space="preserve">Рис. </w:t>
       </w:r>
-      <w:fldSimple w:instr=" SEQ Рис. \* ARABIC ">
-        <w:r>
-          <w:rPr>
-            <w:noProof/>
-          </w:rPr>
-          <w:t>27</w:t>
-        </w:r>
-      </w:fldSimple>
+      <w:r>
+        <w:fldChar w:fldCharType="begin"/>
+      </w:r>
+      <w:r>
+        <w:instrText xml:space="preserve"> SEQ Рис. \* ARABIC </w:instrText>
+      </w:r>
+      <w:r>
+        <w:fldChar w:fldCharType="separate"/>
+      </w:r>
+      <w:r>
+        <w:rPr>
+          <w:noProof/>
+        </w:rPr>
+        <w:t>27</w:t>
+      </w:r>
+      <w:r>
+        <w:rPr>
+          <w:noProof/>
+        </w:rPr>
+        <w:fldChar w:fldCharType="end"/>
+      </w:r>
       <w:r>
         <w:rPr>
           <w:lang w:val="ru-RU"/>
@@ -5232,6 +5821,38 @@
           <w:numId w:val="2"/>
         </w:numPr>
         <w:rPr>
+          <w:szCs w:val="28"/>
+          <w:lang w:val="ru-RU"/>
+        </w:rPr>
+      </w:pPr>
+      <w:r>
+        <w:rPr>
+          <w:szCs w:val="28"/>
+          <w:lang w:val="ru-RU"/>
+        </w:rPr>
+        <w:t xml:space="preserve">Задание: </w:t>
+      </w:r>
+      <w:r>
+        <w:rPr>
+          <w:szCs w:val="28"/>
+        </w:rPr>
+        <w:t>Внесите во вторую таблицу 5 записей.</w:t>
+      </w:r>
+    </w:p>
+    <w:p>
+      <w:pPr>
+        <w:pStyle w:val="a7"/>
+        <w:ind w:left="785" w:firstLine="0"/>
+        <w:rPr>
+          <w:lang w:val="ru-RU"/>
+        </w:rPr>
+      </w:pPr>
+    </w:p>
+    <w:p>
+      <w:pPr>
+        <w:pStyle w:val="a7"/>
+        <w:ind w:left="785" w:firstLine="0"/>
+        <w:rPr>
           <w:lang w:val="ru-RU"/>
         </w:rPr>
       </w:pPr>
@@ -5275,6 +5896,7 @@
           <w:noProof/>
           <w:lang w:val="ru-RU"/>
         </w:rPr>
+        <w:lastRenderedPageBreak/>
         <w:drawing>
           <wp:inline distT="0" distB="0" distL="0" distR="0">
             <wp:extent cx="4291330" cy="1821967"/>
@@ -5328,14 +5950,27 @@
       <w:r>
         <w:t xml:space="preserve">Рис. </w:t>
       </w:r>
-      <w:fldSimple w:instr=" SEQ Рис. \* ARABIC ">
-        <w:r>
-          <w:rPr>
-            <w:noProof/>
-          </w:rPr>
-          <w:t>28</w:t>
-        </w:r>
-      </w:fldSimple>
+      <w:r>
+        <w:fldChar w:fldCharType="begin"/>
+      </w:r>
+      <w:r>
+        <w:instrText xml:space="preserve"> SEQ Рис. \* ARABIC </w:instrText>
+      </w:r>
+      <w:r>
+        <w:fldChar w:fldCharType="separate"/>
+      </w:r>
+      <w:r>
+        <w:rPr>
+          <w:noProof/>
+        </w:rPr>
+        <w:t>28</w:t>
+      </w:r>
+      <w:r>
+        <w:rPr>
+          <w:noProof/>
+        </w:rPr>
+        <w:fldChar w:fldCharType="end"/>
+      </w:r>
       <w:r>
         <w:rPr>
           <w:lang w:val="ru-RU"/>
@@ -5351,6 +5986,38 @@
           <w:numId w:val="2"/>
         </w:numPr>
         <w:rPr>
+          <w:szCs w:val="28"/>
+          <w:lang w:val="ru-RU"/>
+        </w:rPr>
+      </w:pPr>
+      <w:r>
+        <w:rPr>
+          <w:szCs w:val="28"/>
+          <w:lang w:val="ru-RU"/>
+        </w:rPr>
+        <w:t xml:space="preserve">Задание: </w:t>
+      </w:r>
+      <w:r>
+        <w:rPr>
+          <w:szCs w:val="28"/>
+        </w:rPr>
+        <w:t>Осуществите сортировку записей первой таблицы в алфавитном порядке поля фамилий.</w:t>
+      </w:r>
+    </w:p>
+    <w:p>
+      <w:pPr>
+        <w:pStyle w:val="a7"/>
+        <w:ind w:left="785" w:firstLine="0"/>
+        <w:rPr>
+          <w:lang w:val="ru-RU"/>
+        </w:rPr>
+      </w:pPr>
+    </w:p>
+    <w:p>
+      <w:pPr>
+        <w:pStyle w:val="a7"/>
+        <w:ind w:left="785" w:firstLine="0"/>
+        <w:rPr>
           <w:lang w:val="ru-RU"/>
         </w:rPr>
       </w:pPr>
@@ -5626,7 +6293,6 @@
           <w:noProof/>
           <w:lang w:val="en-US"/>
         </w:rPr>
-        <w:lastRenderedPageBreak/>
         <w:drawing>
           <wp:inline distT="0" distB="0" distL="0" distR="0">
             <wp:extent cx="4406557" cy="1539873"/>
@@ -5680,14 +6346,27 @@
       <w:r>
         <w:t xml:space="preserve">Рис. </w:t>
       </w:r>
-      <w:fldSimple w:instr=" SEQ Рис. \* ARABIC ">
-        <w:r>
-          <w:rPr>
-            <w:noProof/>
-          </w:rPr>
-          <w:t>29</w:t>
-        </w:r>
-      </w:fldSimple>
+      <w:r>
+        <w:fldChar w:fldCharType="begin"/>
+      </w:r>
+      <w:r>
+        <w:instrText xml:space="preserve"> SEQ Рис. \* ARABIC </w:instrText>
+      </w:r>
+      <w:r>
+        <w:fldChar w:fldCharType="separate"/>
+      </w:r>
+      <w:r>
+        <w:rPr>
+          <w:noProof/>
+        </w:rPr>
+        <w:t>29</w:t>
+      </w:r>
+      <w:r>
+        <w:rPr>
+          <w:noProof/>
+        </w:rPr>
+        <w:fldChar w:fldCharType="end"/>
+      </w:r>
       <w:r>
         <w:rPr>
           <w:lang w:val="ru-RU"/>
@@ -5703,6 +6382,45 @@
           <w:numId w:val="2"/>
         </w:numPr>
         <w:rPr>
+          <w:szCs w:val="28"/>
+          <w:lang w:val="ru-RU"/>
+        </w:rPr>
+      </w:pPr>
+      <w:r>
+        <w:rPr>
+          <w:szCs w:val="28"/>
+          <w:lang w:val="ru-RU"/>
+        </w:rPr>
+        <w:t xml:space="preserve">Задание: </w:t>
+      </w:r>
+      <w:r>
+        <w:rPr>
+          <w:szCs w:val="28"/>
+        </w:rPr>
+        <w:t>Осуществите ИНДЕКСИРОВАНИЕ записей первой таблицы в алфавитном порядке поля фамилий</w:t>
+      </w:r>
+      <w:r>
+        <w:rPr>
+          <w:szCs w:val="28"/>
+          <w:lang w:val="ru-RU"/>
+        </w:rPr>
+        <w:t>.</w:t>
+      </w:r>
+    </w:p>
+    <w:p>
+      <w:pPr>
+        <w:pStyle w:val="a7"/>
+        <w:ind w:left="785" w:firstLine="0"/>
+        <w:rPr>
+          <w:lang w:val="ru-RU"/>
+        </w:rPr>
+      </w:pPr>
+    </w:p>
+    <w:p>
+      <w:pPr>
+        <w:pStyle w:val="a7"/>
+        <w:ind w:left="785" w:firstLine="0"/>
+        <w:rPr>
           <w:lang w:val="ru-RU"/>
         </w:rPr>
       </w:pPr>
@@ -6045,6 +6763,14 @@
         </w:rPr>
         <w:t>Часть 1.</w:t>
       </w:r>
+    </w:p>
+    <w:p>
+      <w:pPr>
+        <w:ind w:firstLine="0"/>
+        <w:rPr>
+          <w:lang w:val="ru-RU"/>
+        </w:rPr>
+      </w:pPr>
     </w:p>
     <w:p>
       <w:pPr>
@@ -6053,6 +6779,79 @@
           <w:ilvl w:val="0"/>
           <w:numId w:val="3"/>
         </w:numPr>
+        <w:rPr>
+          <w:szCs w:val="28"/>
+          <w:lang w:val="ru-RU"/>
+        </w:rPr>
+      </w:pPr>
+      <w:r>
+        <w:rPr>
+          <w:szCs w:val="28"/>
+          <w:lang w:val="ru-RU"/>
+        </w:rPr>
+        <w:t xml:space="preserve">Задание: </w:t>
+      </w:r>
+      <w:r>
+        <w:rPr>
+          <w:szCs w:val="28"/>
+        </w:rPr>
+        <w:t xml:space="preserve">Создайте БД в СУБД </w:t>
+      </w:r>
+      <w:r>
+        <w:rPr>
+          <w:szCs w:val="28"/>
+          <w:lang w:val="en-US"/>
+        </w:rPr>
+        <w:t>dBase</w:t>
+      </w:r>
+      <w:r>
+        <w:rPr>
+          <w:szCs w:val="28"/>
+        </w:rPr>
+        <w:t xml:space="preserve"> (</w:t>
+      </w:r>
+      <w:r>
+        <w:rPr>
+          <w:szCs w:val="28"/>
+          <w:lang w:val="en-US"/>
+        </w:rPr>
+        <w:t>Rebus</w:t>
+      </w:r>
+      <w:r>
+        <w:rPr>
+          <w:szCs w:val="28"/>
+        </w:rPr>
+        <w:t>): сформируйте структуру БД из полей разного типа. Исследуйте структуру .</w:t>
+      </w:r>
+      <w:proofErr w:type="spellStart"/>
+      <w:r>
+        <w:rPr>
+          <w:szCs w:val="28"/>
+          <w:lang w:val="en-US"/>
+        </w:rPr>
+        <w:t>dbf</w:t>
+      </w:r>
+      <w:proofErr w:type="spellEnd"/>
+      <w:r>
+        <w:rPr>
+          <w:szCs w:val="28"/>
+        </w:rPr>
+        <w:t>-файла.</w:t>
+      </w:r>
+    </w:p>
+    <w:p>
+      <w:pPr>
+        <w:pStyle w:val="a7"/>
+        <w:ind w:left="785" w:firstLine="0"/>
+        <w:rPr>
+          <w:lang w:val="ru-RU"/>
+        </w:rPr>
+      </w:pPr>
+    </w:p>
+    <w:p>
+      <w:pPr>
+        <w:pStyle w:val="a7"/>
+        <w:ind w:left="785" w:firstLine="0"/>
         <w:rPr>
           <w:lang w:val="ru-RU"/>
         </w:rPr>
@@ -6180,14 +6979,27 @@
       <w:r>
         <w:t xml:space="preserve">Рис. </w:t>
       </w:r>
-      <w:fldSimple w:instr=" SEQ Рис. \* ARABIC ">
-        <w:r>
-          <w:rPr>
-            <w:noProof/>
-          </w:rPr>
-          <w:t>30</w:t>
-        </w:r>
-      </w:fldSimple>
+      <w:r>
+        <w:fldChar w:fldCharType="begin"/>
+      </w:r>
+      <w:r>
+        <w:instrText xml:space="preserve"> SEQ Рис. \* ARABIC </w:instrText>
+      </w:r>
+      <w:r>
+        <w:fldChar w:fldCharType="separate"/>
+      </w:r>
+      <w:r>
+        <w:rPr>
+          <w:noProof/>
+        </w:rPr>
+        <w:t>30</w:t>
+      </w:r>
+      <w:r>
+        <w:rPr>
+          <w:noProof/>
+        </w:rPr>
+        <w:fldChar w:fldCharType="end"/>
+      </w:r>
       <w:r>
         <w:rPr>
           <w:lang w:val="ru-RU"/>
@@ -6314,14 +7126,27 @@
       <w:r>
         <w:t xml:space="preserve">Рис. </w:t>
       </w:r>
-      <w:fldSimple w:instr=" SEQ Рис. \* ARABIC ">
-        <w:r>
-          <w:rPr>
-            <w:noProof/>
-          </w:rPr>
-          <w:t>31</w:t>
-        </w:r>
-      </w:fldSimple>
+      <w:r>
+        <w:fldChar w:fldCharType="begin"/>
+      </w:r>
+      <w:r>
+        <w:instrText xml:space="preserve"> SEQ Рис. \* ARABIC </w:instrText>
+      </w:r>
+      <w:r>
+        <w:fldChar w:fldCharType="separate"/>
+      </w:r>
+      <w:r>
+        <w:rPr>
+          <w:noProof/>
+        </w:rPr>
+        <w:t>31</w:t>
+      </w:r>
+      <w:r>
+        <w:rPr>
+          <w:noProof/>
+        </w:rPr>
+        <w:fldChar w:fldCharType="end"/>
+      </w:r>
       <w:r>
         <w:rPr>
           <w:lang w:val="ru-RU"/>
@@ -6659,18 +7484,84 @@
     <w:p>
       <w:pPr>
         <w:pStyle w:val="a7"/>
+        <w:ind w:left="785" w:firstLine="0"/>
+        <w:rPr>
+          <w:lang w:val="ru-RU"/>
+        </w:rPr>
+      </w:pPr>
+    </w:p>
+    <w:p>
+      <w:pPr>
+        <w:pStyle w:val="Normal"/>
         <w:numPr>
           <w:ilvl w:val="0"/>
           <w:numId w:val="3"/>
         </w:numPr>
         <w:rPr>
-          <w:lang w:val="ru-RU"/>
-        </w:rPr>
-      </w:pPr>
-      <w:r>
-        <w:rPr>
-          <w:lang w:val="ru-RU"/>
-        </w:rPr>
+          <w:sz w:val="28"/>
+          <w:szCs w:val="28"/>
+        </w:rPr>
+      </w:pPr>
+      <w:r>
+        <w:rPr>
+          <w:sz w:val="28"/>
+          <w:szCs w:val="28"/>
+        </w:rPr>
+        <w:t xml:space="preserve">Задание: </w:t>
+      </w:r>
+      <w:r>
+        <w:rPr>
+          <w:sz w:val="28"/>
+          <w:szCs w:val="28"/>
+        </w:rPr>
+        <w:t>Внесите в БД запись (несколько). Изучите, как записи размещены во внешней памяти.</w:t>
+      </w:r>
+      <w:r>
+        <w:rPr>
+          <w:sz w:val="28"/>
+          <w:szCs w:val="28"/>
+        </w:rPr>
+        <w:t xml:space="preserve"> </w:t>
+      </w:r>
+      <w:r>
+        <w:rPr>
+          <w:sz w:val="28"/>
+          <w:szCs w:val="28"/>
+        </w:rPr>
+        <w:t>(Выполняя задания 3-5, всякий раз исследуйте содержимое соответствующего файла.)</w:t>
+      </w:r>
+    </w:p>
+    <w:p>
+      <w:pPr>
+        <w:pStyle w:val="a7"/>
+        <w:ind w:left="785" w:firstLine="0"/>
+        <w:rPr>
+          <w:lang w:val="ru-RU"/>
+        </w:rPr>
+      </w:pPr>
+    </w:p>
+    <w:p>
+      <w:pPr>
+        <w:pStyle w:val="a7"/>
+        <w:ind w:left="785" w:firstLine="0"/>
+        <w:rPr>
+          <w:lang w:val="ru-RU"/>
+        </w:rPr>
+      </w:pPr>
+    </w:p>
+    <w:p>
+      <w:pPr>
+        <w:pStyle w:val="a7"/>
+        <w:ind w:left="785" w:firstLine="0"/>
+        <w:rPr>
+          <w:lang w:val="ru-RU"/>
+        </w:rPr>
+      </w:pPr>
+      <w:r>
+        <w:rPr>
+          <w:lang w:val="ru-RU"/>
+        </w:rPr>
+        <w:lastRenderedPageBreak/>
         <w:t xml:space="preserve">В таблицу были внесены несколько записей (рис. </w:t>
       </w:r>
       <w:r>
@@ -6760,14 +7651,27 @@
       <w:r>
         <w:t xml:space="preserve">Рис. </w:t>
       </w:r>
-      <w:fldSimple w:instr=" SEQ Рис. \* ARABIC ">
-        <w:r>
-          <w:rPr>
-            <w:noProof/>
-          </w:rPr>
-          <w:t>32</w:t>
-        </w:r>
-      </w:fldSimple>
+      <w:r>
+        <w:fldChar w:fldCharType="begin"/>
+      </w:r>
+      <w:r>
+        <w:instrText xml:space="preserve"> SEQ Рис. \* ARABIC </w:instrText>
+      </w:r>
+      <w:r>
+        <w:fldChar w:fldCharType="separate"/>
+      </w:r>
+      <w:r>
+        <w:rPr>
+          <w:noProof/>
+        </w:rPr>
+        <w:t>32</w:t>
+      </w:r>
+      <w:r>
+        <w:rPr>
+          <w:noProof/>
+        </w:rPr>
+        <w:fldChar w:fldCharType="end"/>
+      </w:r>
       <w:r>
         <w:rPr>
           <w:lang w:val="ru-RU"/>
@@ -6787,7 +7691,6 @@
         <w:rPr>
           <w:lang w:val="ru-RU"/>
         </w:rPr>
-        <w:lastRenderedPageBreak/>
         <w:t xml:space="preserve">После сохранения записей в таблицу в программе </w:t>
       </w:r>
       <w:r>
@@ -6895,14 +7798,27 @@
       <w:r>
         <w:t xml:space="preserve">Рис. </w:t>
       </w:r>
-      <w:fldSimple w:instr=" SEQ Рис. \* ARABIC ">
-        <w:r>
-          <w:rPr>
-            <w:noProof/>
-          </w:rPr>
-          <w:t>33</w:t>
-        </w:r>
-      </w:fldSimple>
+      <w:r>
+        <w:fldChar w:fldCharType="begin"/>
+      </w:r>
+      <w:r>
+        <w:instrText xml:space="preserve"> SEQ Рис. \* ARABIC </w:instrText>
+      </w:r>
+      <w:r>
+        <w:fldChar w:fldCharType="separate"/>
+      </w:r>
+      <w:r>
+        <w:rPr>
+          <w:noProof/>
+        </w:rPr>
+        <w:t>33</w:t>
+      </w:r>
+      <w:r>
+        <w:rPr>
+          <w:noProof/>
+        </w:rPr>
+        <w:fldChar w:fldCharType="end"/>
+      </w:r>
       <w:r>
         <w:rPr>
           <w:lang w:val="ru-RU"/>
@@ -7060,6 +7976,46 @@
           <w:ilvl w:val="0"/>
           <w:numId w:val="3"/>
         </w:numPr>
+        <w:rPr>
+          <w:szCs w:val="28"/>
+          <w:lang w:val="ru-RU"/>
+        </w:rPr>
+      </w:pPr>
+      <w:r>
+        <w:rPr>
+          <w:szCs w:val="28"/>
+          <w:lang w:val="ru-RU"/>
+        </w:rPr>
+        <w:lastRenderedPageBreak/>
+        <w:t xml:space="preserve">Задание: </w:t>
+      </w:r>
+      <w:r>
+        <w:rPr>
+          <w:szCs w:val="28"/>
+        </w:rPr>
+        <w:t>Измените БД: ее структуру, записи</w:t>
+      </w:r>
+      <w:r>
+        <w:rPr>
+          <w:szCs w:val="28"/>
+          <w:lang w:val="ru-RU"/>
+        </w:rPr>
+        <w:t>.</w:t>
+      </w:r>
+    </w:p>
+    <w:p>
+      <w:pPr>
+        <w:pStyle w:val="a7"/>
+        <w:ind w:left="785" w:firstLine="0"/>
+        <w:rPr>
+          <w:lang w:val="ru-RU"/>
+        </w:rPr>
+      </w:pPr>
+    </w:p>
+    <w:p>
+      <w:pPr>
+        <w:pStyle w:val="a7"/>
+        <w:ind w:left="785" w:firstLine="0"/>
         <w:rPr>
           <w:lang w:val="ru-RU"/>
         </w:rPr>
@@ -7175,14 +8131,27 @@
       <w:r>
         <w:t xml:space="preserve">Рис. </w:t>
       </w:r>
-      <w:fldSimple w:instr=" SEQ Рис. \* ARABIC ">
-        <w:r>
-          <w:rPr>
-            <w:noProof/>
-          </w:rPr>
-          <w:t>34</w:t>
-        </w:r>
-      </w:fldSimple>
+      <w:r>
+        <w:fldChar w:fldCharType="begin"/>
+      </w:r>
+      <w:r>
+        <w:instrText xml:space="preserve"> SEQ Рис. \* ARABIC </w:instrText>
+      </w:r>
+      <w:r>
+        <w:fldChar w:fldCharType="separate"/>
+      </w:r>
+      <w:r>
+        <w:rPr>
+          <w:noProof/>
+        </w:rPr>
+        <w:t>34</w:t>
+      </w:r>
+      <w:r>
+        <w:rPr>
+          <w:noProof/>
+        </w:rPr>
+        <w:fldChar w:fldCharType="end"/>
+      </w:r>
       <w:r>
         <w:rPr>
           <w:lang w:val="ru-RU"/>
@@ -7202,7 +8171,6 @@
         <w:rPr>
           <w:lang w:val="ru-RU"/>
         </w:rPr>
-        <w:lastRenderedPageBreak/>
         <w:t xml:space="preserve">После восстановления данных шестнадцатеричное представление файла приняло следующий вид (рис. </w:t>
       </w:r>
       <w:r>
@@ -7292,14 +8260,27 @@
       <w:r>
         <w:t xml:space="preserve">Рис. </w:t>
       </w:r>
-      <w:fldSimple w:instr=" SEQ Рис. \* ARABIC ">
-        <w:r>
-          <w:rPr>
-            <w:noProof/>
-          </w:rPr>
-          <w:t>35</w:t>
-        </w:r>
-      </w:fldSimple>
+      <w:r>
+        <w:fldChar w:fldCharType="begin"/>
+      </w:r>
+      <w:r>
+        <w:instrText xml:space="preserve"> SEQ Рис. \* ARABIC </w:instrText>
+      </w:r>
+      <w:r>
+        <w:fldChar w:fldCharType="separate"/>
+      </w:r>
+      <w:r>
+        <w:rPr>
+          <w:noProof/>
+        </w:rPr>
+        <w:t>35</w:t>
+      </w:r>
+      <w:r>
+        <w:rPr>
+          <w:noProof/>
+        </w:rPr>
+        <w:fldChar w:fldCharType="end"/>
+      </w:r>
       <w:r>
         <w:rPr>
           <w:lang w:val="ru-RU"/>
@@ -7505,10 +8486,11 @@
           <w:noProof/>
           <w:lang w:val="ru-RU"/>
         </w:rPr>
+        <w:lastRenderedPageBreak/>
         <w:drawing>
           <wp:inline distT="0" distB="0" distL="0" distR="0">
-            <wp:extent cx="4862891" cy="3186259"/>
-            <wp:effectExtent l="0" t="0" r="1270" b="1905"/>
+            <wp:extent cx="4962006" cy="3251200"/>
+            <wp:effectExtent l="0" t="0" r="3810" b="0"/>
             <wp:docPr id="1490623919" name="Рисунок 3"/>
             <wp:cNvGraphicFramePr>
               <a:graphicFrameLocks xmlns:a="http://schemas.openxmlformats.org/drawingml/2006/main" noChangeAspect="1"/>
@@ -7535,7 +8517,7 @@
                   <pic:spPr>
                     <a:xfrm>
                       <a:off x="0" y="0"/>
-                      <a:ext cx="4918374" cy="3222612"/>
+                      <a:ext cx="5040181" cy="3302422"/>
                     </a:xfrm>
                     <a:prstGeom prst="rect">
                       <a:avLst/>
@@ -7558,14 +8540,27 @@
       <w:r>
         <w:t xml:space="preserve">Рис. </w:t>
       </w:r>
-      <w:fldSimple w:instr=" SEQ Рис. \* ARABIC ">
-        <w:r>
-          <w:rPr>
-            <w:noProof/>
-          </w:rPr>
-          <w:t>36</w:t>
-        </w:r>
-      </w:fldSimple>
+      <w:r>
+        <w:fldChar w:fldCharType="begin"/>
+      </w:r>
+      <w:r>
+        <w:instrText xml:space="preserve"> SEQ Рис. \* ARABIC </w:instrText>
+      </w:r>
+      <w:r>
+        <w:fldChar w:fldCharType="separate"/>
+      </w:r>
+      <w:r>
+        <w:rPr>
+          <w:noProof/>
+        </w:rPr>
+        <w:t>36</w:t>
+      </w:r>
+      <w:r>
+        <w:rPr>
+          <w:noProof/>
+        </w:rPr>
+        <w:fldChar w:fldCharType="end"/>
+      </w:r>
       <w:r>
         <w:rPr>
           <w:lang w:val="ru-RU"/>
@@ -7581,14 +8576,52 @@
           <w:numId w:val="3"/>
         </w:numPr>
         <w:rPr>
-          <w:lang w:val="ru-RU"/>
-        </w:rPr>
-      </w:pPr>
-      <w:r>
-        <w:rPr>
-          <w:lang w:val="ru-RU"/>
-        </w:rPr>
-        <w:lastRenderedPageBreak/>
+          <w:szCs w:val="28"/>
+          <w:lang w:val="ru-RU"/>
+        </w:rPr>
+      </w:pPr>
+      <w:r>
+        <w:rPr>
+          <w:szCs w:val="28"/>
+          <w:lang w:val="ru-RU"/>
+        </w:rPr>
+        <w:t xml:space="preserve">Задание: </w:t>
+      </w:r>
+      <w:r>
+        <w:rPr>
+          <w:szCs w:val="28"/>
+        </w:rPr>
+        <w:t>Пометьте запись как удаленную</w:t>
+      </w:r>
+      <w:r>
+        <w:rPr>
+          <w:szCs w:val="28"/>
+          <w:lang w:val="ru-RU"/>
+        </w:rPr>
+        <w:t>.</w:t>
+      </w:r>
+    </w:p>
+    <w:p>
+      <w:pPr>
+        <w:pStyle w:val="a7"/>
+        <w:ind w:left="785" w:firstLine="0"/>
+        <w:rPr>
+          <w:lang w:val="ru-RU"/>
+        </w:rPr>
+      </w:pPr>
+    </w:p>
+    <w:p>
+      <w:pPr>
+        <w:pStyle w:val="a7"/>
+        <w:ind w:left="785" w:firstLine="0"/>
+        <w:rPr>
+          <w:lang w:val="ru-RU"/>
+        </w:rPr>
+      </w:pPr>
+      <w:r>
+        <w:rPr>
+          <w:lang w:val="ru-RU"/>
+        </w:rPr>
         <w:t xml:space="preserve">При помощи команды </w:t>
       </w:r>
       <w:r>
@@ -7735,8 +8768,8 @@
         </w:rPr>
         <w:drawing>
           <wp:inline distT="0" distB="0" distL="0" distR="0">
-            <wp:extent cx="5431973" cy="912468"/>
-            <wp:effectExtent l="0" t="0" r="0" b="2540"/>
+            <wp:extent cx="5020091" cy="843280"/>
+            <wp:effectExtent l="0" t="0" r="0" b="0"/>
             <wp:docPr id="1839833383" name="Рисунок 4"/>
             <wp:cNvGraphicFramePr>
               <a:graphicFrameLocks xmlns:a="http://schemas.openxmlformats.org/drawingml/2006/main" noChangeAspect="1"/>
@@ -7763,7 +8796,7 @@
                   <pic:spPr>
                     <a:xfrm>
                       <a:off x="0" y="0"/>
-                      <a:ext cx="5508640" cy="925347"/>
+                      <a:ext cx="5280629" cy="887045"/>
                     </a:xfrm>
                     <a:prstGeom prst="rect">
                       <a:avLst/>
@@ -7786,14 +8819,27 @@
       <w:r>
         <w:t xml:space="preserve">Рис. </w:t>
       </w:r>
-      <w:fldSimple w:instr=" SEQ Рис. \* ARABIC ">
-        <w:r>
-          <w:rPr>
-            <w:noProof/>
-          </w:rPr>
-          <w:t>37</w:t>
-        </w:r>
-      </w:fldSimple>
+      <w:r>
+        <w:fldChar w:fldCharType="begin"/>
+      </w:r>
+      <w:r>
+        <w:instrText xml:space="preserve"> SEQ Рис. \* ARABIC </w:instrText>
+      </w:r>
+      <w:r>
+        <w:fldChar w:fldCharType="separate"/>
+      </w:r>
+      <w:r>
+        <w:rPr>
+          <w:noProof/>
+        </w:rPr>
+        <w:t>37</w:t>
+      </w:r>
+      <w:r>
+        <w:rPr>
+          <w:noProof/>
+        </w:rPr>
+        <w:fldChar w:fldCharType="end"/>
+      </w:r>
       <w:r>
         <w:rPr>
           <w:lang w:val="ru-RU"/>
@@ -7809,6 +8855,45 @@
           <w:numId w:val="3"/>
         </w:numPr>
         <w:rPr>
+          <w:szCs w:val="28"/>
+          <w:lang w:val="ru-RU"/>
+        </w:rPr>
+      </w:pPr>
+      <w:r>
+        <w:rPr>
+          <w:szCs w:val="28"/>
+          <w:lang w:val="ru-RU"/>
+        </w:rPr>
+        <w:t xml:space="preserve">Задание: </w:t>
+      </w:r>
+      <w:r>
+        <w:rPr>
+          <w:szCs w:val="28"/>
+        </w:rPr>
+        <w:t>Удалите запись</w:t>
+      </w:r>
+      <w:r>
+        <w:rPr>
+          <w:szCs w:val="28"/>
+          <w:lang w:val="ru-RU"/>
+        </w:rPr>
+        <w:t>.</w:t>
+      </w:r>
+    </w:p>
+    <w:p>
+      <w:pPr>
+        <w:pStyle w:val="a7"/>
+        <w:ind w:left="785" w:firstLine="0"/>
+        <w:rPr>
+          <w:lang w:val="ru-RU"/>
+        </w:rPr>
+      </w:pPr>
+    </w:p>
+    <w:p>
+      <w:pPr>
+        <w:pStyle w:val="a7"/>
+        <w:ind w:left="785" w:firstLine="0"/>
+        <w:rPr>
           <w:lang w:val="ru-RU"/>
         </w:rPr>
       </w:pPr>
@@ -7948,10 +9033,11 @@
           <w:noProof/>
           <w:lang w:val="ru-RU"/>
         </w:rPr>
+        <w:lastRenderedPageBreak/>
         <w:drawing>
           <wp:inline distT="0" distB="0" distL="0" distR="0">
-            <wp:extent cx="4728153" cy="3073937"/>
-            <wp:effectExtent l="0" t="0" r="0" b="0"/>
+            <wp:extent cx="5078946" cy="3302000"/>
+            <wp:effectExtent l="0" t="0" r="1270" b="0"/>
             <wp:docPr id="423902437" name="Рисунок 5"/>
             <wp:cNvGraphicFramePr>
               <a:graphicFrameLocks xmlns:a="http://schemas.openxmlformats.org/drawingml/2006/main" noChangeAspect="1"/>
@@ -7978,7 +9064,7 @@
                   <pic:spPr>
                     <a:xfrm>
                       <a:off x="0" y="0"/>
-                      <a:ext cx="4747285" cy="3086375"/>
+                      <a:ext cx="5084611" cy="3305683"/>
                     </a:xfrm>
                     <a:prstGeom prst="rect">
                       <a:avLst/>
@@ -8001,14 +9087,27 @@
       <w:r>
         <w:t xml:space="preserve">Рис. </w:t>
       </w:r>
-      <w:fldSimple w:instr=" SEQ Рис. \* ARABIC ">
-        <w:r>
-          <w:rPr>
-            <w:noProof/>
-          </w:rPr>
-          <w:t>38</w:t>
-        </w:r>
-      </w:fldSimple>
+      <w:r>
+        <w:fldChar w:fldCharType="begin"/>
+      </w:r>
+      <w:r>
+        <w:instrText xml:space="preserve"> SEQ Рис. \* ARABIC </w:instrText>
+      </w:r>
+      <w:r>
+        <w:fldChar w:fldCharType="separate"/>
+      </w:r>
+      <w:r>
+        <w:rPr>
+          <w:noProof/>
+        </w:rPr>
+        <w:t>38</w:t>
+      </w:r>
+      <w:r>
+        <w:rPr>
+          <w:noProof/>
+        </w:rPr>
+        <w:fldChar w:fldCharType="end"/>
+      </w:r>
       <w:r>
         <w:rPr>
           <w:lang w:val="ru-RU"/>
@@ -8024,23 +9123,475 @@
           <w:numId w:val="3"/>
         </w:numPr>
         <w:rPr>
-          <w:lang w:val="ru-RU"/>
-        </w:rPr>
-      </w:pPr>
-      <w:r>
-        <w:rPr>
+          <w:szCs w:val="28"/>
+          <w:lang w:val="ru-RU"/>
+        </w:rPr>
+      </w:pPr>
+      <w:r>
+        <w:rPr>
+          <w:szCs w:val="28"/>
+          <w:lang w:val="ru-RU"/>
+        </w:rPr>
+        <w:t xml:space="preserve">Задание: </w:t>
+      </w:r>
+      <w:r>
+        <w:rPr>
+          <w:szCs w:val="28"/>
+        </w:rPr>
+        <w:t>Проиндексируйте БД по какому-нибудь полю. Сделайте то же в обратном порядке</w:t>
+      </w:r>
+      <w:r>
+        <w:rPr>
+          <w:szCs w:val="28"/>
+          <w:lang w:val="ru-RU"/>
+        </w:rPr>
+        <w:t>.</w:t>
+      </w:r>
+    </w:p>
+    <w:p>
+      <w:pPr>
+        <w:pStyle w:val="a7"/>
+        <w:ind w:left="785" w:firstLine="0"/>
+        <w:rPr>
+          <w:lang w:val="ru-RU"/>
+        </w:rPr>
+      </w:pPr>
+    </w:p>
+    <w:p>
+      <w:pPr>
+        <w:pStyle w:val="a7"/>
+        <w:ind w:left="785" w:firstLine="0"/>
+        <w:rPr>
+          <w:color w:val="000000" w:themeColor="text1"/>
+          <w:lang w:val="ru-RU"/>
+        </w:rPr>
+      </w:pPr>
+      <w:r>
+        <w:rPr>
+          <w:color w:val="000000" w:themeColor="text1"/>
+          <w:lang w:val="ru-RU"/>
+        </w:rPr>
+        <w:t>Команд</w:t>
+      </w:r>
+      <w:r>
+        <w:rPr>
+          <w:color w:val="000000" w:themeColor="text1"/>
+          <w:lang w:val="ru-RU"/>
+        </w:rPr>
+        <w:t>ами</w:t>
+      </w:r>
+      <w:r>
+        <w:rPr>
+          <w:color w:val="000000" w:themeColor="text1"/>
+          <w:lang w:val="en-US"/>
+        </w:rPr>
+        <w:t xml:space="preserve"> </w:t>
+      </w:r>
+      <w:r>
+        <w:rPr>
+          <w:rFonts w:ascii="Menlo" w:hAnsi="Menlo" w:cs="Menlo"/>
+          <w:color w:val="000000" w:themeColor="text1"/>
+          <w:sz w:val="22"/>
+          <w:szCs w:val="22"/>
+          <w:lang w:val="en-US"/>
+        </w:rPr>
+        <w:t>.sort to lab2s on SYBOLIC</w:t>
+      </w:r>
+      <w:r>
+        <w:rPr>
+          <w:color w:val="000000" w:themeColor="text1"/>
+          <w:lang w:val="en-US"/>
+        </w:rPr>
+        <w:t xml:space="preserve"> </w:t>
+      </w:r>
+      <w:r>
+        <w:rPr>
+          <w:color w:val="000000" w:themeColor="text1"/>
+          <w:lang w:val="ru-RU"/>
+        </w:rPr>
+        <w:t>и</w:t>
+      </w:r>
+      <w:r>
+        <w:rPr>
+          <w:color w:val="000000" w:themeColor="text1"/>
+          <w:lang w:val="en-US"/>
+        </w:rPr>
+        <w:t xml:space="preserve"> </w:t>
+      </w:r>
+      <w:r>
+        <w:rPr>
+          <w:rFonts w:ascii="Menlo" w:hAnsi="Menlo" w:cs="Menlo"/>
+          <w:color w:val="000000" w:themeColor="text1"/>
+          <w:sz w:val="22"/>
+          <w:szCs w:val="22"/>
+          <w:lang w:val="en-US"/>
+        </w:rPr>
+        <w:t>.</w:t>
+      </w:r>
+      <w:r>
+        <w:rPr>
+          <w:rFonts w:ascii="Menlo" w:hAnsi="Menlo" w:cs="Menlo"/>
+          <w:color w:val="000000" w:themeColor="text1"/>
+          <w:sz w:val="22"/>
+          <w:szCs w:val="22"/>
+          <w:lang w:val="en-US"/>
+        </w:rPr>
+        <w:t>index</w:t>
+      </w:r>
+      <w:r>
+        <w:rPr>
+          <w:rFonts w:ascii="Menlo" w:hAnsi="Menlo" w:cs="Menlo"/>
+          <w:color w:val="000000" w:themeColor="text1"/>
+          <w:sz w:val="22"/>
+          <w:szCs w:val="22"/>
+          <w:lang w:val="en-US"/>
+        </w:rPr>
+        <w:t xml:space="preserve"> </w:t>
+      </w:r>
+      <w:r>
+        <w:rPr>
+          <w:rFonts w:ascii="Menlo" w:hAnsi="Menlo" w:cs="Menlo"/>
+          <w:color w:val="000000" w:themeColor="text1"/>
+          <w:sz w:val="22"/>
+          <w:szCs w:val="22"/>
+          <w:lang w:val="en-US"/>
+        </w:rPr>
+        <w:t>on</w:t>
+      </w:r>
+      <w:r>
+        <w:rPr>
+          <w:rFonts w:ascii="Menlo" w:hAnsi="Menlo" w:cs="Menlo"/>
+          <w:color w:val="000000" w:themeColor="text1"/>
+          <w:sz w:val="22"/>
+          <w:szCs w:val="22"/>
+          <w:lang w:val="en-US"/>
+        </w:rPr>
+        <w:t xml:space="preserve"> </w:t>
+      </w:r>
+      <w:r>
+        <w:rPr>
+          <w:rFonts w:ascii="Menlo" w:hAnsi="Menlo" w:cs="Menlo"/>
+          <w:color w:val="000000" w:themeColor="text1"/>
+          <w:sz w:val="22"/>
+          <w:szCs w:val="22"/>
+          <w:lang w:val="en-US"/>
+        </w:rPr>
+        <w:t>SYBOLIC</w:t>
+      </w:r>
+      <w:r>
+        <w:rPr>
+          <w:rFonts w:ascii="Menlo" w:hAnsi="Menlo" w:cs="Menlo"/>
+          <w:color w:val="000000" w:themeColor="text1"/>
+          <w:sz w:val="22"/>
+          <w:szCs w:val="22"/>
+          <w:lang w:val="en-US"/>
+        </w:rPr>
+        <w:t xml:space="preserve"> </w:t>
+      </w:r>
+      <w:r>
+        <w:rPr>
+          <w:rFonts w:ascii="Menlo" w:hAnsi="Menlo" w:cs="Menlo"/>
+          <w:color w:val="000000" w:themeColor="text1"/>
+          <w:sz w:val="22"/>
+          <w:szCs w:val="22"/>
+          <w:lang w:val="en-US"/>
+        </w:rPr>
+        <w:t>to</w:t>
+      </w:r>
+      <w:r>
+        <w:rPr>
+          <w:rFonts w:ascii="Menlo" w:hAnsi="Menlo" w:cs="Menlo"/>
+          <w:color w:val="000000" w:themeColor="text1"/>
+          <w:sz w:val="22"/>
+          <w:szCs w:val="22"/>
+          <w:lang w:val="en-US"/>
+        </w:rPr>
+        <w:t xml:space="preserve"> </w:t>
+      </w:r>
+      <w:r>
+        <w:rPr>
+          <w:rFonts w:ascii="Menlo" w:hAnsi="Menlo" w:cs="Menlo"/>
+          <w:color w:val="000000" w:themeColor="text1"/>
+          <w:sz w:val="22"/>
+          <w:szCs w:val="22"/>
+          <w:lang w:val="en-US"/>
+        </w:rPr>
+        <w:t>lab</w:t>
+      </w:r>
+      <w:r>
+        <w:rPr>
+          <w:rFonts w:ascii="Menlo" w:hAnsi="Menlo" w:cs="Menlo"/>
+          <w:color w:val="000000" w:themeColor="text1"/>
+          <w:sz w:val="22"/>
+          <w:szCs w:val="22"/>
+          <w:lang w:val="en-US"/>
+        </w:rPr>
+        <w:t>2_</w:t>
+      </w:r>
+      <w:r>
+        <w:rPr>
+          <w:rFonts w:ascii="Menlo" w:hAnsi="Menlo" w:cs="Menlo"/>
+          <w:color w:val="000000" w:themeColor="text1"/>
+          <w:sz w:val="22"/>
+          <w:szCs w:val="22"/>
+          <w:lang w:val="en-US"/>
+        </w:rPr>
+        <w:t>i</w:t>
+      </w:r>
+      <w:r>
+        <w:rPr>
+          <w:color w:val="000000" w:themeColor="text1"/>
+          <w:lang w:val="en-US"/>
+        </w:rPr>
+        <w:t xml:space="preserve"> </w:t>
+      </w:r>
+      <w:r>
+        <w:rPr>
+          <w:color w:val="000000" w:themeColor="text1"/>
+          <w:lang w:val="ru-RU"/>
+        </w:rPr>
+        <w:t>произведена</w:t>
+      </w:r>
+      <w:r>
+        <w:rPr>
+          <w:color w:val="000000" w:themeColor="text1"/>
+          <w:lang w:val="en-US"/>
+        </w:rPr>
+        <w:t xml:space="preserve"> </w:t>
+      </w:r>
+      <w:r>
+        <w:rPr>
+          <w:color w:val="000000" w:themeColor="text1"/>
+          <w:lang w:val="ru-RU"/>
+        </w:rPr>
+        <w:t>индексация</w:t>
+      </w:r>
+      <w:r>
+        <w:rPr>
+          <w:color w:val="000000" w:themeColor="text1"/>
+          <w:lang w:val="en-US"/>
+        </w:rPr>
+        <w:t xml:space="preserve"> </w:t>
+      </w:r>
+      <w:r>
+        <w:rPr>
+          <w:color w:val="000000" w:themeColor="text1"/>
+          <w:lang w:val="ru-RU"/>
+        </w:rPr>
+        <w:t>таблицы</w:t>
+      </w:r>
+      <w:r>
+        <w:rPr>
+          <w:color w:val="000000" w:themeColor="text1"/>
+          <w:lang w:val="en-US"/>
+        </w:rPr>
+        <w:t>.</w:t>
+      </w:r>
+      <w:r>
+        <w:rPr>
+          <w:color w:val="000000" w:themeColor="text1"/>
+          <w:lang w:val="en-US"/>
+        </w:rPr>
+        <w:t xml:space="preserve"> </w:t>
+      </w:r>
+      <w:r>
+        <w:rPr>
+          <w:color w:val="000000" w:themeColor="text1"/>
+          <w:lang w:val="ru-RU"/>
+        </w:rPr>
+        <w:t>После выполнения команды</w:t>
+      </w:r>
+      <w:r>
+        <w:rPr>
+          <w:color w:val="000000" w:themeColor="text1"/>
+          <w:lang w:val="ru-RU"/>
+        </w:rPr>
+        <w:t xml:space="preserve"> </w:t>
+      </w:r>
+      <w:r>
+        <w:rPr>
+          <w:rFonts w:ascii="Menlo" w:hAnsi="Menlo" w:cs="Menlo"/>
+          <w:color w:val="000000" w:themeColor="text1"/>
+          <w:sz w:val="22"/>
+          <w:szCs w:val="22"/>
+          <w:lang w:val="ru-RU"/>
+        </w:rPr>
+        <w:t>.</w:t>
+      </w:r>
+      <w:r>
+        <w:rPr>
+          <w:rFonts w:ascii="Menlo" w:hAnsi="Menlo" w:cs="Menlo"/>
+          <w:color w:val="000000" w:themeColor="text1"/>
+          <w:sz w:val="22"/>
+          <w:szCs w:val="22"/>
+          <w:lang w:val="en-US"/>
+        </w:rPr>
+        <w:t>sort</w:t>
+      </w:r>
+      <w:r>
+        <w:rPr>
+          <w:rFonts w:ascii="Menlo" w:hAnsi="Menlo" w:cs="Menlo"/>
+          <w:color w:val="000000" w:themeColor="text1"/>
+          <w:sz w:val="22"/>
+          <w:szCs w:val="22"/>
+          <w:lang w:val="ru-RU"/>
+        </w:rPr>
+        <w:t xml:space="preserve"> </w:t>
+      </w:r>
+      <w:r>
+        <w:rPr>
+          <w:rFonts w:ascii="Menlo" w:hAnsi="Menlo" w:cs="Menlo"/>
+          <w:color w:val="000000" w:themeColor="text1"/>
+          <w:sz w:val="22"/>
+          <w:szCs w:val="22"/>
+          <w:lang w:val="en-US"/>
+        </w:rPr>
+        <w:t>to</w:t>
+      </w:r>
+      <w:r>
+        <w:rPr>
+          <w:rFonts w:ascii="Menlo" w:hAnsi="Menlo" w:cs="Menlo"/>
+          <w:color w:val="000000" w:themeColor="text1"/>
+          <w:sz w:val="22"/>
+          <w:szCs w:val="22"/>
+          <w:lang w:val="ru-RU"/>
+        </w:rPr>
+        <w:t xml:space="preserve"> </w:t>
+      </w:r>
+      <w:r>
+        <w:rPr>
+          <w:rFonts w:ascii="Menlo" w:hAnsi="Menlo" w:cs="Menlo"/>
+          <w:color w:val="000000" w:themeColor="text1"/>
+          <w:sz w:val="22"/>
+          <w:szCs w:val="22"/>
+          <w:lang w:val="en-US"/>
+        </w:rPr>
+        <w:t>lab</w:t>
+      </w:r>
+      <w:r>
+        <w:rPr>
+          <w:rFonts w:ascii="Menlo" w:hAnsi="Menlo" w:cs="Menlo"/>
+          <w:color w:val="000000" w:themeColor="text1"/>
+          <w:sz w:val="22"/>
+          <w:szCs w:val="22"/>
+          <w:lang w:val="ru-RU"/>
+        </w:rPr>
+        <w:t>2</w:t>
+      </w:r>
+      <w:r>
+        <w:rPr>
+          <w:rFonts w:ascii="Menlo" w:hAnsi="Menlo" w:cs="Menlo"/>
+          <w:color w:val="000000" w:themeColor="text1"/>
+          <w:sz w:val="22"/>
+          <w:szCs w:val="22"/>
+          <w:lang w:val="en-US"/>
+        </w:rPr>
+        <w:t>s</w:t>
+      </w:r>
+      <w:r>
+        <w:rPr>
+          <w:rFonts w:ascii="Menlo" w:hAnsi="Menlo" w:cs="Menlo"/>
+          <w:color w:val="000000" w:themeColor="text1"/>
+          <w:sz w:val="22"/>
+          <w:szCs w:val="22"/>
+          <w:lang w:val="ru-RU"/>
+        </w:rPr>
+        <w:t>в</w:t>
+      </w:r>
+      <w:r>
+        <w:rPr>
+          <w:rFonts w:ascii="Menlo" w:hAnsi="Menlo" w:cs="Menlo"/>
+          <w:color w:val="000000" w:themeColor="text1"/>
+          <w:sz w:val="22"/>
+          <w:szCs w:val="22"/>
+          <w:lang w:val="ru-RU"/>
+        </w:rPr>
+        <w:t xml:space="preserve"> </w:t>
+      </w:r>
+      <w:r>
+        <w:rPr>
+          <w:rFonts w:ascii="Menlo" w:hAnsi="Menlo" w:cs="Menlo"/>
+          <w:color w:val="000000" w:themeColor="text1"/>
+          <w:sz w:val="22"/>
+          <w:szCs w:val="22"/>
+          <w:lang w:val="en-US"/>
+        </w:rPr>
+        <w:t>on</w:t>
+      </w:r>
+      <w:r>
+        <w:rPr>
+          <w:rFonts w:ascii="Menlo" w:hAnsi="Menlo" w:cs="Menlo"/>
+          <w:color w:val="000000" w:themeColor="text1"/>
+          <w:sz w:val="22"/>
+          <w:szCs w:val="22"/>
+          <w:lang w:val="ru-RU"/>
+        </w:rPr>
+        <w:t xml:space="preserve"> </w:t>
+      </w:r>
+      <w:r>
+        <w:rPr>
+          <w:rFonts w:ascii="Menlo" w:hAnsi="Menlo" w:cs="Menlo"/>
+          <w:color w:val="000000" w:themeColor="text1"/>
+          <w:sz w:val="22"/>
+          <w:szCs w:val="22"/>
+          <w:lang w:val="en-US"/>
+        </w:rPr>
+        <w:t>SYBOLIC</w:t>
+      </w:r>
+      <w:r>
+        <w:rPr>
+          <w:rFonts w:ascii="Menlo" w:hAnsi="Menlo" w:cs="Menlo"/>
+          <w:color w:val="000000" w:themeColor="text1"/>
+          <w:sz w:val="22"/>
+          <w:szCs w:val="22"/>
+          <w:lang w:val="ru-RU"/>
+        </w:rPr>
+        <w:t xml:space="preserve"> </w:t>
+      </w:r>
+      <w:r>
+        <w:rPr>
+          <w:rFonts w:ascii="Menlo" w:hAnsi="Menlo" w:cs="Menlo"/>
+          <w:color w:val="000000" w:themeColor="text1"/>
+          <w:sz w:val="22"/>
+          <w:szCs w:val="22"/>
+          <w:lang w:val="ru-RU"/>
+        </w:rPr>
+        <w:t>/</w:t>
+      </w:r>
+      <w:r>
+        <w:rPr>
+          <w:rFonts w:ascii="Menlo" w:hAnsi="Menlo" w:cs="Menlo"/>
+          <w:color w:val="000000" w:themeColor="text1"/>
+          <w:sz w:val="22"/>
+          <w:szCs w:val="22"/>
+          <w:lang w:val="en-US"/>
+        </w:rPr>
+        <w:t>D</w:t>
+      </w:r>
+      <w:r>
+        <w:rPr>
+          <w:color w:val="000000" w:themeColor="text1"/>
+          <w:lang w:val="ru-RU"/>
+        </w:rPr>
+        <w:t xml:space="preserve"> индексация произведена в обратном порядке. </w:t>
+      </w:r>
+      <w:r>
+        <w:rPr>
+          <w:color w:val="000000" w:themeColor="text1"/>
           <w:lang w:val="ru-RU"/>
         </w:rPr>
         <w:t xml:space="preserve">Индексация записей не возымела какого-либо эффекта на файл базы данных, лишь создался отдельный индексный файл с совершенно другой структурой (рис. </w:t>
       </w:r>
       <w:r>
         <w:rPr>
+          <w:color w:val="000000" w:themeColor="text1"/>
           <w:lang w:val="ru-RU"/>
         </w:rPr>
         <w:t>39</w:t>
       </w:r>
       <w:r>
         <w:rPr>
+          <w:color w:val="000000" w:themeColor="text1"/>
           <w:lang w:val="ru-RU"/>
         </w:rPr>
         <w:t xml:space="preserve">). </w:t>
@@ -8049,6 +9600,15 @@
     <w:p>
       <w:pPr>
         <w:pStyle w:val="a7"/>
+        <w:ind w:left="785" w:firstLine="0"/>
+        <w:rPr>
+          <w:lang w:val="ru-RU"/>
+        </w:rPr>
+      </w:pPr>
+    </w:p>
+    <w:p>
+      <w:pPr>
+        <w:pStyle w:val="a7"/>
         <w:keepNext/>
         <w:ind w:left="785" w:firstLine="0"/>
         <w:jc w:val="center"/>
@@ -8058,7 +9618,6 @@
           <w:noProof/>
           <w:lang w:val="ru-RU"/>
         </w:rPr>
-        <w:lastRenderedPageBreak/>
         <w:drawing>
           <wp:inline distT="0" distB="0" distL="0" distR="0">
             <wp:extent cx="5535668" cy="2886726"/>
@@ -8112,19 +9671,48 @@
       <w:r>
         <w:t xml:space="preserve">Рис. </w:t>
       </w:r>
-      <w:fldSimple w:instr=" SEQ Рис. \* ARABIC ">
-        <w:r>
-          <w:rPr>
-            <w:noProof/>
-          </w:rPr>
-          <w:t>39</w:t>
-        </w:r>
-      </w:fldSimple>
+      <w:r>
+        <w:fldChar w:fldCharType="begin"/>
+      </w:r>
+      <w:r>
+        <w:instrText xml:space="preserve"> SEQ Рис. \* ARABIC </w:instrText>
+      </w:r>
+      <w:r>
+        <w:fldChar w:fldCharType="separate"/>
+      </w:r>
+      <w:r>
+        <w:rPr>
+          <w:noProof/>
+        </w:rPr>
+        <w:t>39</w:t>
+      </w:r>
+      <w:r>
+        <w:rPr>
+          <w:noProof/>
+        </w:rPr>
+        <w:fldChar w:fldCharType="end"/>
+      </w:r>
       <w:r>
         <w:rPr>
           <w:lang w:val="ru-RU"/>
         </w:rPr>
         <w:t>. Шестнадцатеричное представление индексного файла</w:t>
+      </w:r>
+    </w:p>
+    <w:p>
+      <w:pPr>
+        <w:spacing w:after="160" w:line="278" w:lineRule="auto"/>
+        <w:ind w:firstLine="0"/>
+        <w:jc w:val="left"/>
+        <w:rPr>
+          <w:lang w:val="ru-RU"/>
+        </w:rPr>
+      </w:pPr>
+      <w:r>
+        <w:rPr>
+          <w:lang w:val="ru-RU"/>
+        </w:rPr>
+        <w:br w:type="page"/>
       </w:r>
     </w:p>
     <w:p>
@@ -8139,6 +9727,7 @@
         <w:rPr>
           <w:lang w:val="ru-RU"/>
         </w:rPr>
+        <w:lastRenderedPageBreak/>
         <w:t>Часть 2.</w:t>
       </w:r>
     </w:p>
@@ -8149,6 +9738,73 @@
           <w:ilvl w:val="0"/>
           <w:numId w:val="4"/>
         </w:numPr>
+        <w:rPr>
+          <w:szCs w:val="28"/>
+          <w:lang w:val="ru-RU"/>
+        </w:rPr>
+      </w:pPr>
+      <w:r>
+        <w:rPr>
+          <w:szCs w:val="28"/>
+          <w:lang w:val="ru-RU"/>
+        </w:rPr>
+        <w:t xml:space="preserve">Задание: </w:t>
+      </w:r>
+      <w:r>
+        <w:rPr>
+          <w:szCs w:val="28"/>
+        </w:rPr>
+        <w:t xml:space="preserve">Создайте БД в СУБД </w:t>
+      </w:r>
+      <w:r>
+        <w:rPr>
+          <w:szCs w:val="28"/>
+          <w:lang w:val="en-US"/>
+        </w:rPr>
+        <w:t>Access</w:t>
+      </w:r>
+      <w:r>
+        <w:rPr>
+          <w:szCs w:val="28"/>
+        </w:rPr>
+        <w:t>: сформируйте структуру таблицы БД из полей разного типа. Исследуйте структуру .</w:t>
+      </w:r>
+      <w:proofErr w:type="spellStart"/>
+      <w:r>
+        <w:rPr>
+          <w:szCs w:val="28"/>
+          <w:lang w:val="en-US"/>
+        </w:rPr>
+        <w:t>mdb</w:t>
+      </w:r>
+      <w:proofErr w:type="spellEnd"/>
+      <w:r>
+        <w:rPr>
+          <w:szCs w:val="28"/>
+        </w:rPr>
+        <w:t>-файла</w:t>
+      </w:r>
+      <w:r>
+        <w:rPr>
+          <w:szCs w:val="28"/>
+          <w:lang w:val="ru-RU"/>
+        </w:rPr>
+        <w:t>.</w:t>
+      </w:r>
+    </w:p>
+    <w:p>
+      <w:pPr>
+        <w:pStyle w:val="a7"/>
+        <w:ind w:left="785" w:firstLine="0"/>
+        <w:rPr>
+          <w:lang w:val="ru-RU"/>
+        </w:rPr>
+      </w:pPr>
+    </w:p>
+    <w:p>
+      <w:pPr>
+        <w:pStyle w:val="a7"/>
+        <w:ind w:left="785" w:firstLine="0"/>
         <w:rPr>
           <w:lang w:val="ru-RU"/>
         </w:rPr>
@@ -8279,14 +9935,27 @@
       <w:r>
         <w:t xml:space="preserve">Рис. </w:t>
       </w:r>
-      <w:fldSimple w:instr=" SEQ Рис. \* ARABIC ">
-        <w:r>
-          <w:rPr>
-            <w:noProof/>
-          </w:rPr>
-          <w:t>40</w:t>
-        </w:r>
-      </w:fldSimple>
+      <w:r>
+        <w:fldChar w:fldCharType="begin"/>
+      </w:r>
+      <w:r>
+        <w:instrText xml:space="preserve"> SEQ Рис. \* ARABIC </w:instrText>
+      </w:r>
+      <w:r>
+        <w:fldChar w:fldCharType="separate"/>
+      </w:r>
+      <w:r>
+        <w:rPr>
+          <w:noProof/>
+        </w:rPr>
+        <w:t>40</w:t>
+      </w:r>
+      <w:r>
+        <w:rPr>
+          <w:noProof/>
+        </w:rPr>
+        <w:fldChar w:fldCharType="end"/>
+      </w:r>
       <w:r>
         <w:rPr>
           <w:lang w:val="ru-RU"/>
@@ -8427,14 +10096,27 @@
       <w:r>
         <w:t xml:space="preserve">Рис. </w:t>
       </w:r>
-      <w:fldSimple w:instr=" SEQ Рис. \* ARABIC ">
-        <w:r>
-          <w:rPr>
-            <w:noProof/>
-          </w:rPr>
-          <w:t>41</w:t>
-        </w:r>
-      </w:fldSimple>
+      <w:r>
+        <w:fldChar w:fldCharType="begin"/>
+      </w:r>
+      <w:r>
+        <w:instrText xml:space="preserve"> SEQ Рис. \* ARABIC </w:instrText>
+      </w:r>
+      <w:r>
+        <w:fldChar w:fldCharType="separate"/>
+      </w:r>
+      <w:r>
+        <w:rPr>
+          <w:noProof/>
+        </w:rPr>
+        <w:t>41</w:t>
+      </w:r>
+      <w:r>
+        <w:rPr>
+          <w:noProof/>
+        </w:rPr>
+        <w:fldChar w:fldCharType="end"/>
+      </w:r>
       <w:r>
         <w:rPr>
           <w:lang w:val="ru-RU"/>
@@ -8483,7 +10165,43 @@
         <w:rPr>
           <w:lang w:val="ru-RU"/>
         </w:rPr>
-        <w:lastRenderedPageBreak/>
+        <w:t xml:space="preserve">Задание: </w:t>
+      </w:r>
+      <w:r>
+        <w:rPr>
+          <w:szCs w:val="28"/>
+        </w:rPr>
+        <w:t>Внесите в БД записи. Изучите их размещение во внешней памяти</w:t>
+      </w:r>
+      <w:r>
+        <w:rPr>
+          <w:szCs w:val="28"/>
+          <w:lang w:val="ru-RU"/>
+        </w:rPr>
+        <w:t>.</w:t>
+      </w:r>
+    </w:p>
+    <w:p>
+      <w:pPr>
+        <w:pStyle w:val="a7"/>
+        <w:ind w:left="785" w:firstLine="0"/>
+        <w:rPr>
+          <w:lang w:val="ru-RU"/>
+        </w:rPr>
+      </w:pPr>
+    </w:p>
+    <w:p>
+      <w:pPr>
+        <w:pStyle w:val="a7"/>
+        <w:ind w:left="785" w:firstLine="0"/>
+        <w:rPr>
+          <w:lang w:val="ru-RU"/>
+        </w:rPr>
+      </w:pPr>
+      <w:r>
+        <w:rPr>
+          <w:lang w:val="ru-RU"/>
+        </w:rPr>
         <w:t xml:space="preserve">В таблицу были внесены три записи (рис. </w:t>
       </w:r>
       <w:r>
@@ -8573,14 +10291,27 @@
       <w:r>
         <w:t xml:space="preserve">Рис. </w:t>
       </w:r>
-      <w:fldSimple w:instr=" SEQ Рис. \* ARABIC ">
-        <w:r>
-          <w:rPr>
-            <w:noProof/>
-          </w:rPr>
-          <w:t>42</w:t>
-        </w:r>
-      </w:fldSimple>
+      <w:r>
+        <w:fldChar w:fldCharType="begin"/>
+      </w:r>
+      <w:r>
+        <w:instrText xml:space="preserve"> SEQ Рис. \* ARABIC </w:instrText>
+      </w:r>
+      <w:r>
+        <w:fldChar w:fldCharType="separate"/>
+      </w:r>
+      <w:r>
+        <w:rPr>
+          <w:noProof/>
+        </w:rPr>
+        <w:t>42</w:t>
+      </w:r>
+      <w:r>
+        <w:rPr>
+          <w:noProof/>
+        </w:rPr>
+        <w:fldChar w:fldCharType="end"/>
+      </w:r>
       <w:r>
         <w:rPr>
           <w:lang w:val="ru-RU"/>
@@ -8722,10 +10453,11 @@
           <w:noProof/>
           <w:lang w:val="ru-RU"/>
         </w:rPr>
+        <w:lastRenderedPageBreak/>
         <w:drawing>
           <wp:inline distT="0" distB="0" distL="0" distR="0">
-            <wp:extent cx="5183951" cy="2611355"/>
-            <wp:effectExtent l="0" t="0" r="0" b="5080"/>
+            <wp:extent cx="5062469" cy="2550160"/>
+            <wp:effectExtent l="0" t="0" r="5080" b="2540"/>
             <wp:docPr id="1964630280" name="Рисунок 10"/>
             <wp:cNvGraphicFramePr>
               <a:graphicFrameLocks xmlns:a="http://schemas.openxmlformats.org/drawingml/2006/main" noChangeAspect="1"/>
@@ -8752,7 +10484,7 @@
                   <pic:spPr>
                     <a:xfrm>
                       <a:off x="0" y="0"/>
-                      <a:ext cx="5183951" cy="2611355"/>
+                      <a:ext cx="5109873" cy="2574039"/>
                     </a:xfrm>
                     <a:prstGeom prst="rect">
                       <a:avLst/>
@@ -8775,14 +10507,27 @@
       <w:r>
         <w:t xml:space="preserve">Рис. </w:t>
       </w:r>
-      <w:fldSimple w:instr=" SEQ Рис. \* ARABIC ">
-        <w:r>
-          <w:rPr>
-            <w:noProof/>
-          </w:rPr>
-          <w:t>43</w:t>
-        </w:r>
-      </w:fldSimple>
+      <w:r>
+        <w:fldChar w:fldCharType="begin"/>
+      </w:r>
+      <w:r>
+        <w:instrText xml:space="preserve"> SEQ Рис. \* ARABIC </w:instrText>
+      </w:r>
+      <w:r>
+        <w:fldChar w:fldCharType="separate"/>
+      </w:r>
+      <w:r>
+        <w:rPr>
+          <w:noProof/>
+        </w:rPr>
+        <w:t>43</w:t>
+      </w:r>
+      <w:r>
+        <w:rPr>
+          <w:noProof/>
+        </w:rPr>
+        <w:fldChar w:fldCharType="end"/>
+      </w:r>
       <w:r>
         <w:rPr>
           <w:lang w:val="ru-RU"/>
@@ -8798,6 +10543,46 @@
           <w:numId w:val="4"/>
         </w:numPr>
         <w:rPr>
+          <w:szCs w:val="28"/>
+          <w:lang w:val="ru-RU"/>
+        </w:rPr>
+      </w:pPr>
+      <w:r>
+        <w:rPr>
+          <w:szCs w:val="28"/>
+          <w:lang w:val="ru-RU"/>
+        </w:rPr>
+        <w:t xml:space="preserve">Задание: </w:t>
+      </w:r>
+      <w:r>
+        <w:rPr>
+          <w:szCs w:val="28"/>
+        </w:rPr>
+        <w:t>Измените БД: ее структуру, записи</w:t>
+      </w:r>
+      <w:r>
+        <w:rPr>
+          <w:szCs w:val="28"/>
+          <w:lang w:val="ru-RU"/>
+        </w:rPr>
+        <w:t>.</w:t>
+      </w:r>
+    </w:p>
+    <w:p>
+      <w:pPr>
+        <w:pStyle w:val="a7"/>
+        <w:ind w:left="785" w:firstLine="0"/>
+        <w:rPr>
+          <w:szCs w:val="28"/>
+          <w:lang w:val="ru-RU"/>
+        </w:rPr>
+      </w:pPr>
+    </w:p>
+    <w:p>
+      <w:pPr>
+        <w:pStyle w:val="a7"/>
+        <w:ind w:left="785" w:firstLine="0"/>
+        <w:rPr>
           <w:lang w:val="ru-RU"/>
         </w:rPr>
       </w:pPr>
@@ -8843,8 +10628,8 @@
         </w:rPr>
         <w:drawing>
           <wp:inline distT="0" distB="0" distL="0" distR="0">
-            <wp:extent cx="3122065" cy="1730967"/>
-            <wp:effectExtent l="0" t="0" r="2540" b="0"/>
+            <wp:extent cx="2764790" cy="1532884"/>
+            <wp:effectExtent l="0" t="0" r="3810" b="4445"/>
             <wp:docPr id="337836909" name="Рисунок 11"/>
             <wp:cNvGraphicFramePr>
               <a:graphicFrameLocks xmlns:a="http://schemas.openxmlformats.org/drawingml/2006/main" noChangeAspect="1"/>
@@ -8871,7 +10656,7 @@
                   <pic:spPr>
                     <a:xfrm>
                       <a:off x="0" y="0"/>
-                      <a:ext cx="3122065" cy="1730967"/>
+                      <a:ext cx="2808981" cy="1557385"/>
                     </a:xfrm>
                     <a:prstGeom prst="rect">
                       <a:avLst/>
@@ -8894,14 +10679,27 @@
       <w:r>
         <w:t xml:space="preserve">Рис. </w:t>
       </w:r>
-      <w:fldSimple w:instr=" SEQ Рис. \* ARABIC ">
-        <w:r>
-          <w:rPr>
-            <w:noProof/>
-          </w:rPr>
-          <w:t>44</w:t>
-        </w:r>
-      </w:fldSimple>
+      <w:r>
+        <w:fldChar w:fldCharType="begin"/>
+      </w:r>
+      <w:r>
+        <w:instrText xml:space="preserve"> SEQ Рис. \* ARABIC </w:instrText>
+      </w:r>
+      <w:r>
+        <w:fldChar w:fldCharType="separate"/>
+      </w:r>
+      <w:r>
+        <w:rPr>
+          <w:noProof/>
+        </w:rPr>
+        <w:t>44</w:t>
+      </w:r>
+      <w:r>
+        <w:rPr>
+          <w:noProof/>
+        </w:rPr>
+        <w:fldChar w:fldCharType="end"/>
+      </w:r>
       <w:r>
         <w:rPr>
           <w:lang w:val="ru-RU"/>
@@ -8969,6 +10767,15 @@
     <w:p>
       <w:pPr>
         <w:pStyle w:val="a7"/>
+        <w:ind w:left="785" w:firstLine="0"/>
+        <w:rPr>
+          <w:lang w:val="ru-RU"/>
+        </w:rPr>
+      </w:pPr>
+    </w:p>
+    <w:p>
+      <w:pPr>
+        <w:pStyle w:val="a7"/>
         <w:keepNext/>
         <w:ind w:left="785" w:firstLine="0"/>
         <w:jc w:val="center"/>
@@ -8978,7 +10785,6 @@
           <w:noProof/>
           <w:lang w:val="ru-RU"/>
         </w:rPr>
-        <w:lastRenderedPageBreak/>
         <w:drawing>
           <wp:inline distT="0" distB="0" distL="0" distR="0">
             <wp:extent cx="5112215" cy="2648932"/>
@@ -9032,14 +10838,27 @@
       <w:r>
         <w:t xml:space="preserve">Рис. </w:t>
       </w:r>
-      <w:fldSimple w:instr=" SEQ Рис. \* ARABIC ">
-        <w:r>
-          <w:rPr>
-            <w:noProof/>
-          </w:rPr>
-          <w:t>45</w:t>
-        </w:r>
-      </w:fldSimple>
+      <w:r>
+        <w:fldChar w:fldCharType="begin"/>
+      </w:r>
+      <w:r>
+        <w:instrText xml:space="preserve"> SEQ Рис. \* ARABIC </w:instrText>
+      </w:r>
+      <w:r>
+        <w:fldChar w:fldCharType="separate"/>
+      </w:r>
+      <w:r>
+        <w:rPr>
+          <w:noProof/>
+        </w:rPr>
+        <w:t>45</w:t>
+      </w:r>
+      <w:r>
+        <w:rPr>
+          <w:noProof/>
+        </w:rPr>
+        <w:fldChar w:fldCharType="end"/>
+      </w:r>
       <w:r>
         <w:rPr>
           <w:lang w:val="ru-RU"/>
@@ -9055,6 +10874,47 @@
           <w:numId w:val="4"/>
         </w:numPr>
         <w:rPr>
+          <w:szCs w:val="28"/>
+          <w:lang w:val="ru-RU"/>
+        </w:rPr>
+      </w:pPr>
+      <w:r>
+        <w:rPr>
+          <w:szCs w:val="28"/>
+          <w:lang w:val="ru-RU"/>
+        </w:rPr>
+        <w:lastRenderedPageBreak/>
+        <w:t xml:space="preserve">Задание: </w:t>
+      </w:r>
+      <w:r>
+        <w:rPr>
+          <w:szCs w:val="28"/>
+        </w:rPr>
+        <w:t>Удалите запись</w:t>
+      </w:r>
+      <w:r>
+        <w:rPr>
+          <w:szCs w:val="28"/>
+          <w:lang w:val="ru-RU"/>
+        </w:rPr>
+        <w:t>.</w:t>
+      </w:r>
+    </w:p>
+    <w:p>
+      <w:pPr>
+        <w:pStyle w:val="a7"/>
+        <w:ind w:left="785" w:firstLine="0"/>
+        <w:rPr>
+          <w:szCs w:val="28"/>
+          <w:lang w:val="ru-RU"/>
+        </w:rPr>
+      </w:pPr>
+    </w:p>
+    <w:p>
+      <w:pPr>
+        <w:pStyle w:val="a7"/>
+        <w:ind w:left="785" w:firstLine="0"/>
+        <w:rPr>
           <w:lang w:val="ru-RU"/>
         </w:rPr>
       </w:pPr>
@@ -9076,6 +10936,15 @@
         </w:rPr>
         <w:t>.</w:t>
       </w:r>
+    </w:p>
+    <w:p>
+      <w:pPr>
+        <w:pStyle w:val="a7"/>
+        <w:ind w:left="785" w:firstLine="0"/>
+        <w:rPr>
+          <w:lang w:val="ru-RU"/>
+        </w:rPr>
+      </w:pPr>
     </w:p>
     <w:p>
       <w:pPr>
@@ -9084,6 +10953,45 @@
           <w:ilvl w:val="0"/>
           <w:numId w:val="4"/>
         </w:numPr>
+        <w:rPr>
+          <w:szCs w:val="28"/>
+          <w:lang w:val="ru-RU"/>
+        </w:rPr>
+      </w:pPr>
+      <w:r>
+        <w:rPr>
+          <w:szCs w:val="28"/>
+          <w:lang w:val="ru-RU"/>
+        </w:rPr>
+        <w:t xml:space="preserve">Задание: </w:t>
+      </w:r>
+      <w:r>
+        <w:rPr>
+          <w:szCs w:val="28"/>
+        </w:rPr>
+        <w:t>Создайте запросы на сортировку; удаление</w:t>
+      </w:r>
+      <w:r>
+        <w:rPr>
+          <w:szCs w:val="28"/>
+          <w:lang w:val="ru-RU"/>
+        </w:rPr>
+        <w:t>.</w:t>
+      </w:r>
+    </w:p>
+    <w:p>
+      <w:pPr>
+        <w:pStyle w:val="a7"/>
+        <w:ind w:left="785" w:firstLine="0"/>
+        <w:rPr>
+          <w:lang w:val="ru-RU"/>
+        </w:rPr>
+      </w:pPr>
+    </w:p>
+    <w:p>
+      <w:pPr>
+        <w:pStyle w:val="a7"/>
+        <w:ind w:left="785" w:firstLine="0"/>
         <w:rPr>
           <w:lang w:val="ru-RU"/>
         </w:rPr>
@@ -9181,14 +11089,27 @@
       <w:r>
         <w:t xml:space="preserve">Рис. </w:t>
       </w:r>
-      <w:fldSimple w:instr=" SEQ Рис. \* ARABIC ">
-        <w:r>
-          <w:rPr>
-            <w:noProof/>
-          </w:rPr>
-          <w:t>46</w:t>
-        </w:r>
-      </w:fldSimple>
+      <w:r>
+        <w:fldChar w:fldCharType="begin"/>
+      </w:r>
+      <w:r>
+        <w:instrText xml:space="preserve"> SEQ Рис. \* ARABIC </w:instrText>
+      </w:r>
+      <w:r>
+        <w:fldChar w:fldCharType="separate"/>
+      </w:r>
+      <w:r>
+        <w:rPr>
+          <w:noProof/>
+        </w:rPr>
+        <w:t>46</w:t>
+      </w:r>
+      <w:r>
+        <w:rPr>
+          <w:noProof/>
+        </w:rPr>
+        <w:fldChar w:fldCharType="end"/>
+      </w:r>
       <w:r>
         <w:rPr>
           <w:lang w:val="ru-RU"/>
@@ -9240,6 +11161,15 @@
         </w:rPr>
         <w:t>).</w:t>
       </w:r>
+    </w:p>
+    <w:p>
+      <w:pPr>
+        <w:pStyle w:val="a7"/>
+        <w:ind w:left="785" w:firstLine="0"/>
+        <w:rPr>
+          <w:lang w:val="ru-RU"/>
+        </w:rPr>
+      </w:pPr>
     </w:p>
     <w:p>
       <w:pPr>
@@ -9251,7 +11181,6 @@
           <w:noProof/>
           <w:lang w:val="ru-RU"/>
         </w:rPr>
-        <w:lastRenderedPageBreak/>
         <w:drawing>
           <wp:inline distT="0" distB="0" distL="0" distR="0">
             <wp:extent cx="5380490" cy="2788209"/>
@@ -9305,14 +11234,27 @@
       <w:r>
         <w:t xml:space="preserve">Рис. </w:t>
       </w:r>
-      <w:fldSimple w:instr=" SEQ Рис. \* ARABIC ">
-        <w:r>
-          <w:rPr>
-            <w:noProof/>
-          </w:rPr>
-          <w:t>47</w:t>
-        </w:r>
-      </w:fldSimple>
+      <w:r>
+        <w:fldChar w:fldCharType="begin"/>
+      </w:r>
+      <w:r>
+        <w:instrText xml:space="preserve"> SEQ Рис. \* ARABIC </w:instrText>
+      </w:r>
+      <w:r>
+        <w:fldChar w:fldCharType="separate"/>
+      </w:r>
+      <w:r>
+        <w:rPr>
+          <w:noProof/>
+        </w:rPr>
+        <w:t>47</w:t>
+      </w:r>
+      <w:r>
+        <w:rPr>
+          <w:noProof/>
+        </w:rPr>
+        <w:fldChar w:fldCharType="end"/>
+      </w:r>
       <w:r>
         <w:rPr>
           <w:lang w:val="ru-RU"/>
@@ -9322,11 +11264,19 @@
     </w:p>
     <w:p>
       <w:pPr>
+        <w:spacing w:after="160" w:line="278" w:lineRule="auto"/>
         <w:ind w:firstLine="0"/>
-        <w:rPr>
-          <w:lang w:val="ru-RU"/>
-        </w:rPr>
-      </w:pPr>
+        <w:jc w:val="left"/>
+        <w:rPr>
+          <w:lang w:val="ru-RU"/>
+        </w:rPr>
+      </w:pPr>
+      <w:r>
+        <w:rPr>
+          <w:lang w:val="ru-RU"/>
+        </w:rPr>
+        <w:br w:type="page"/>
+      </w:r>
     </w:p>
     <w:p>
       <w:pPr>
@@ -9340,6 +11290,7 @@
         <w:rPr>
           <w:lang w:val="ru-RU"/>
         </w:rPr>
+        <w:lastRenderedPageBreak/>
         <w:t>Контрольные вопросы</w:t>
       </w:r>
     </w:p>
@@ -11116,7 +13067,7 @@
   <w:abstractNum w:abstractNumId="4" w15:restartNumberingAfterBreak="0">
     <w:nsid w:val="6B8B14DE"/>
     <w:multiLevelType w:val="hybridMultilevel"/>
-    <w:tmpl w:val="6F7EC972"/>
+    <w:tmpl w:val="01C0618A"/>
     <w:lvl w:ilvl="0" w:tplc="B3E0058E">
       <w:start w:val="1"/>
       <w:numFmt w:val="decimal"/>
@@ -11199,6 +13150,122 @@
       <w:lvlJc w:val="right"/>
       <w:pPr>
         <w:ind w:left="6545" w:hanging="180"/>
+      </w:pPr>
+    </w:lvl>
+  </w:abstractNum>
+  <w:abstractNum w:abstractNumId="5" w15:restartNumberingAfterBreak="0">
+    <w:nsid w:val="70425944"/>
+    <w:multiLevelType w:val="hybridMultilevel"/>
+    <w:tmpl w:val="068A34F4"/>
+    <w:lvl w:ilvl="0" w:tplc="0409000F">
+      <w:start w:val="1"/>
+      <w:numFmt w:val="decimal"/>
+      <w:lvlText w:val="%1."/>
+      <w:lvlJc w:val="left"/>
+      <w:pPr>
+        <w:tabs>
+          <w:tab w:val="num" w:pos="720"/>
+        </w:tabs>
+        <w:ind w:left="720" w:hanging="360"/>
+      </w:pPr>
+      <w:rPr>
+        <w:rFonts w:hint="default"/>
+      </w:rPr>
+    </w:lvl>
+    <w:lvl w:ilvl="1" w:tplc="04090019" w:tentative="1">
+      <w:start w:val="1"/>
+      <w:numFmt w:val="lowerLetter"/>
+      <w:lvlText w:val="%2."/>
+      <w:lvlJc w:val="left"/>
+      <w:pPr>
+        <w:tabs>
+          <w:tab w:val="num" w:pos="1440"/>
+        </w:tabs>
+        <w:ind w:left="1440" w:hanging="360"/>
+      </w:pPr>
+    </w:lvl>
+    <w:lvl w:ilvl="2" w:tplc="0409001B" w:tentative="1">
+      <w:start w:val="1"/>
+      <w:numFmt w:val="lowerRoman"/>
+      <w:lvlText w:val="%3."/>
+      <w:lvlJc w:val="right"/>
+      <w:pPr>
+        <w:tabs>
+          <w:tab w:val="num" w:pos="2160"/>
+        </w:tabs>
+        <w:ind w:left="2160" w:hanging="180"/>
+      </w:pPr>
+    </w:lvl>
+    <w:lvl w:ilvl="3" w:tplc="0409000F" w:tentative="1">
+      <w:start w:val="1"/>
+      <w:numFmt w:val="decimal"/>
+      <w:lvlText w:val="%4."/>
+      <w:lvlJc w:val="left"/>
+      <w:pPr>
+        <w:tabs>
+          <w:tab w:val="num" w:pos="2880"/>
+        </w:tabs>
+        <w:ind w:left="2880" w:hanging="360"/>
+      </w:pPr>
+    </w:lvl>
+    <w:lvl w:ilvl="4" w:tplc="04090019" w:tentative="1">
+      <w:start w:val="1"/>
+      <w:numFmt w:val="lowerLetter"/>
+      <w:lvlText w:val="%5."/>
+      <w:lvlJc w:val="left"/>
+      <w:pPr>
+        <w:tabs>
+          <w:tab w:val="num" w:pos="3600"/>
+        </w:tabs>
+        <w:ind w:left="3600" w:hanging="360"/>
+      </w:pPr>
+    </w:lvl>
+    <w:lvl w:ilvl="5" w:tplc="0409001B" w:tentative="1">
+      <w:start w:val="1"/>
+      <w:numFmt w:val="lowerRoman"/>
+      <w:lvlText w:val="%6."/>
+      <w:lvlJc w:val="right"/>
+      <w:pPr>
+        <w:tabs>
+          <w:tab w:val="num" w:pos="4320"/>
+        </w:tabs>
+        <w:ind w:left="4320" w:hanging="180"/>
+      </w:pPr>
+    </w:lvl>
+    <w:lvl w:ilvl="6" w:tplc="0409000F" w:tentative="1">
+      <w:start w:val="1"/>
+      <w:numFmt w:val="decimal"/>
+      <w:lvlText w:val="%7."/>
+      <w:lvlJc w:val="left"/>
+      <w:pPr>
+        <w:tabs>
+          <w:tab w:val="num" w:pos="5040"/>
+        </w:tabs>
+        <w:ind w:left="5040" w:hanging="360"/>
+      </w:pPr>
+    </w:lvl>
+    <w:lvl w:ilvl="7" w:tplc="04090019" w:tentative="1">
+      <w:start w:val="1"/>
+      <w:numFmt w:val="lowerLetter"/>
+      <w:lvlText w:val="%8."/>
+      <w:lvlJc w:val="left"/>
+      <w:pPr>
+        <w:tabs>
+          <w:tab w:val="num" w:pos="5760"/>
+        </w:tabs>
+        <w:ind w:left="5760" w:hanging="360"/>
+      </w:pPr>
+    </w:lvl>
+    <w:lvl w:ilvl="8" w:tplc="0409001B" w:tentative="1">
+      <w:start w:val="1"/>
+      <w:numFmt w:val="lowerRoman"/>
+      <w:lvlText w:val="%9."/>
+      <w:lvlJc w:val="right"/>
+      <w:pPr>
+        <w:tabs>
+          <w:tab w:val="num" w:pos="6480"/>
+        </w:tabs>
+        <w:ind w:left="6480" w:hanging="180"/>
       </w:pPr>
     </w:lvl>
   </w:abstractNum>
@@ -11216,6 +13283,9 @@
   </w:num>
   <w:num w:numId="5" w16cid:durableId="541984091">
     <w:abstractNumId w:val="1"/>
+  </w:num>
+  <w:num w:numId="6" w16cid:durableId="1015613506">
+    <w:abstractNumId w:val="5"/>
   </w:num>
 </w:numbering>
 </file>
@@ -12239,6 +14309,24 @@
     <w:unhideWhenUsed/>
     <w:rsid w:val="00E575E6"/>
   </w:style>
+  <w:style w:type="paragraph" w:customStyle="1" w:styleId="Normal">
+    <w:name w:val="Normal"/>
+    <w:rsid w:val="00BE3FF9"/>
+    <w:pPr>
+      <w:spacing w:after="0" w:line="240" w:lineRule="auto"/>
+      <w:ind w:firstLine="425"/>
+      <w:jc w:val="both"/>
+    </w:pPr>
+    <w:rPr>
+      <w:rFonts w:ascii="Times New Roman" w:eastAsia="Times New Roman" w:hAnsi="Times New Roman" w:cs="Times New Roman"/>
+      <w:snapToGrid w:val="0"/>
+      <w:kern w:val="0"/>
+      <w:sz w:val="20"/>
+      <w:szCs w:val="20"/>
+      <w:lang w:val="ru-RU" w:eastAsia="ru-RU"/>
+      <w14:ligatures w14:val="none"/>
+    </w:rPr>
+  </w:style>
 </w:styles>
 </file>
 

</xml_diff>

<commit_message>
vault backup: 2025-12-22 13:02:11
</commit_message>
<xml_diff>
--- a/Курс 3/Базы данных/Лабораторные/02. Физическая организация файлов баз данных/Отчёт 2.docx
+++ b/Курс 3/Базы данных/Лабораторные/02. Физическая организация файлов баз данных/Отчёт 2.docx
@@ -1,6 +1,6 @@
 
 <file path=word/document.xml><?xml version="1.0" encoding="utf-8"?>
-<w:document xmlns:wpc="http://schemas.microsoft.com/office/word/2010/wordprocessingCanvas" xmlns:cx="http://schemas.microsoft.com/office/drawing/2014/chartex" xmlns:cx1="http://schemas.microsoft.com/office/drawing/2015/9/8/chartex" xmlns:cx2="http://schemas.microsoft.com/office/drawing/2015/10/21/chartex" xmlns:cx3="http://schemas.microsoft.com/office/drawing/2016/5/9/chartex" xmlns:cx4="http://schemas.microsoft.com/office/drawing/2016/5/10/chartex" xmlns:cx5="http://schemas.microsoft.com/office/drawing/2016/5/11/chartex" xmlns:cx6="http://schemas.microsoft.com/office/drawing/2016/5/12/chartex" xmlns:cx7="http://schemas.microsoft.com/office/drawing/2016/5/13/chartex" xmlns:cx8="http://schemas.microsoft.com/office/drawing/2016/5/14/chartex" xmlns:mc="http://schemas.openxmlformats.org/markup-compatibility/2006" xmlns:aink="http://schemas.microsoft.com/office/drawing/2016/ink" xmlns:am3d="http://schemas.microsoft.com/office/drawing/2017/model3d" xmlns:o="urn:schemas-microsoft-com:office:office" xmlns:oel="http://schemas.microsoft.com/office/2019/extlst" xmlns:r="http://schemas.openxmlformats.org/officeDocument/2006/relationships" xmlns:m="http://schemas.openxmlformats.org/officeDocument/2006/math" xmlns:v="urn:schemas-microsoft-com:vml" xmlns:wp14="http://schemas.microsoft.com/office/word/2010/wordprocessingDrawing" xmlns:wp="http://schemas.openxmlformats.org/drawingml/2006/wordprocessingDrawing" xmlns:w10="urn:schemas-microsoft-com:office:word" xmlns:w="http://schemas.openxmlformats.org/wordprocessingml/2006/main" xmlns:w14="http://schemas.microsoft.com/office/word/2010/wordml" xmlns:w15="http://schemas.microsoft.com/office/word/2012/wordml" xmlns:w16cex="http://schemas.microsoft.com/office/word/2018/wordml/cex" xmlns:w16cid="http://schemas.microsoft.com/office/word/2016/wordml/cid" xmlns:w16="http://schemas.microsoft.com/office/word/2018/wordml" xmlns:w16du="http://schemas.microsoft.com/office/word/2023/wordml/word16du" xmlns:w16sdtdh="http://schemas.microsoft.com/office/word/2020/wordml/sdtdatahash" xmlns:w16sdtfl="http://schemas.microsoft.com/office/word/2024/wordml/sdtformatlock" xmlns:w16se="http://schemas.microsoft.com/office/word/2015/wordml/symex" xmlns:wpg="http://schemas.microsoft.com/office/word/2010/wordprocessingGroup" xmlns:wpi="http://schemas.microsoft.com/office/word/2010/wordprocessingInk" xmlns:wne="http://schemas.microsoft.com/office/word/2006/wordml" xmlns:wps="http://schemas.microsoft.com/office/word/2010/wordprocessingShape" mc:Ignorable="w14 w15 w16se w16cid w16 w16cex w16sdtdh w16sdtfl w16du wp14">
+<w:document xmlns:wpc="http://schemas.microsoft.com/office/word/2010/wordprocessingCanvas" xmlns:cx="http://schemas.microsoft.com/office/drawing/2014/chartex" xmlns:mc="http://schemas.openxmlformats.org/markup-compatibility/2006" xmlns:o="urn:schemas-microsoft-com:office:office" xmlns:r="http://schemas.openxmlformats.org/officeDocument/2006/relationships" xmlns:m="http://schemas.openxmlformats.org/officeDocument/2006/math" xmlns:v="urn:schemas-microsoft-com:vml" xmlns:wp14="http://schemas.microsoft.com/office/word/2010/wordprocessingDrawing" xmlns:wp="http://schemas.openxmlformats.org/drawingml/2006/wordprocessingDrawing" xmlns:w10="urn:schemas-microsoft-com:office:word" xmlns:w="http://schemas.openxmlformats.org/wordprocessingml/2006/main" xmlns:w14="http://schemas.microsoft.com/office/word/2010/wordml" xmlns:w15="http://schemas.microsoft.com/office/word/2012/wordml" xmlns:w16se="http://schemas.microsoft.com/office/word/2015/wordml/symex" xmlns:wpg="http://schemas.microsoft.com/office/word/2010/wordprocessingGroup" xmlns:wpi="http://schemas.microsoft.com/office/word/2010/wordprocessingInk" xmlns:wne="http://schemas.microsoft.com/office/word/2006/wordml" xmlns:wps="http://schemas.microsoft.com/office/word/2010/wordprocessingShape" mc:Ignorable="w14 w15 w16se wp14">
   <w:body>
     <w:p>
       <w:pPr>
@@ -635,7 +635,6 @@
         <w:tab/>
         <w:t xml:space="preserve">                       доцент, к.т.н. </w:t>
       </w:r>
-      <w:proofErr w:type="spellStart"/>
       <w:r>
         <w:rPr>
           <w:rFonts w:eastAsia="Times New Roman" w:cs="Times New Roman"/>
@@ -648,7 +647,6 @@
         </w:rPr>
         <w:t>Селяничев</w:t>
       </w:r>
-      <w:proofErr w:type="spellEnd"/>
       <w:r>
         <w:rPr>
           <w:rFonts w:eastAsia="Times New Roman" w:cs="Times New Roman"/>
@@ -1003,7 +1001,7 @@
       <w:r>
         <w:rPr>
           <w:noProof/>
-          <w:lang w:val="ru-RU"/>
+          <w:lang w:val="ru-RU" w:eastAsia="ru-RU"/>
         </w:rPr>
         <w:drawing>
           <wp:inline distT="0" distB="0" distL="0" distR="0">
@@ -1096,7 +1094,7 @@
       <w:r>
         <w:rPr>
           <w:noProof/>
-          <w:lang w:val="ru-RU"/>
+          <w:lang w:val="ru-RU" w:eastAsia="ru-RU"/>
         </w:rPr>
         <w:drawing>
           <wp:inline distT="0" distB="0" distL="0" distR="0">
@@ -1221,7 +1219,25 @@
         <w:rPr>
           <w:lang w:val="ru-RU"/>
         </w:rPr>
-        <w:t xml:space="preserve">открылась в полный экран, необходимо нажать комбинацию клавиш </w:t>
+        <w:t>открылась в режиме полного</w:t>
+      </w:r>
+      <w:r>
+        <w:rPr>
+          <w:lang w:val="ru-RU"/>
+        </w:rPr>
+        <w:t xml:space="preserve"> экран</w:t>
+      </w:r>
+      <w:r>
+        <w:rPr>
+          <w:lang w:val="ru-RU"/>
+        </w:rPr>
+        <w:t>а</w:t>
+      </w:r>
+      <w:r>
+        <w:rPr>
+          <w:lang w:val="ru-RU"/>
+        </w:rPr>
+        <w:t xml:space="preserve">, необходимо нажать комбинацию клавиш </w:t>
       </w:r>
       <w:r>
         <w:rPr>
@@ -1287,9 +1303,20 @@
         <w:rPr>
           <w:lang w:val="ru-RU"/>
         </w:rPr>
-        <w:t xml:space="preserve">можно изменить параметр </w:t>
-      </w:r>
-      <w:proofErr w:type="spellStart"/>
+        <w:t>можно изменить параметр</w:t>
+      </w:r>
+      <w:r>
+        <w:rPr>
+          <w:lang w:val="ru-RU"/>
+        </w:rPr>
+        <w:t>ы</w:t>
+      </w:r>
+      <w:r>
+        <w:rPr>
+          <w:lang w:val="ru-RU"/>
+        </w:rPr>
+        <w:t xml:space="preserve"> </w:t>
+      </w:r>
       <w:r>
         <w:rPr>
           <w:i/>
@@ -1298,7 +1325,6 @@
         </w:rPr>
         <w:t>fullresolution</w:t>
       </w:r>
-      <w:proofErr w:type="spellEnd"/>
       <w:r>
         <w:rPr>
           <w:lang w:val="ru-RU"/>
@@ -1327,7 +1353,6 @@
         </w:rPr>
         <w:t xml:space="preserve">и </w:t>
       </w:r>
-      <w:proofErr w:type="spellStart"/>
       <w:r>
         <w:rPr>
           <w:i/>
@@ -1336,14 +1361,12 @@
         </w:rPr>
         <w:t>output</w:t>
       </w:r>
-      <w:proofErr w:type="spellEnd"/>
       <w:r>
         <w:rPr>
           <w:lang w:val="ru-RU"/>
         </w:rPr>
         <w:t xml:space="preserve"> на </w:t>
       </w:r>
-      <w:proofErr w:type="spellStart"/>
       <w:r>
         <w:rPr>
           <w:i/>
@@ -1352,7 +1375,6 @@
         </w:rPr>
         <w:t>openglnb</w:t>
       </w:r>
-      <w:proofErr w:type="spellEnd"/>
       <w:r>
         <w:rPr>
           <w:lang w:val="ru-RU"/>
@@ -1430,7 +1452,7 @@
       <w:r>
         <w:rPr>
           <w:noProof/>
-          <w:lang w:val="ru-RU"/>
+          <w:lang w:val="ru-RU" w:eastAsia="ru-RU"/>
         </w:rPr>
         <w:drawing>
           <wp:inline distT="0" distB="0" distL="0" distR="0">
@@ -1614,7 +1636,7 @@
       <w:r>
         <w:rPr>
           <w:noProof/>
-          <w:lang w:val="ru-RU"/>
+          <w:lang w:val="ru-RU" w:eastAsia="ru-RU"/>
         </w:rPr>
         <w:drawing>
           <wp:inline distT="0" distB="0" distL="0" distR="0">
@@ -1707,7 +1729,7 @@
       <w:r>
         <w:rPr>
           <w:noProof/>
-          <w:lang w:val="ru-RU"/>
+          <w:lang w:val="ru-RU" w:eastAsia="ru-RU"/>
         </w:rPr>
         <w:lastRenderedPageBreak/>
         <w:drawing>
@@ -1817,6 +1839,33 @@
         </w:rPr>
         <w:t>В квадратных скобках написаны опциональные параметры, а в угловых скобках – позиция параметров.</w:t>
       </w:r>
+      <w:r>
+        <w:rPr>
+          <w:lang w:val="ru-RU"/>
+        </w:rPr>
+        <w:t xml:space="preserve"> </w:t>
+      </w:r>
+    </w:p>
+    <w:p>
+      <w:pPr>
+        <w:pStyle w:val="a7"/>
+        <w:ind w:left="785" w:firstLine="0"/>
+        <w:rPr>
+          <w:lang w:val="ru-RU"/>
+        </w:rPr>
+      </w:pPr>
+      <w:r>
+        <w:rPr>
+          <w:lang w:val="ru-RU"/>
+        </w:rPr>
+        <w:t>Каждая команда в Ребус начинается с символа точки. Это указывает программе на начало новой команды.</w:t>
+      </w:r>
+      <w:r>
+        <w:rPr>
+          <w:lang w:val="ru-RU"/>
+        </w:rPr>
+        <w:t xml:space="preserve"> При этом названия команд можно писать не целиком, а лишь первые символы (при учёте того что команду можно дополнить однозначно).</w:t>
+      </w:r>
     </w:p>
     <w:p>
       <w:pPr>
@@ -1979,6 +2028,176 @@
           <w:lang w:val="ru-RU"/>
         </w:rPr>
       </w:pPr>
+    </w:p>
+    <w:p>
+      <w:pPr>
+        <w:pStyle w:val="a7"/>
+        <w:ind w:left="785" w:firstLine="0"/>
+        <w:rPr>
+          <w:color w:val="000000" w:themeColor="text1"/>
+          <w:lang w:val="ru-RU"/>
+        </w:rPr>
+      </w:pPr>
+      <w:r>
+        <w:rPr>
+          <w:color w:val="000000" w:themeColor="text1"/>
+          <w:lang w:val="ru-RU"/>
+        </w:rPr>
+        <w:t xml:space="preserve">Для просмотра списка </w:t>
+      </w:r>
+      <w:r>
+        <w:rPr>
+          <w:color w:val="000000" w:themeColor="text1"/>
+          <w:lang w:val="ru-RU"/>
+        </w:rPr>
+        <w:t>.</w:t>
+      </w:r>
+      <w:r>
+        <w:rPr>
+          <w:color w:val="000000" w:themeColor="text1"/>
+          <w:lang w:val="en-US"/>
+        </w:rPr>
+        <w:t>dbf</w:t>
+      </w:r>
+      <w:r>
+        <w:rPr>
+          <w:color w:val="000000" w:themeColor="text1"/>
+          <w:lang w:val="ru-RU"/>
+        </w:rPr>
+        <w:t xml:space="preserve"> </w:t>
+      </w:r>
+      <w:r>
+        <w:rPr>
+          <w:color w:val="000000" w:themeColor="text1"/>
+          <w:lang w:val="ru-RU"/>
+        </w:rPr>
+        <w:t xml:space="preserve">файлов в текущей директории используется команда </w:t>
+      </w:r>
+      <w:r>
+        <w:rPr>
+          <w:color w:val="000000" w:themeColor="text1"/>
+          <w:lang w:val="ru-RU"/>
+        </w:rPr>
+        <w:t>.</w:t>
+      </w:r>
+      <w:r>
+        <w:rPr>
+          <w:color w:val="000000" w:themeColor="text1"/>
+          <w:lang w:val="en-US"/>
+        </w:rPr>
+        <w:t>dir</w:t>
+      </w:r>
+      <w:r>
+        <w:rPr>
+          <w:color w:val="000000" w:themeColor="text1"/>
+          <w:lang w:val="ru-RU"/>
+        </w:rPr>
+        <w:t xml:space="preserve">. Команда схожа с командой </w:t>
+      </w:r>
+      <w:r>
+        <w:rPr>
+          <w:color w:val="000000" w:themeColor="text1"/>
+          <w:lang w:val="en-US"/>
+        </w:rPr>
+        <w:t>dir</w:t>
+      </w:r>
+      <w:r>
+        <w:rPr>
+          <w:color w:val="000000" w:themeColor="text1"/>
+          <w:lang w:val="ru-RU"/>
+        </w:rPr>
+        <w:t xml:space="preserve"> </w:t>
+      </w:r>
+      <w:r>
+        <w:rPr>
+          <w:color w:val="000000" w:themeColor="text1"/>
+          <w:lang w:val="ru-RU"/>
+        </w:rPr>
+        <w:t xml:space="preserve">в </w:t>
+      </w:r>
+      <w:r>
+        <w:rPr>
+          <w:color w:val="000000" w:themeColor="text1"/>
+          <w:lang w:val="en-US"/>
+        </w:rPr>
+        <w:t>MS</w:t>
+      </w:r>
+      <w:r>
+        <w:rPr>
+          <w:color w:val="000000" w:themeColor="text1"/>
+          <w:lang w:val="ru-RU"/>
+        </w:rPr>
+        <w:t>-</w:t>
+      </w:r>
+      <w:r>
+        <w:rPr>
+          <w:color w:val="000000" w:themeColor="text1"/>
+          <w:lang w:val="en-US"/>
+        </w:rPr>
+        <w:t>DOS</w:t>
+      </w:r>
+      <w:r>
+        <w:rPr>
+          <w:color w:val="000000" w:themeColor="text1"/>
+          <w:lang w:val="ru-RU"/>
+        </w:rPr>
+        <w:t xml:space="preserve">, но как и сказано ранее она отображает лишь файлы, поддерживаемые СУБД, когда как команда </w:t>
+      </w:r>
+      <w:r>
+        <w:rPr>
+          <w:color w:val="000000" w:themeColor="text1"/>
+          <w:lang w:val="en-US"/>
+        </w:rPr>
+        <w:t>MS</w:t>
+      </w:r>
+      <w:r>
+        <w:rPr>
+          <w:color w:val="000000" w:themeColor="text1"/>
+          <w:lang w:val="ru-RU"/>
+        </w:rPr>
+        <w:t>-</w:t>
+      </w:r>
+      <w:r>
+        <w:rPr>
+          <w:color w:val="000000" w:themeColor="text1"/>
+          <w:lang w:val="en-US"/>
+        </w:rPr>
+        <w:t>DOS</w:t>
+      </w:r>
+      <w:r>
+        <w:rPr>
+          <w:color w:val="000000" w:themeColor="text1"/>
+          <w:lang w:val="ru-RU"/>
+        </w:rPr>
+        <w:t xml:space="preserve"> </w:t>
+      </w:r>
+      <w:r>
+        <w:rPr>
+          <w:color w:val="000000" w:themeColor="text1"/>
+          <w:lang w:val="ru-RU"/>
+        </w:rPr>
+        <w:t>выводит список всех файлов.</w:t>
+      </w:r>
+    </w:p>
+    <w:p>
+      <w:pPr>
+        <w:pStyle w:val="a7"/>
+        <w:ind w:left="785" w:firstLine="0"/>
+        <w:rPr>
+          <w:color w:val="000000" w:themeColor="text1"/>
+          <w:lang w:val="ru-RU"/>
+        </w:rPr>
+      </w:pPr>
+    </w:p>
+    <w:p>
+      <w:pPr>
+        <w:pStyle w:val="a7"/>
+        <w:ind w:left="785" w:firstLine="0"/>
+        <w:rPr>
+          <w:color w:val="000000" w:themeColor="text1"/>
+          <w:lang w:val="ru-RU"/>
+        </w:rPr>
+      </w:pPr>
       <w:r>
         <w:rPr>
           <w:color w:val="000000" w:themeColor="text1"/>
@@ -2043,7 +2262,7 @@
         <w:rPr>
           <w:noProof/>
           <w:color w:val="000000" w:themeColor="text1"/>
-          <w:lang w:val="ru-RU"/>
+          <w:lang w:val="ru-RU" w:eastAsia="ru-RU"/>
         </w:rPr>
         <w:lastRenderedPageBreak/>
         <w:drawing>
@@ -2207,7 +2426,7 @@
         <w:rPr>
           <w:noProof/>
           <w:color w:val="000000" w:themeColor="text1"/>
-          <w:lang w:val="ru-RU"/>
+          <w:lang w:val="ru-RU" w:eastAsia="ru-RU"/>
         </w:rPr>
         <w:drawing>
           <wp:inline distT="0" distB="0" distL="0" distR="0">
@@ -2353,7 +2572,7 @@
         <w:rPr>
           <w:noProof/>
           <w:color w:val="000000" w:themeColor="text1"/>
-          <w:lang w:val="ru-RU"/>
+          <w:lang w:val="ru-RU" w:eastAsia="ru-RU"/>
         </w:rPr>
         <w:drawing>
           <wp:inline distT="0" distB="0" distL="0" distR="0">
@@ -2517,7 +2736,7 @@
         <w:rPr>
           <w:noProof/>
           <w:color w:val="000000" w:themeColor="text1"/>
-          <w:lang w:val="ru-RU"/>
+          <w:lang w:val="ru-RU" w:eastAsia="ru-RU"/>
         </w:rPr>
         <w:drawing>
           <wp:inline distT="0" distB="0" distL="0" distR="0" wp14:anchorId="3D8D3915" wp14:editId="6DD3A960">
@@ -2683,7 +2902,7 @@
         <w:rPr>
           <w:noProof/>
           <w:color w:val="000000" w:themeColor="text1"/>
-          <w:lang w:val="ru-RU"/>
+          <w:lang w:val="ru-RU" w:eastAsia="ru-RU"/>
         </w:rPr>
         <w:drawing>
           <wp:inline distT="0" distB="0" distL="0" distR="0">
@@ -2841,7 +3060,7 @@
         <w:rPr>
           <w:noProof/>
           <w:color w:val="000000" w:themeColor="text1"/>
-          <w:lang w:val="ru-RU"/>
+          <w:lang w:val="ru-RU" w:eastAsia="ru-RU"/>
         </w:rPr>
         <w:drawing>
           <wp:inline distT="0" distB="0" distL="0" distR="0">
@@ -2938,7 +3157,7 @@
         <w:rPr>
           <w:noProof/>
           <w:color w:val="000000" w:themeColor="text1"/>
-          <w:lang w:val="en-US"/>
+          <w:lang w:val="ru-RU" w:eastAsia="ru-RU"/>
         </w:rPr>
         <w:drawing>
           <wp:inline distT="0" distB="0" distL="0" distR="0">
@@ -3085,7 +3304,7 @@
         <w:rPr>
           <w:noProof/>
           <w:color w:val="000000" w:themeColor="text1"/>
-          <w:lang w:val="ru-RU"/>
+          <w:lang w:val="ru-RU" w:eastAsia="ru-RU"/>
         </w:rPr>
         <w:drawing>
           <wp:inline distT="0" distB="0" distL="0" distR="0">
@@ -3182,7 +3401,7 @@
         <w:rPr>
           <w:noProof/>
           <w:color w:val="000000" w:themeColor="text1"/>
-          <w:lang w:val="ru-RU"/>
+          <w:lang w:val="ru-RU" w:eastAsia="ru-RU"/>
         </w:rPr>
         <w:drawing>
           <wp:inline distT="0" distB="0" distL="0" distR="0">
@@ -3318,7 +3537,7 @@
         <w:rPr>
           <w:noProof/>
           <w:color w:val="000000" w:themeColor="text1"/>
-          <w:lang w:val="ru-RU"/>
+          <w:lang w:val="ru-RU" w:eastAsia="ru-RU"/>
         </w:rPr>
         <w:drawing>
           <wp:inline distT="0" distB="0" distL="0" distR="0">
@@ -3415,7 +3634,7 @@
         <w:rPr>
           <w:noProof/>
           <w:color w:val="000000" w:themeColor="text1"/>
-          <w:lang w:val="en-US"/>
+          <w:lang w:val="ru-RU" w:eastAsia="ru-RU"/>
         </w:rPr>
         <w:drawing>
           <wp:inline distT="0" distB="0" distL="0" distR="0">
@@ -3564,7 +3783,7 @@
         <w:rPr>
           <w:noProof/>
           <w:color w:val="000000" w:themeColor="text1"/>
-          <w:lang w:val="ru-RU"/>
+          <w:lang w:val="ru-RU" w:eastAsia="ru-RU"/>
         </w:rPr>
         <w:drawing>
           <wp:inline distT="0" distB="0" distL="0" distR="0">
@@ -3724,7 +3943,7 @@
         <w:rPr>
           <w:noProof/>
           <w:color w:val="000000" w:themeColor="text1"/>
-          <w:lang w:val="ru-RU"/>
+          <w:lang w:val="ru-RU" w:eastAsia="ru-RU"/>
         </w:rPr>
         <w:lastRenderedPageBreak/>
         <w:drawing>
@@ -3885,7 +4104,7 @@
         <w:rPr>
           <w:noProof/>
           <w:color w:val="000000" w:themeColor="text1"/>
-          <w:lang w:val="ru-RU"/>
+          <w:lang w:val="ru-RU" w:eastAsia="ru-RU"/>
         </w:rPr>
         <w:drawing>
           <wp:inline distT="0" distB="0" distL="0" distR="0">
@@ -4259,7 +4478,7 @@
         <w:rPr>
           <w:noProof/>
           <w:szCs w:val="28"/>
-          <w:lang w:val="ru-RU"/>
+          <w:lang w:val="ru-RU" w:eastAsia="ru-RU"/>
         </w:rPr>
         <w:lastRenderedPageBreak/>
         <w:drawing>
@@ -4431,7 +4650,7 @@
         <w:rPr>
           <w:noProof/>
           <w:szCs w:val="28"/>
-          <w:lang w:val="ru-RU"/>
+          <w:lang w:val="ru-RU" w:eastAsia="ru-RU"/>
         </w:rPr>
         <w:drawing>
           <wp:inline distT="0" distB="0" distL="0" distR="0">
@@ -4526,7 +4745,7 @@
         <w:rPr>
           <w:noProof/>
           <w:szCs w:val="28"/>
-          <w:lang w:val="ru-RU"/>
+          <w:lang w:val="ru-RU" w:eastAsia="ru-RU"/>
         </w:rPr>
         <w:drawing>
           <wp:inline distT="0" distB="0" distL="0" distR="0">
@@ -4793,7 +5012,7 @@
       <w:r>
         <w:rPr>
           <w:noProof/>
-          <w:lang w:val="ru-RU"/>
+          <w:lang w:val="ru-RU" w:eastAsia="ru-RU"/>
         </w:rPr>
         <w:drawing>
           <wp:inline distT="0" distB="0" distL="0" distR="0">
@@ -4893,14 +5112,7 @@
           <w:szCs w:val="28"/>
           <w:lang w:val="ru-RU"/>
         </w:rPr>
-        <w:t>Задание:</w:t>
-      </w:r>
-      <w:r>
-        <w:rPr>
-          <w:szCs w:val="28"/>
-          <w:lang w:val="ru-RU"/>
-        </w:rPr>
-        <w:t xml:space="preserve"> </w:t>
+        <w:t xml:space="preserve">Задание: </w:t>
       </w:r>
       <w:r>
         <w:rPr>
@@ -4971,7 +5183,7 @@
       <w:r>
         <w:rPr>
           <w:noProof/>
-          <w:lang w:val="ru-RU"/>
+          <w:lang w:val="ru-RU" w:eastAsia="ru-RU"/>
         </w:rPr>
         <w:drawing>
           <wp:inline distT="0" distB="0" distL="0" distR="0">
@@ -5071,14 +5283,7 @@
           <w:szCs w:val="28"/>
           <w:lang w:val="ru-RU"/>
         </w:rPr>
-        <w:t>Задание:</w:t>
-      </w:r>
-      <w:r>
-        <w:rPr>
-          <w:szCs w:val="28"/>
-          <w:lang w:val="ru-RU"/>
-        </w:rPr>
-        <w:t xml:space="preserve"> </w:t>
+        <w:t xml:space="preserve">Задание: </w:t>
       </w:r>
       <w:r>
         <w:rPr>
@@ -5213,7 +5418,7 @@
       <w:r>
         <w:rPr>
           <w:noProof/>
-          <w:lang w:val="ru-RU"/>
+          <w:lang w:val="ru-RU" w:eastAsia="ru-RU"/>
         </w:rPr>
         <w:lastRenderedPageBreak/>
         <w:drawing>
@@ -5390,7 +5595,7 @@
       <w:r>
         <w:rPr>
           <w:noProof/>
-          <w:lang w:val="ru-RU"/>
+          <w:lang w:val="ru-RU" w:eastAsia="ru-RU"/>
         </w:rPr>
         <w:drawing>
           <wp:inline distT="0" distB="0" distL="0" distR="0" wp14:anchorId="12FD4C15" wp14:editId="1A5C7867">
@@ -5729,7 +5934,7 @@
       <w:r>
         <w:rPr>
           <w:noProof/>
-          <w:lang w:val="ru-RU"/>
+          <w:lang w:val="ru-RU" w:eastAsia="ru-RU"/>
         </w:rPr>
         <w:drawing>
           <wp:inline distT="0" distB="0" distL="0" distR="0">
@@ -5894,7 +6099,7 @@
       <w:r>
         <w:rPr>
           <w:noProof/>
-          <w:lang w:val="ru-RU"/>
+          <w:lang w:val="ru-RU" w:eastAsia="ru-RU"/>
         </w:rPr>
         <w:lastRenderedPageBreak/>
         <w:drawing>
@@ -6291,7 +6496,7 @@
       <w:r>
         <w:rPr>
           <w:noProof/>
-          <w:lang w:val="en-US"/>
+          <w:lang w:val="ru-RU" w:eastAsia="ru-RU"/>
         </w:rPr>
         <w:drawing>
           <wp:inline distT="0" distB="0" distL="0" distR="0">
@@ -6428,6 +6633,42 @@
         <w:rPr>
           <w:lang w:val="ru-RU"/>
         </w:rPr>
+        <w:t xml:space="preserve">Индексирование - </w:t>
+      </w:r>
+      <w:r>
+        <w:rPr>
+          <w:lang w:val="ru-RU"/>
+        </w:rPr>
+        <w:t>это создание специальных структур данных (индексов), которые ускоряют поиск, сортировку и фильтрацию данных, работая как оглавление в книге, чтобы СУБД не приходилось сканировать всю таблицу целиком</w:t>
+      </w:r>
+      <w:r>
+        <w:rPr>
+          <w:lang w:val="ru-RU"/>
+        </w:rPr>
+        <w:t>.</w:t>
+      </w:r>
+    </w:p>
+    <w:p>
+      <w:pPr>
+        <w:pStyle w:val="a7"/>
+        <w:ind w:left="785" w:firstLine="0"/>
+        <w:rPr>
+          <w:lang w:val="ru-RU"/>
+        </w:rPr>
+      </w:pPr>
+    </w:p>
+    <w:p>
+      <w:pPr>
+        <w:pStyle w:val="a7"/>
+        <w:ind w:left="785" w:firstLine="0"/>
+        <w:rPr>
+          <w:lang w:val="ru-RU"/>
+        </w:rPr>
+      </w:pPr>
+      <w:r>
+        <w:rPr>
+          <w:lang w:val="ru-RU"/>
+        </w:rPr>
         <w:t>При</w:t>
       </w:r>
       <w:r>
@@ -6577,7 +6818,6 @@
         </w:rPr>
         <w:t>1</w:t>
       </w:r>
-      <w:proofErr w:type="spellStart"/>
       <w:r>
         <w:rPr>
           <w:rFonts w:ascii="Menlo" w:hAnsi="Menlo" w:cs="Menlo"/>
@@ -6587,7 +6827,6 @@
         </w:rPr>
         <w:t>i</w:t>
       </w:r>
-      <w:proofErr w:type="spellEnd"/>
       <w:r>
         <w:rPr>
           <w:rFonts w:cs="Times New Roman"/>
@@ -6823,7 +7062,6 @@
         </w:rPr>
         <w:t>): сформируйте структуру БД из полей разного типа. Исследуйте структуру .</w:t>
       </w:r>
-      <w:proofErr w:type="spellStart"/>
       <w:r>
         <w:rPr>
           <w:szCs w:val="28"/>
@@ -6831,7 +7069,6 @@
         </w:rPr>
         <w:t>dbf</w:t>
       </w:r>
-      <w:proofErr w:type="spellEnd"/>
       <w:r>
         <w:rPr>
           <w:szCs w:val="28"/>
@@ -6924,7 +7161,7 @@
       <w:r>
         <w:rPr>
           <w:noProof/>
-          <w:lang w:val="ru-RU"/>
+          <w:lang w:val="ru-RU" w:eastAsia="ru-RU"/>
         </w:rPr>
         <w:drawing>
           <wp:inline distT="0" distB="0" distL="0" distR="0">
@@ -7071,7 +7308,7 @@
       <w:r>
         <w:rPr>
           <w:noProof/>
-          <w:lang w:val="ru-RU"/>
+          <w:lang w:val="ru-RU" w:eastAsia="ru-RU"/>
         </w:rPr>
         <w:drawing>
           <wp:inline distT="0" distB="0" distL="0" distR="0">
@@ -7492,7 +7729,7 @@
     </w:p>
     <w:p>
       <w:pPr>
-        <w:pStyle w:val="Normal"/>
+        <w:pStyle w:val="11"/>
         <w:numPr>
           <w:ilvl w:val="0"/>
           <w:numId w:val="3"/>
@@ -7507,28 +7744,7 @@
           <w:sz w:val="28"/>
           <w:szCs w:val="28"/>
         </w:rPr>
-        <w:t xml:space="preserve">Задание: </w:t>
-      </w:r>
-      <w:r>
-        <w:rPr>
-          <w:sz w:val="28"/>
-          <w:szCs w:val="28"/>
-        </w:rPr>
-        <w:t>Внесите в БД запись (несколько). Изучите, как записи размещены во внешней памяти.</w:t>
-      </w:r>
-      <w:r>
-        <w:rPr>
-          <w:sz w:val="28"/>
-          <w:szCs w:val="28"/>
-        </w:rPr>
-        <w:t xml:space="preserve"> </w:t>
-      </w:r>
-      <w:r>
-        <w:rPr>
-          <w:sz w:val="28"/>
-          <w:szCs w:val="28"/>
-        </w:rPr>
-        <w:t>(Выполняя задания 3-5, всякий раз исследуйте содержимое соответствующего файла.)</w:t>
+        <w:t>Задание: Внесите в БД запись (несколько). Изучите, как записи размещены во внешней памяти. (Выполняя задания 3-5, всякий раз исследуйте содержимое соответствующего файла.)</w:t>
       </w:r>
     </w:p>
     <w:p>
@@ -7596,7 +7812,7 @@
       <w:r>
         <w:rPr>
           <w:noProof/>
-          <w:lang w:val="ru-RU"/>
+          <w:lang w:val="ru-RU" w:eastAsia="ru-RU"/>
         </w:rPr>
         <w:drawing>
           <wp:inline distT="0" distB="0" distL="0" distR="0">
@@ -7743,7 +7959,7 @@
       <w:r>
         <w:rPr>
           <w:noProof/>
-          <w:lang w:val="ru-RU"/>
+          <w:lang w:val="ru-RU" w:eastAsia="ru-RU"/>
         </w:rPr>
         <w:drawing>
           <wp:inline distT="0" distB="0" distL="0" distR="0">
@@ -8076,7 +8292,7 @@
       <w:r>
         <w:rPr>
           <w:noProof/>
-          <w:lang w:val="ru-RU"/>
+          <w:lang w:val="ru-RU" w:eastAsia="ru-RU"/>
         </w:rPr>
         <w:drawing>
           <wp:inline distT="0" distB="0" distL="0" distR="0">
@@ -8205,7 +8421,7 @@
       <w:r>
         <w:rPr>
           <w:noProof/>
-          <w:lang w:val="ru-RU"/>
+          <w:lang w:val="ru-RU" w:eastAsia="ru-RU"/>
         </w:rPr>
         <w:drawing>
           <wp:inline distT="0" distB="0" distL="0" distR="0">
@@ -8484,7 +8700,7 @@
       <w:r>
         <w:rPr>
           <w:noProof/>
-          <w:lang w:val="ru-RU"/>
+          <w:lang w:val="ru-RU" w:eastAsia="ru-RU"/>
         </w:rPr>
         <w:lastRenderedPageBreak/>
         <w:drawing>
@@ -8764,7 +8980,7 @@
       <w:r>
         <w:rPr>
           <w:noProof/>
-          <w:lang w:val="ru-RU"/>
+          <w:lang w:val="ru-RU" w:eastAsia="ru-RU"/>
         </w:rPr>
         <w:drawing>
           <wp:inline distT="0" distB="0" distL="0" distR="0">
@@ -9031,7 +9247,7 @@
       <w:r>
         <w:rPr>
           <w:noProof/>
-          <w:lang w:val="ru-RU"/>
+          <w:lang w:val="ru-RU" w:eastAsia="ru-RU"/>
         </w:rPr>
         <w:lastRenderedPageBreak/>
         <w:drawing>
@@ -9616,7 +9832,7 @@
       <w:r>
         <w:rPr>
           <w:noProof/>
-          <w:lang w:val="ru-RU"/>
+          <w:lang w:val="ru-RU" w:eastAsia="ru-RU"/>
         </w:rPr>
         <w:drawing>
           <wp:inline distT="0" distB="0" distL="0" distR="0">
@@ -9769,7 +9985,6 @@
         </w:rPr>
         <w:t>: сформируйте структуру таблицы БД из полей разного типа. Исследуйте структуру .</w:t>
       </w:r>
-      <w:proofErr w:type="spellStart"/>
       <w:r>
         <w:rPr>
           <w:szCs w:val="28"/>
@@ -9777,7 +9992,6 @@
         </w:rPr>
         <w:t>mdb</w:t>
       </w:r>
-      <w:proofErr w:type="spellEnd"/>
       <w:r>
         <w:rPr>
           <w:szCs w:val="28"/>
@@ -9880,7 +10094,7 @@
       <w:r>
         <w:rPr>
           <w:noProof/>
-          <w:lang w:val="ru-RU"/>
+          <w:lang w:val="ru-RU" w:eastAsia="ru-RU"/>
         </w:rPr>
         <w:drawing>
           <wp:inline distT="0" distB="0" distL="0" distR="0">
@@ -9989,14 +10203,12 @@
         </w:rPr>
         <w:t>2.</w:t>
       </w:r>
-      <w:proofErr w:type="spellStart"/>
       <w:r>
         <w:rPr>
           <w:lang w:val="en-US"/>
         </w:rPr>
         <w:t>mdb</w:t>
       </w:r>
-      <w:proofErr w:type="spellEnd"/>
       <w:r>
         <w:rPr>
           <w:lang w:val="ru-RU"/>
@@ -10041,7 +10253,7 @@
       <w:r>
         <w:rPr>
           <w:noProof/>
-          <w:lang w:val="ru-RU"/>
+          <w:lang w:val="ru-RU" w:eastAsia="ru-RU"/>
         </w:rPr>
         <w:drawing>
           <wp:inline distT="0" distB="0" distL="0" distR="0">
@@ -10127,21 +10339,7 @@
         <w:rPr>
           <w:lang w:val="en-US"/>
         </w:rPr>
-        <w:t>.</w:t>
-      </w:r>
-      <w:proofErr w:type="spellStart"/>
-      <w:r>
-        <w:rPr>
-          <w:lang w:val="en-US"/>
-        </w:rPr>
-        <w:t>mdb</w:t>
-      </w:r>
-      <w:proofErr w:type="spellEnd"/>
-      <w:r>
-        <w:rPr>
-          <w:lang w:val="en-US"/>
-        </w:rPr>
-        <w:t xml:space="preserve"> </w:t>
+        <w:t xml:space="preserve">.mdb </w:t>
       </w:r>
       <w:r>
         <w:rPr>
@@ -10236,7 +10434,7 @@
       <w:r>
         <w:rPr>
           <w:noProof/>
-          <w:lang w:val="ru-RU"/>
+          <w:lang w:val="ru-RU" w:eastAsia="ru-RU"/>
         </w:rPr>
         <w:drawing>
           <wp:inline distT="0" distB="0" distL="0" distR="0">
@@ -10387,14 +10585,12 @@
         </w:rPr>
         <w:t>.</w:t>
       </w:r>
-      <w:proofErr w:type="spellStart"/>
       <w:r>
         <w:rPr>
           <w:lang w:val="en-US"/>
         </w:rPr>
         <w:t>mdb</w:t>
       </w:r>
-      <w:proofErr w:type="spellEnd"/>
       <w:r>
         <w:rPr>
           <w:lang w:val="ru-RU"/>
@@ -10451,7 +10647,7 @@
       <w:r>
         <w:rPr>
           <w:noProof/>
-          <w:lang w:val="ru-RU"/>
+          <w:lang w:val="ru-RU" w:eastAsia="ru-RU"/>
         </w:rPr>
         <w:lastRenderedPageBreak/>
         <w:drawing>
@@ -10624,7 +10820,7 @@
       <w:r>
         <w:rPr>
           <w:noProof/>
-          <w:lang w:val="ru-RU"/>
+          <w:lang w:val="ru-RU" w:eastAsia="ru-RU"/>
         </w:rPr>
         <w:drawing>
           <wp:inline distT="0" distB="0" distL="0" distR="0">
@@ -10783,7 +10979,7 @@
       <w:r>
         <w:rPr>
           <w:noProof/>
-          <w:lang w:val="ru-RU"/>
+          <w:lang w:val="ru-RU" w:eastAsia="ru-RU"/>
         </w:rPr>
         <w:drawing>
           <wp:inline distT="0" distB="0" distL="0" distR="0">
@@ -11034,7 +11230,7 @@
       <w:r>
         <w:rPr>
           <w:noProof/>
-          <w:lang w:val="ru-RU"/>
+          <w:lang w:val="ru-RU" w:eastAsia="ru-RU"/>
         </w:rPr>
         <w:drawing>
           <wp:inline distT="0" distB="0" distL="0" distR="0">
@@ -11179,7 +11375,7 @@
       <w:r>
         <w:rPr>
           <w:noProof/>
-          <w:lang w:val="ru-RU"/>
+          <w:lang w:val="ru-RU" w:eastAsia="ru-RU"/>
         </w:rPr>
         <w:drawing>
           <wp:inline distT="0" distB="0" distL="0" distR="0">
@@ -11349,6 +11545,92 @@
           <w:lang w:val="ru-RU"/>
         </w:rPr>
         <w:t>(сумма длин полей * количество записей) байт</w:t>
+      </w:r>
+      <w:r>
+        <w:rPr>
+          <w:lang w:val="ru-RU"/>
+        </w:rPr>
+        <w:t>.</w:t>
+      </w:r>
+    </w:p>
+    <w:p>
+      <w:pPr>
+        <w:pStyle w:val="a7"/>
+        <w:ind w:left="785" w:firstLine="0"/>
+        <w:rPr>
+          <w:lang w:val="ru-RU"/>
+        </w:rPr>
+      </w:pPr>
+    </w:p>
+    <w:p>
+      <w:pPr>
+        <w:pStyle w:val="a7"/>
+        <w:ind w:left="785" w:firstLine="0"/>
+        <w:rPr>
+          <w:lang w:val="ru-RU"/>
+        </w:rPr>
+      </w:pPr>
+      <w:bookmarkStart w:id="0" w:name="_GoBack"/>
+      <w:bookmarkEnd w:id="0"/>
+      <w:r>
+        <w:rPr>
+          <w:lang w:val="ru-RU"/>
+        </w:rPr>
+        <w:t xml:space="preserve">Например файл </w:t>
+      </w:r>
+      <w:r>
+        <w:rPr>
+          <w:lang w:val="en-US"/>
+        </w:rPr>
+        <w:t>lab</w:t>
+      </w:r>
+      <w:r>
+        <w:rPr>
+          <w:lang w:val="ru-RU"/>
+        </w:rPr>
+        <w:t>2_</w:t>
+      </w:r>
+      <w:r>
+        <w:rPr>
+          <w:lang w:val="en-US"/>
+        </w:rPr>
+        <w:t>b</w:t>
+      </w:r>
+      <w:r>
+        <w:rPr>
+          <w:lang w:val="ru-RU"/>
+        </w:rPr>
+        <w:t>2.</w:t>
+      </w:r>
+      <w:r>
+        <w:rPr>
+          <w:lang w:val="en-US"/>
+        </w:rPr>
+        <w:t>dbf</w:t>
+      </w:r>
+      <w:r>
+        <w:rPr>
+          <w:lang w:val="ru-RU"/>
+        </w:rPr>
+        <w:t xml:space="preserve"> </w:t>
+      </w:r>
+      <w:r>
+        <w:rPr>
+          <w:lang w:val="ru-RU"/>
+        </w:rPr>
+        <w:t>занимает: 32 + 32*</w:t>
+      </w:r>
+      <w:r>
+        <w:rPr>
+          <w:lang w:val="ru-RU"/>
+        </w:rPr>
+        <w:t xml:space="preserve">6 + 2 + (14+8+1+1+1+1)*5 = 1006 </w:t>
+      </w:r>
+      <w:r>
+        <w:rPr>
+          <w:lang w:val="ru-RU"/>
+        </w:rPr>
+        <w:t>байт</w:t>
       </w:r>
     </w:p>
     <w:p>
@@ -12260,6 +12542,105 @@
     <w:p>
       <w:pPr>
         <w:pStyle w:val="a7"/>
+        <w:keepNext/>
+        <w:ind w:left="785" w:firstLine="0"/>
+        <w:jc w:val="center"/>
+      </w:pPr>
+      <w:r>
+        <w:rPr>
+          <w:noProof/>
+          <w:lang w:val="ru-RU" w:eastAsia="ru-RU"/>
+        </w:rPr>
+        <w:drawing>
+          <wp:inline distT="0" distB="0" distL="0" distR="0" wp14:anchorId="48B819AE" wp14:editId="59BDFA8E">
+            <wp:extent cx="4362450" cy="2836181"/>
+            <wp:effectExtent l="0" t="0" r="0" b="2540"/>
+            <wp:docPr id="1" name="Рисунок 5"/>
+            <wp:cNvGraphicFramePr>
+              <a:graphicFrameLocks xmlns:a="http://schemas.openxmlformats.org/drawingml/2006/main" noChangeAspect="1"/>
+            </wp:cNvGraphicFramePr>
+            <a:graphic xmlns:a="http://schemas.openxmlformats.org/drawingml/2006/main">
+              <a:graphicData uri="http://schemas.openxmlformats.org/drawingml/2006/picture">
+                <pic:pic xmlns:pic="http://schemas.openxmlformats.org/drawingml/2006/picture">
+                  <pic:nvPicPr>
+                    <pic:cNvPr id="423902437" name="Рисунок 423902437"/>
+                    <pic:cNvPicPr/>
+                  </pic:nvPicPr>
+                  <pic:blipFill>
+                    <a:blip r:embed="rId45" cstate="print">
+                      <a:extLst>
+                        <a:ext uri="{28A0092B-C50C-407E-A947-70E740481C1C}">
+                          <a14:useLocalDpi xmlns:a14="http://schemas.microsoft.com/office/drawing/2010/main" val="0"/>
+                        </a:ext>
+                      </a:extLst>
+                    </a:blip>
+                    <a:stretch>
+                      <a:fillRect/>
+                    </a:stretch>
+                  </pic:blipFill>
+                  <pic:spPr>
+                    <a:xfrm>
+                      <a:off x="0" y="0"/>
+                      <a:ext cx="4386686" cy="2851938"/>
+                    </a:xfrm>
+                    <a:prstGeom prst="rect">
+                      <a:avLst/>
+                    </a:prstGeom>
+                  </pic:spPr>
+                </pic:pic>
+              </a:graphicData>
+            </a:graphic>
+          </wp:inline>
+        </w:drawing>
+      </w:r>
+    </w:p>
+    <w:p>
+      <w:pPr>
+        <w:pStyle w:val="ac"/>
+        <w:rPr>
+          <w:lang w:val="ru-RU"/>
+        </w:rPr>
+      </w:pPr>
+      <w:r>
+        <w:t xml:space="preserve">Рис. </w:t>
+      </w:r>
+      <w:r>
+        <w:fldChar w:fldCharType="begin"/>
+      </w:r>
+      <w:r>
+        <w:instrText xml:space="preserve"> SEQ Рис. \* ARABIC </w:instrText>
+      </w:r>
+      <w:r>
+        <w:fldChar w:fldCharType="separate"/>
+      </w:r>
+      <w:r>
+        <w:rPr>
+          <w:noProof/>
+        </w:rPr>
+        <w:t>48</w:t>
+      </w:r>
+      <w:r>
+        <w:fldChar w:fldCharType="end"/>
+      </w:r>
+      <w:r>
+        <w:rPr>
+          <w:lang w:val="ru-RU"/>
+        </w:rPr>
+        <w:t>. Пример структуры файла</w:t>
+      </w:r>
+    </w:p>
+    <w:p>
+      <w:pPr>
+        <w:pStyle w:val="a7"/>
+        <w:ind w:left="785" w:firstLine="0"/>
+        <w:rPr>
+          <w:lang w:val="ru-RU"/>
+        </w:rPr>
+      </w:pPr>
+    </w:p>
+    <w:p>
+      <w:pPr>
+        <w:pStyle w:val="a7"/>
         <w:numPr>
           <w:ilvl w:val="0"/>
           <w:numId w:val="5"/>
@@ -12365,7 +12746,7 @@
 </file>
 
 <file path=word/endnotes.xml><?xml version="1.0" encoding="utf-8"?>
-<w:endnotes xmlns:wpc="http://schemas.microsoft.com/office/word/2010/wordprocessingCanvas" xmlns:cx="http://schemas.microsoft.com/office/drawing/2014/chartex" xmlns:cx1="http://schemas.microsoft.com/office/drawing/2015/9/8/chartex" xmlns:cx2="http://schemas.microsoft.com/office/drawing/2015/10/21/chartex" xmlns:cx3="http://schemas.microsoft.com/office/drawing/2016/5/9/chartex" xmlns:cx4="http://schemas.microsoft.com/office/drawing/2016/5/10/chartex" xmlns:cx5="http://schemas.microsoft.com/office/drawing/2016/5/11/chartex" xmlns:cx6="http://schemas.microsoft.com/office/drawing/2016/5/12/chartex" xmlns:cx7="http://schemas.microsoft.com/office/drawing/2016/5/13/chartex" xmlns:cx8="http://schemas.microsoft.com/office/drawing/2016/5/14/chartex" xmlns:mc="http://schemas.openxmlformats.org/markup-compatibility/2006" xmlns:aink="http://schemas.microsoft.com/office/drawing/2016/ink" xmlns:am3d="http://schemas.microsoft.com/office/drawing/2017/model3d" xmlns:o="urn:schemas-microsoft-com:office:office" xmlns:oel="http://schemas.microsoft.com/office/2019/extlst" xmlns:r="http://schemas.openxmlformats.org/officeDocument/2006/relationships" xmlns:m="http://schemas.openxmlformats.org/officeDocument/2006/math" xmlns:v="urn:schemas-microsoft-com:vml" xmlns:wp14="http://schemas.microsoft.com/office/word/2010/wordprocessingDrawing" xmlns:wp="http://schemas.openxmlformats.org/drawingml/2006/wordprocessingDrawing" xmlns:w10="urn:schemas-microsoft-com:office:word" xmlns:w="http://schemas.openxmlformats.org/wordprocessingml/2006/main" xmlns:w14="http://schemas.microsoft.com/office/word/2010/wordml" xmlns:w15="http://schemas.microsoft.com/office/word/2012/wordml" xmlns:w16cex="http://schemas.microsoft.com/office/word/2018/wordml/cex" xmlns:w16cid="http://schemas.microsoft.com/office/word/2016/wordml/cid" xmlns:w16="http://schemas.microsoft.com/office/word/2018/wordml" xmlns:w16du="http://schemas.microsoft.com/office/word/2023/wordml/word16du" xmlns:w16sdtdh="http://schemas.microsoft.com/office/word/2020/wordml/sdtdatahash" xmlns:w16sdtfl="http://schemas.microsoft.com/office/word/2024/wordml/sdtformatlock" xmlns:w16se="http://schemas.microsoft.com/office/word/2015/wordml/symex" xmlns:wpg="http://schemas.microsoft.com/office/word/2010/wordprocessingGroup" xmlns:wpi="http://schemas.microsoft.com/office/word/2010/wordprocessingInk" xmlns:wne="http://schemas.microsoft.com/office/word/2006/wordml" xmlns:wps="http://schemas.microsoft.com/office/word/2010/wordprocessingShape" mc:Ignorable="w14 w15 w16se w16cid w16 w16cex w16sdtdh w16sdtfl w16du wp14">
+<w:endnotes xmlns:wpc="http://schemas.microsoft.com/office/word/2010/wordprocessingCanvas" xmlns:cx="http://schemas.microsoft.com/office/drawing/2014/chartex" xmlns:mc="http://schemas.openxmlformats.org/markup-compatibility/2006" xmlns:o="urn:schemas-microsoft-com:office:office" xmlns:r="http://schemas.openxmlformats.org/officeDocument/2006/relationships" xmlns:m="http://schemas.openxmlformats.org/officeDocument/2006/math" xmlns:v="urn:schemas-microsoft-com:vml" xmlns:wp14="http://schemas.microsoft.com/office/word/2010/wordprocessingDrawing" xmlns:wp="http://schemas.openxmlformats.org/drawingml/2006/wordprocessingDrawing" xmlns:w10="urn:schemas-microsoft-com:office:word" xmlns:w="http://schemas.openxmlformats.org/wordprocessingml/2006/main" xmlns:w14="http://schemas.microsoft.com/office/word/2010/wordml" xmlns:w15="http://schemas.microsoft.com/office/word/2012/wordml" xmlns:w16se="http://schemas.microsoft.com/office/word/2015/wordml/symex" xmlns:wpg="http://schemas.microsoft.com/office/word/2010/wordprocessingGroup" xmlns:wpi="http://schemas.microsoft.com/office/word/2010/wordprocessingInk" xmlns:wne="http://schemas.microsoft.com/office/word/2006/wordml" xmlns:wps="http://schemas.microsoft.com/office/word/2010/wordprocessingShape" mc:Ignorable="w14 w15 w16se wp14">
   <w:endnote w:type="separator" w:id="-1">
     <w:p>
       <w:r>
@@ -12384,7 +12765,7 @@
 </file>
 
 <file path=word/footer1.xml><?xml version="1.0" encoding="utf-8"?>
-<w:ftr xmlns:wpc="http://schemas.microsoft.com/office/word/2010/wordprocessingCanvas" xmlns:cx="http://schemas.microsoft.com/office/drawing/2014/chartex" xmlns:cx1="http://schemas.microsoft.com/office/drawing/2015/9/8/chartex" xmlns:cx2="http://schemas.microsoft.com/office/drawing/2015/10/21/chartex" xmlns:cx3="http://schemas.microsoft.com/office/drawing/2016/5/9/chartex" xmlns:cx4="http://schemas.microsoft.com/office/drawing/2016/5/10/chartex" xmlns:cx5="http://schemas.microsoft.com/office/drawing/2016/5/11/chartex" xmlns:cx6="http://schemas.microsoft.com/office/drawing/2016/5/12/chartex" xmlns:cx7="http://schemas.microsoft.com/office/drawing/2016/5/13/chartex" xmlns:cx8="http://schemas.microsoft.com/office/drawing/2016/5/14/chartex" xmlns:mc="http://schemas.openxmlformats.org/markup-compatibility/2006" xmlns:aink="http://schemas.microsoft.com/office/drawing/2016/ink" xmlns:am3d="http://schemas.microsoft.com/office/drawing/2017/model3d" xmlns:o="urn:schemas-microsoft-com:office:office" xmlns:oel="http://schemas.microsoft.com/office/2019/extlst" xmlns:r="http://schemas.openxmlformats.org/officeDocument/2006/relationships" xmlns:m="http://schemas.openxmlformats.org/officeDocument/2006/math" xmlns:v="urn:schemas-microsoft-com:vml" xmlns:wp14="http://schemas.microsoft.com/office/word/2010/wordprocessingDrawing" xmlns:wp="http://schemas.openxmlformats.org/drawingml/2006/wordprocessingDrawing" xmlns:w10="urn:schemas-microsoft-com:office:word" xmlns:w="http://schemas.openxmlformats.org/wordprocessingml/2006/main" xmlns:w14="http://schemas.microsoft.com/office/word/2010/wordml" xmlns:w15="http://schemas.microsoft.com/office/word/2012/wordml" xmlns:w16cex="http://schemas.microsoft.com/office/word/2018/wordml/cex" xmlns:w16cid="http://schemas.microsoft.com/office/word/2016/wordml/cid" xmlns:w16="http://schemas.microsoft.com/office/word/2018/wordml" xmlns:w16du="http://schemas.microsoft.com/office/word/2023/wordml/word16du" xmlns:w16sdtdh="http://schemas.microsoft.com/office/word/2020/wordml/sdtdatahash" xmlns:w16sdtfl="http://schemas.microsoft.com/office/word/2024/wordml/sdtformatlock" xmlns:w16se="http://schemas.microsoft.com/office/word/2015/wordml/symex" xmlns:wpg="http://schemas.microsoft.com/office/word/2010/wordprocessingGroup" xmlns:wpi="http://schemas.microsoft.com/office/word/2010/wordprocessingInk" xmlns:wne="http://schemas.microsoft.com/office/word/2006/wordml" xmlns:wps="http://schemas.microsoft.com/office/word/2010/wordprocessingShape" mc:Ignorable="w14 w15 w16se w16cid w16 w16cex w16sdtdh w16sdtfl w16du wp14">
+<w:ftr xmlns:wpc="http://schemas.microsoft.com/office/word/2010/wordprocessingCanvas" xmlns:cx="http://schemas.microsoft.com/office/drawing/2014/chartex" xmlns:mc="http://schemas.openxmlformats.org/markup-compatibility/2006" xmlns:o="urn:schemas-microsoft-com:office:office" xmlns:r="http://schemas.openxmlformats.org/officeDocument/2006/relationships" xmlns:m="http://schemas.openxmlformats.org/officeDocument/2006/math" xmlns:v="urn:schemas-microsoft-com:vml" xmlns:wp14="http://schemas.microsoft.com/office/word/2010/wordprocessingDrawing" xmlns:wp="http://schemas.openxmlformats.org/drawingml/2006/wordprocessingDrawing" xmlns:w10="urn:schemas-microsoft-com:office:word" xmlns:w="http://schemas.openxmlformats.org/wordprocessingml/2006/main" xmlns:w14="http://schemas.microsoft.com/office/word/2010/wordml" xmlns:w15="http://schemas.microsoft.com/office/word/2012/wordml" xmlns:w16se="http://schemas.microsoft.com/office/word/2015/wordml/symex" xmlns:wpg="http://schemas.microsoft.com/office/word/2010/wordprocessingGroup" xmlns:wpi="http://schemas.microsoft.com/office/word/2010/wordprocessingInk" xmlns:wne="http://schemas.microsoft.com/office/word/2006/wordml" xmlns:wps="http://schemas.microsoft.com/office/word/2010/wordprocessingShape" mc:Ignorable="w14 w15 w16se wp14">
   <w:p>
     <w:pPr>
       <w:pStyle w:val="af"/>
@@ -12398,7 +12779,7 @@
 </file>
 
 <file path=word/footer2.xml><?xml version="1.0" encoding="utf-8"?>
-<w:ftr xmlns:wpc="http://schemas.microsoft.com/office/word/2010/wordprocessingCanvas" xmlns:cx="http://schemas.microsoft.com/office/drawing/2014/chartex" xmlns:cx1="http://schemas.microsoft.com/office/drawing/2015/9/8/chartex" xmlns:cx2="http://schemas.microsoft.com/office/drawing/2015/10/21/chartex" xmlns:cx3="http://schemas.microsoft.com/office/drawing/2016/5/9/chartex" xmlns:cx4="http://schemas.microsoft.com/office/drawing/2016/5/10/chartex" xmlns:cx5="http://schemas.microsoft.com/office/drawing/2016/5/11/chartex" xmlns:cx6="http://schemas.microsoft.com/office/drawing/2016/5/12/chartex" xmlns:cx7="http://schemas.microsoft.com/office/drawing/2016/5/13/chartex" xmlns:cx8="http://schemas.microsoft.com/office/drawing/2016/5/14/chartex" xmlns:mc="http://schemas.openxmlformats.org/markup-compatibility/2006" xmlns:aink="http://schemas.microsoft.com/office/drawing/2016/ink" xmlns:am3d="http://schemas.microsoft.com/office/drawing/2017/model3d" xmlns:o="urn:schemas-microsoft-com:office:office" xmlns:oel="http://schemas.microsoft.com/office/2019/extlst" xmlns:r="http://schemas.openxmlformats.org/officeDocument/2006/relationships" xmlns:m="http://schemas.openxmlformats.org/officeDocument/2006/math" xmlns:v="urn:schemas-microsoft-com:vml" xmlns:wp14="http://schemas.microsoft.com/office/word/2010/wordprocessingDrawing" xmlns:wp="http://schemas.openxmlformats.org/drawingml/2006/wordprocessingDrawing" xmlns:w10="urn:schemas-microsoft-com:office:word" xmlns:w="http://schemas.openxmlformats.org/wordprocessingml/2006/main" xmlns:w14="http://schemas.microsoft.com/office/word/2010/wordml" xmlns:w15="http://schemas.microsoft.com/office/word/2012/wordml" xmlns:w16cex="http://schemas.microsoft.com/office/word/2018/wordml/cex" xmlns:w16cid="http://schemas.microsoft.com/office/word/2016/wordml/cid" xmlns:w16="http://schemas.microsoft.com/office/word/2018/wordml" xmlns:w16du="http://schemas.microsoft.com/office/word/2023/wordml/word16du" xmlns:w16sdtdh="http://schemas.microsoft.com/office/word/2020/wordml/sdtdatahash" xmlns:w16sdtfl="http://schemas.microsoft.com/office/word/2024/wordml/sdtformatlock" xmlns:w16se="http://schemas.microsoft.com/office/word/2015/wordml/symex" xmlns:wpg="http://schemas.microsoft.com/office/word/2010/wordprocessingGroup" xmlns:wpi="http://schemas.microsoft.com/office/word/2010/wordprocessingInk" xmlns:wne="http://schemas.microsoft.com/office/word/2006/wordml" xmlns:wps="http://schemas.microsoft.com/office/word/2010/wordprocessingShape" mc:Ignorable="w14 w15 w16se w16cid w16 w16cex w16sdtdh w16sdtfl w16du wp14">
+<w:ftr xmlns:wpc="http://schemas.microsoft.com/office/word/2010/wordprocessingCanvas" xmlns:cx="http://schemas.microsoft.com/office/drawing/2014/chartex" xmlns:mc="http://schemas.openxmlformats.org/markup-compatibility/2006" xmlns:o="urn:schemas-microsoft-com:office:office" xmlns:r="http://schemas.openxmlformats.org/officeDocument/2006/relationships" xmlns:m="http://schemas.openxmlformats.org/officeDocument/2006/math" xmlns:v="urn:schemas-microsoft-com:vml" xmlns:wp14="http://schemas.microsoft.com/office/word/2010/wordprocessingDrawing" xmlns:wp="http://schemas.openxmlformats.org/drawingml/2006/wordprocessingDrawing" xmlns:w10="urn:schemas-microsoft-com:office:word" xmlns:w="http://schemas.openxmlformats.org/wordprocessingml/2006/main" xmlns:w14="http://schemas.microsoft.com/office/word/2010/wordml" xmlns:w15="http://schemas.microsoft.com/office/word/2012/wordml" xmlns:w16se="http://schemas.microsoft.com/office/word/2015/wordml/symex" xmlns:wpg="http://schemas.microsoft.com/office/word/2010/wordprocessingGroup" xmlns:wpi="http://schemas.microsoft.com/office/word/2010/wordprocessingInk" xmlns:wne="http://schemas.microsoft.com/office/word/2006/wordml" xmlns:wps="http://schemas.microsoft.com/office/word/2010/wordprocessingShape" mc:Ignorable="w14 w15 w16se wp14">
   <w:p>
     <w:pPr>
       <w:pStyle w:val="af"/>
@@ -12436,7 +12817,7 @@
 </file>
 
 <file path=word/footnotes.xml><?xml version="1.0" encoding="utf-8"?>
-<w:footnotes xmlns:wpc="http://schemas.microsoft.com/office/word/2010/wordprocessingCanvas" xmlns:cx="http://schemas.microsoft.com/office/drawing/2014/chartex" xmlns:cx1="http://schemas.microsoft.com/office/drawing/2015/9/8/chartex" xmlns:cx2="http://schemas.microsoft.com/office/drawing/2015/10/21/chartex" xmlns:cx3="http://schemas.microsoft.com/office/drawing/2016/5/9/chartex" xmlns:cx4="http://schemas.microsoft.com/office/drawing/2016/5/10/chartex" xmlns:cx5="http://schemas.microsoft.com/office/drawing/2016/5/11/chartex" xmlns:cx6="http://schemas.microsoft.com/office/drawing/2016/5/12/chartex" xmlns:cx7="http://schemas.microsoft.com/office/drawing/2016/5/13/chartex" xmlns:cx8="http://schemas.microsoft.com/office/drawing/2016/5/14/chartex" xmlns:mc="http://schemas.openxmlformats.org/markup-compatibility/2006" xmlns:aink="http://schemas.microsoft.com/office/drawing/2016/ink" xmlns:am3d="http://schemas.microsoft.com/office/drawing/2017/model3d" xmlns:o="urn:schemas-microsoft-com:office:office" xmlns:oel="http://schemas.microsoft.com/office/2019/extlst" xmlns:r="http://schemas.openxmlformats.org/officeDocument/2006/relationships" xmlns:m="http://schemas.openxmlformats.org/officeDocument/2006/math" xmlns:v="urn:schemas-microsoft-com:vml" xmlns:wp14="http://schemas.microsoft.com/office/word/2010/wordprocessingDrawing" xmlns:wp="http://schemas.openxmlformats.org/drawingml/2006/wordprocessingDrawing" xmlns:w10="urn:schemas-microsoft-com:office:word" xmlns:w="http://schemas.openxmlformats.org/wordprocessingml/2006/main" xmlns:w14="http://schemas.microsoft.com/office/word/2010/wordml" xmlns:w15="http://schemas.microsoft.com/office/word/2012/wordml" xmlns:w16cex="http://schemas.microsoft.com/office/word/2018/wordml/cex" xmlns:w16cid="http://schemas.microsoft.com/office/word/2016/wordml/cid" xmlns:w16="http://schemas.microsoft.com/office/word/2018/wordml" xmlns:w16du="http://schemas.microsoft.com/office/word/2023/wordml/word16du" xmlns:w16sdtdh="http://schemas.microsoft.com/office/word/2020/wordml/sdtdatahash" xmlns:w16sdtfl="http://schemas.microsoft.com/office/word/2024/wordml/sdtformatlock" xmlns:w16se="http://schemas.microsoft.com/office/word/2015/wordml/symex" xmlns:wpg="http://schemas.microsoft.com/office/word/2010/wordprocessingGroup" xmlns:wpi="http://schemas.microsoft.com/office/word/2010/wordprocessingInk" xmlns:wne="http://schemas.microsoft.com/office/word/2006/wordml" xmlns:wps="http://schemas.microsoft.com/office/word/2010/wordprocessingShape" mc:Ignorable="w14 w15 w16se w16cid w16 w16cex w16sdtdh w16sdtfl w16du wp14">
+<w:footnotes xmlns:wpc="http://schemas.microsoft.com/office/word/2010/wordprocessingCanvas" xmlns:cx="http://schemas.microsoft.com/office/drawing/2014/chartex" xmlns:mc="http://schemas.openxmlformats.org/markup-compatibility/2006" xmlns:o="urn:schemas-microsoft-com:office:office" xmlns:r="http://schemas.openxmlformats.org/officeDocument/2006/relationships" xmlns:m="http://schemas.openxmlformats.org/officeDocument/2006/math" xmlns:v="urn:schemas-microsoft-com:vml" xmlns:wp14="http://schemas.microsoft.com/office/word/2010/wordprocessingDrawing" xmlns:wp="http://schemas.openxmlformats.org/drawingml/2006/wordprocessingDrawing" xmlns:w10="urn:schemas-microsoft-com:office:word" xmlns:w="http://schemas.openxmlformats.org/wordprocessingml/2006/main" xmlns:w14="http://schemas.microsoft.com/office/word/2010/wordml" xmlns:w15="http://schemas.microsoft.com/office/word/2012/wordml" xmlns:w16se="http://schemas.microsoft.com/office/word/2015/wordml/symex" xmlns:wpg="http://schemas.microsoft.com/office/word/2010/wordprocessingGroup" xmlns:wpi="http://schemas.microsoft.com/office/word/2010/wordprocessingInk" xmlns:wne="http://schemas.microsoft.com/office/word/2006/wordml" xmlns:wps="http://schemas.microsoft.com/office/word/2010/wordprocessingShape" mc:Ignorable="w14 w15 w16se wp14">
   <w:footnote w:type="separator" w:id="-1">
     <w:p>
       <w:r>
@@ -12455,7 +12836,7 @@
 </file>
 
 <file path=word/header1.xml><?xml version="1.0" encoding="utf-8"?>
-<w:hdr xmlns:wpc="http://schemas.microsoft.com/office/word/2010/wordprocessingCanvas" xmlns:cx="http://schemas.microsoft.com/office/drawing/2014/chartex" xmlns:cx1="http://schemas.microsoft.com/office/drawing/2015/9/8/chartex" xmlns:cx2="http://schemas.microsoft.com/office/drawing/2015/10/21/chartex" xmlns:cx3="http://schemas.microsoft.com/office/drawing/2016/5/9/chartex" xmlns:cx4="http://schemas.microsoft.com/office/drawing/2016/5/10/chartex" xmlns:cx5="http://schemas.microsoft.com/office/drawing/2016/5/11/chartex" xmlns:cx6="http://schemas.microsoft.com/office/drawing/2016/5/12/chartex" xmlns:cx7="http://schemas.microsoft.com/office/drawing/2016/5/13/chartex" xmlns:cx8="http://schemas.microsoft.com/office/drawing/2016/5/14/chartex" xmlns:mc="http://schemas.openxmlformats.org/markup-compatibility/2006" xmlns:aink="http://schemas.microsoft.com/office/drawing/2016/ink" xmlns:am3d="http://schemas.microsoft.com/office/drawing/2017/model3d" xmlns:o="urn:schemas-microsoft-com:office:office" xmlns:oel="http://schemas.microsoft.com/office/2019/extlst" xmlns:r="http://schemas.openxmlformats.org/officeDocument/2006/relationships" xmlns:m="http://schemas.openxmlformats.org/officeDocument/2006/math" xmlns:v="urn:schemas-microsoft-com:vml" xmlns:wp14="http://schemas.microsoft.com/office/word/2010/wordprocessingDrawing" xmlns:wp="http://schemas.openxmlformats.org/drawingml/2006/wordprocessingDrawing" xmlns:w10="urn:schemas-microsoft-com:office:word" xmlns:w="http://schemas.openxmlformats.org/wordprocessingml/2006/main" xmlns:w14="http://schemas.microsoft.com/office/word/2010/wordml" xmlns:w15="http://schemas.microsoft.com/office/word/2012/wordml" xmlns:w16cex="http://schemas.microsoft.com/office/word/2018/wordml/cex" xmlns:w16cid="http://schemas.microsoft.com/office/word/2016/wordml/cid" xmlns:w16="http://schemas.microsoft.com/office/word/2018/wordml" xmlns:w16du="http://schemas.microsoft.com/office/word/2023/wordml/word16du" xmlns:w16sdtdh="http://schemas.microsoft.com/office/word/2020/wordml/sdtdatahash" xmlns:w16sdtfl="http://schemas.microsoft.com/office/word/2024/wordml/sdtformatlock" xmlns:w16se="http://schemas.microsoft.com/office/word/2015/wordml/symex" xmlns:wpg="http://schemas.microsoft.com/office/word/2010/wordprocessingGroup" xmlns:wpi="http://schemas.microsoft.com/office/word/2010/wordprocessingInk" xmlns:wne="http://schemas.microsoft.com/office/word/2006/wordml" xmlns:wps="http://schemas.microsoft.com/office/word/2010/wordprocessingShape" mc:Ignorable="w14 w15 w16se w16cid w16 w16cex w16sdtdh w16sdtfl w16du wp14">
+<w:hdr xmlns:wpc="http://schemas.microsoft.com/office/word/2010/wordprocessingCanvas" xmlns:cx="http://schemas.microsoft.com/office/drawing/2014/chartex" xmlns:mc="http://schemas.openxmlformats.org/markup-compatibility/2006" xmlns:o="urn:schemas-microsoft-com:office:office" xmlns:r="http://schemas.openxmlformats.org/officeDocument/2006/relationships" xmlns:m="http://schemas.openxmlformats.org/officeDocument/2006/math" xmlns:v="urn:schemas-microsoft-com:vml" xmlns:wp14="http://schemas.microsoft.com/office/word/2010/wordprocessingDrawing" xmlns:wp="http://schemas.openxmlformats.org/drawingml/2006/wordprocessingDrawing" xmlns:w10="urn:schemas-microsoft-com:office:word" xmlns:w="http://schemas.openxmlformats.org/wordprocessingml/2006/main" xmlns:w14="http://schemas.microsoft.com/office/word/2010/wordml" xmlns:w15="http://schemas.microsoft.com/office/word/2012/wordml" xmlns:w16se="http://schemas.microsoft.com/office/word/2015/wordml/symex" xmlns:wpg="http://schemas.microsoft.com/office/word/2010/wordprocessingGroup" xmlns:wpi="http://schemas.microsoft.com/office/word/2010/wordprocessingInk" xmlns:wne="http://schemas.microsoft.com/office/word/2006/wordml" xmlns:wps="http://schemas.microsoft.com/office/word/2010/wordprocessingShape" mc:Ignorable="w14 w15 w16se wp14">
   <w:sdt>
     <w:sdtPr>
       <w:rPr>
@@ -12467,6 +12848,11 @@
         <w:docPartUnique/>
       </w:docPartObj>
     </w:sdtPr>
+    <w:sdtEndPr>
+      <w:rPr>
+        <w:rStyle w:val="af2"/>
+      </w:rPr>
+    </w:sdtEndPr>
     <w:sdtContent>
       <w:p>
         <w:pPr>
@@ -12492,12 +12878,6 @@
           <w:rPr>
             <w:rStyle w:val="af2"/>
           </w:rPr>
-          <w:fldChar w:fldCharType="separate"/>
-        </w:r>
-        <w:r>
-          <w:rPr>
-            <w:rStyle w:val="af2"/>
-          </w:rPr>
           <w:fldChar w:fldCharType="end"/>
         </w:r>
       </w:p>
@@ -12512,7 +12892,7 @@
 </file>
 
 <file path=word/header2.xml><?xml version="1.0" encoding="utf-8"?>
-<w:hdr xmlns:wpc="http://schemas.microsoft.com/office/word/2010/wordprocessingCanvas" xmlns:cx="http://schemas.microsoft.com/office/drawing/2014/chartex" xmlns:cx1="http://schemas.microsoft.com/office/drawing/2015/9/8/chartex" xmlns:cx2="http://schemas.microsoft.com/office/drawing/2015/10/21/chartex" xmlns:cx3="http://schemas.microsoft.com/office/drawing/2016/5/9/chartex" xmlns:cx4="http://schemas.microsoft.com/office/drawing/2016/5/10/chartex" xmlns:cx5="http://schemas.microsoft.com/office/drawing/2016/5/11/chartex" xmlns:cx6="http://schemas.microsoft.com/office/drawing/2016/5/12/chartex" xmlns:cx7="http://schemas.microsoft.com/office/drawing/2016/5/13/chartex" xmlns:cx8="http://schemas.microsoft.com/office/drawing/2016/5/14/chartex" xmlns:mc="http://schemas.openxmlformats.org/markup-compatibility/2006" xmlns:aink="http://schemas.microsoft.com/office/drawing/2016/ink" xmlns:am3d="http://schemas.microsoft.com/office/drawing/2017/model3d" xmlns:o="urn:schemas-microsoft-com:office:office" xmlns:oel="http://schemas.microsoft.com/office/2019/extlst" xmlns:r="http://schemas.openxmlformats.org/officeDocument/2006/relationships" xmlns:m="http://schemas.openxmlformats.org/officeDocument/2006/math" xmlns:v="urn:schemas-microsoft-com:vml" xmlns:wp14="http://schemas.microsoft.com/office/word/2010/wordprocessingDrawing" xmlns:wp="http://schemas.openxmlformats.org/drawingml/2006/wordprocessingDrawing" xmlns:w10="urn:schemas-microsoft-com:office:word" xmlns:w="http://schemas.openxmlformats.org/wordprocessingml/2006/main" xmlns:w14="http://schemas.microsoft.com/office/word/2010/wordml" xmlns:w15="http://schemas.microsoft.com/office/word/2012/wordml" xmlns:w16cex="http://schemas.microsoft.com/office/word/2018/wordml/cex" xmlns:w16cid="http://schemas.microsoft.com/office/word/2016/wordml/cid" xmlns:w16="http://schemas.microsoft.com/office/word/2018/wordml" xmlns:w16du="http://schemas.microsoft.com/office/word/2023/wordml/word16du" xmlns:w16sdtdh="http://schemas.microsoft.com/office/word/2020/wordml/sdtdatahash" xmlns:w16sdtfl="http://schemas.microsoft.com/office/word/2024/wordml/sdtformatlock" xmlns:w16se="http://schemas.microsoft.com/office/word/2015/wordml/symex" xmlns:wpg="http://schemas.microsoft.com/office/word/2010/wordprocessingGroup" xmlns:wpi="http://schemas.microsoft.com/office/word/2010/wordprocessingInk" xmlns:wne="http://schemas.microsoft.com/office/word/2006/wordml" xmlns:wps="http://schemas.microsoft.com/office/word/2010/wordprocessingShape" mc:Ignorable="w14 w15 w16se w16cid w16 w16cex w16sdtdh w16sdtfl w16du wp14">
+<w:hdr xmlns:wpc="http://schemas.microsoft.com/office/word/2010/wordprocessingCanvas" xmlns:cx="http://schemas.microsoft.com/office/drawing/2014/chartex" xmlns:mc="http://schemas.openxmlformats.org/markup-compatibility/2006" xmlns:o="urn:schemas-microsoft-com:office:office" xmlns:r="http://schemas.openxmlformats.org/officeDocument/2006/relationships" xmlns:m="http://schemas.openxmlformats.org/officeDocument/2006/math" xmlns:v="urn:schemas-microsoft-com:vml" xmlns:wp14="http://schemas.microsoft.com/office/word/2010/wordprocessingDrawing" xmlns:wp="http://schemas.openxmlformats.org/drawingml/2006/wordprocessingDrawing" xmlns:w10="urn:schemas-microsoft-com:office:word" xmlns:w="http://schemas.openxmlformats.org/wordprocessingml/2006/main" xmlns:w14="http://schemas.microsoft.com/office/word/2010/wordml" xmlns:w15="http://schemas.microsoft.com/office/word/2012/wordml" xmlns:w16se="http://schemas.microsoft.com/office/word/2015/wordml/symex" xmlns:wpg="http://schemas.microsoft.com/office/word/2010/wordprocessingGroup" xmlns:wpi="http://schemas.microsoft.com/office/word/2010/wordprocessingInk" xmlns:wne="http://schemas.microsoft.com/office/word/2006/wordml" xmlns:wps="http://schemas.microsoft.com/office/word/2010/wordprocessingShape" mc:Ignorable="w14 w15 w16se wp14">
   <w:sdt>
     <w:sdtPr>
       <w:rPr>
@@ -12524,6 +12904,11 @@
         <w:docPartUnique/>
       </w:docPartObj>
     </w:sdtPr>
+    <w:sdtEndPr>
+      <w:rPr>
+        <w:rStyle w:val="af2"/>
+      </w:rPr>
+    </w:sdtEndPr>
     <w:sdtContent>
       <w:p>
         <w:pPr>
@@ -12556,7 +12941,7 @@
             <w:rStyle w:val="af2"/>
             <w:noProof/>
           </w:rPr>
-          <w:t>3</w:t>
+          <w:t>21</w:t>
         </w:r>
         <w:r>
           <w:rPr>
@@ -12576,7 +12961,7 @@
 </file>
 
 <file path=word/header3.xml><?xml version="1.0" encoding="utf-8"?>
-<w:hdr xmlns:wpc="http://schemas.microsoft.com/office/word/2010/wordprocessingCanvas" xmlns:cx="http://schemas.microsoft.com/office/drawing/2014/chartex" xmlns:cx1="http://schemas.microsoft.com/office/drawing/2015/9/8/chartex" xmlns:cx2="http://schemas.microsoft.com/office/drawing/2015/10/21/chartex" xmlns:cx3="http://schemas.microsoft.com/office/drawing/2016/5/9/chartex" xmlns:cx4="http://schemas.microsoft.com/office/drawing/2016/5/10/chartex" xmlns:cx5="http://schemas.microsoft.com/office/drawing/2016/5/11/chartex" xmlns:cx6="http://schemas.microsoft.com/office/drawing/2016/5/12/chartex" xmlns:cx7="http://schemas.microsoft.com/office/drawing/2016/5/13/chartex" xmlns:cx8="http://schemas.microsoft.com/office/drawing/2016/5/14/chartex" xmlns:mc="http://schemas.openxmlformats.org/markup-compatibility/2006" xmlns:aink="http://schemas.microsoft.com/office/drawing/2016/ink" xmlns:am3d="http://schemas.microsoft.com/office/drawing/2017/model3d" xmlns:o="urn:schemas-microsoft-com:office:office" xmlns:oel="http://schemas.microsoft.com/office/2019/extlst" xmlns:r="http://schemas.openxmlformats.org/officeDocument/2006/relationships" xmlns:m="http://schemas.openxmlformats.org/officeDocument/2006/math" xmlns:v="urn:schemas-microsoft-com:vml" xmlns:wp14="http://schemas.microsoft.com/office/word/2010/wordprocessingDrawing" xmlns:wp="http://schemas.openxmlformats.org/drawingml/2006/wordprocessingDrawing" xmlns:w10="urn:schemas-microsoft-com:office:word" xmlns:w="http://schemas.openxmlformats.org/wordprocessingml/2006/main" xmlns:w14="http://schemas.microsoft.com/office/word/2010/wordml" xmlns:w15="http://schemas.microsoft.com/office/word/2012/wordml" xmlns:w16cex="http://schemas.microsoft.com/office/word/2018/wordml/cex" xmlns:w16cid="http://schemas.microsoft.com/office/word/2016/wordml/cid" xmlns:w16="http://schemas.microsoft.com/office/word/2018/wordml" xmlns:w16du="http://schemas.microsoft.com/office/word/2023/wordml/word16du" xmlns:w16sdtdh="http://schemas.microsoft.com/office/word/2020/wordml/sdtdatahash" xmlns:w16sdtfl="http://schemas.microsoft.com/office/word/2024/wordml/sdtformatlock" xmlns:w16se="http://schemas.microsoft.com/office/word/2015/wordml/symex" xmlns:wpg="http://schemas.microsoft.com/office/word/2010/wordprocessingGroup" xmlns:wpi="http://schemas.microsoft.com/office/word/2010/wordprocessingInk" xmlns:wne="http://schemas.microsoft.com/office/word/2006/wordml" xmlns:wps="http://schemas.microsoft.com/office/word/2010/wordprocessingShape" mc:Ignorable="w14 w15 w16se w16cid w16 w16cex w16sdtdh w16sdtfl w16du wp14">
+<w:hdr xmlns:wpc="http://schemas.microsoft.com/office/word/2010/wordprocessingCanvas" xmlns:cx="http://schemas.microsoft.com/office/drawing/2014/chartex" xmlns:mc="http://schemas.openxmlformats.org/markup-compatibility/2006" xmlns:o="urn:schemas-microsoft-com:office:office" xmlns:r="http://schemas.openxmlformats.org/officeDocument/2006/relationships" xmlns:m="http://schemas.openxmlformats.org/officeDocument/2006/math" xmlns:v="urn:schemas-microsoft-com:vml" xmlns:wp14="http://schemas.microsoft.com/office/word/2010/wordprocessingDrawing" xmlns:wp="http://schemas.openxmlformats.org/drawingml/2006/wordprocessingDrawing" xmlns:w10="urn:schemas-microsoft-com:office:word" xmlns:w="http://schemas.openxmlformats.org/wordprocessingml/2006/main" xmlns:w14="http://schemas.microsoft.com/office/word/2010/wordml" xmlns:w15="http://schemas.microsoft.com/office/word/2012/wordml" xmlns:w16se="http://schemas.microsoft.com/office/word/2015/wordml/symex" xmlns:wpg="http://schemas.microsoft.com/office/word/2010/wordprocessingGroup" xmlns:wpi="http://schemas.microsoft.com/office/word/2010/wordprocessingInk" xmlns:wne="http://schemas.microsoft.com/office/word/2006/wordml" xmlns:wps="http://schemas.microsoft.com/office/word/2010/wordprocessingShape" mc:Ignorable="w14 w15 w16se wp14">
   <w:p>
     <w:pPr>
       <w:ind w:right="754"/>
@@ -12707,7 +13092,7 @@
 </file>
 
 <file path=word/numbering.xml><?xml version="1.0" encoding="utf-8"?>
-<w:numbering xmlns:wpc="http://schemas.microsoft.com/office/word/2010/wordprocessingCanvas" xmlns:cx="http://schemas.microsoft.com/office/drawing/2014/chartex" xmlns:cx1="http://schemas.microsoft.com/office/drawing/2015/9/8/chartex" xmlns:cx2="http://schemas.microsoft.com/office/drawing/2015/10/21/chartex" xmlns:cx3="http://schemas.microsoft.com/office/drawing/2016/5/9/chartex" xmlns:cx4="http://schemas.microsoft.com/office/drawing/2016/5/10/chartex" xmlns:cx5="http://schemas.microsoft.com/office/drawing/2016/5/11/chartex" xmlns:cx6="http://schemas.microsoft.com/office/drawing/2016/5/12/chartex" xmlns:cx7="http://schemas.microsoft.com/office/drawing/2016/5/13/chartex" xmlns:cx8="http://schemas.microsoft.com/office/drawing/2016/5/14/chartex" xmlns:mc="http://schemas.openxmlformats.org/markup-compatibility/2006" xmlns:aink="http://schemas.microsoft.com/office/drawing/2016/ink" xmlns:am3d="http://schemas.microsoft.com/office/drawing/2017/model3d" xmlns:o="urn:schemas-microsoft-com:office:office" xmlns:oel="http://schemas.microsoft.com/office/2019/extlst" xmlns:r="http://schemas.openxmlformats.org/officeDocument/2006/relationships" xmlns:m="http://schemas.openxmlformats.org/officeDocument/2006/math" xmlns:v="urn:schemas-microsoft-com:vml" xmlns:wp14="http://schemas.microsoft.com/office/word/2010/wordprocessingDrawing" xmlns:wp="http://schemas.openxmlformats.org/drawingml/2006/wordprocessingDrawing" xmlns:w10="urn:schemas-microsoft-com:office:word" xmlns:w="http://schemas.openxmlformats.org/wordprocessingml/2006/main" xmlns:w14="http://schemas.microsoft.com/office/word/2010/wordml" xmlns:w15="http://schemas.microsoft.com/office/word/2012/wordml" xmlns:w16cex="http://schemas.microsoft.com/office/word/2018/wordml/cex" xmlns:w16cid="http://schemas.microsoft.com/office/word/2016/wordml/cid" xmlns:w16="http://schemas.microsoft.com/office/word/2018/wordml" xmlns:w16du="http://schemas.microsoft.com/office/word/2023/wordml/word16du" xmlns:w16sdtdh="http://schemas.microsoft.com/office/word/2020/wordml/sdtdatahash" xmlns:w16sdtfl="http://schemas.microsoft.com/office/word/2024/wordml/sdtformatlock" xmlns:w16se="http://schemas.microsoft.com/office/word/2015/wordml/symex" xmlns:wpg="http://schemas.microsoft.com/office/word/2010/wordprocessingGroup" xmlns:wpi="http://schemas.microsoft.com/office/word/2010/wordprocessingInk" xmlns:wne="http://schemas.microsoft.com/office/word/2006/wordml" xmlns:wps="http://schemas.microsoft.com/office/word/2010/wordprocessingShape" mc:Ignorable="w14 w15 w16se w16cid w16 w16cex w16sdtdh w16sdtfl w16du wp14">
+<w:numbering xmlns:wpc="http://schemas.microsoft.com/office/word/2010/wordprocessingCanvas" xmlns:cx="http://schemas.microsoft.com/office/drawing/2014/chartex" xmlns:mc="http://schemas.openxmlformats.org/markup-compatibility/2006" xmlns:o="urn:schemas-microsoft-com:office:office" xmlns:r="http://schemas.openxmlformats.org/officeDocument/2006/relationships" xmlns:m="http://schemas.openxmlformats.org/officeDocument/2006/math" xmlns:v="urn:schemas-microsoft-com:vml" xmlns:wp14="http://schemas.microsoft.com/office/word/2010/wordprocessingDrawing" xmlns:wp="http://schemas.openxmlformats.org/drawingml/2006/wordprocessingDrawing" xmlns:w10="urn:schemas-microsoft-com:office:word" xmlns:w="http://schemas.openxmlformats.org/wordprocessingml/2006/main" xmlns:w14="http://schemas.microsoft.com/office/word/2010/wordml" xmlns:w15="http://schemas.microsoft.com/office/word/2012/wordml" xmlns:w16se="http://schemas.microsoft.com/office/word/2015/wordml/symex" xmlns:wpg="http://schemas.microsoft.com/office/word/2010/wordprocessingGroup" xmlns:wpi="http://schemas.microsoft.com/office/word/2010/wordprocessingInk" xmlns:wne="http://schemas.microsoft.com/office/word/2006/wordml" xmlns:wps="http://schemas.microsoft.com/office/word/2010/wordprocessingShape" mc:Ignorable="w14 w15 w16se wp14">
   <w:abstractNum w:abstractNumId="0" w15:restartNumberingAfterBreak="0">
     <w:nsid w:val="00420B29"/>
     <w:multiLevelType w:val="hybridMultilevel"/>
@@ -13269,29 +13654,29 @@
       </w:pPr>
     </w:lvl>
   </w:abstractNum>
-  <w:num w:numId="1" w16cid:durableId="256984313">
+  <w:num w:numId="1">
     <w:abstractNumId w:val="3"/>
   </w:num>
-  <w:num w:numId="2" w16cid:durableId="1115170317">
+  <w:num w:numId="2">
     <w:abstractNumId w:val="2"/>
   </w:num>
-  <w:num w:numId="3" w16cid:durableId="247544397">
+  <w:num w:numId="3">
     <w:abstractNumId w:val="4"/>
   </w:num>
-  <w:num w:numId="4" w16cid:durableId="1330331938">
+  <w:num w:numId="4">
     <w:abstractNumId w:val="0"/>
   </w:num>
-  <w:num w:numId="5" w16cid:durableId="541984091">
+  <w:num w:numId="5">
     <w:abstractNumId w:val="1"/>
   </w:num>
-  <w:num w:numId="6" w16cid:durableId="1015613506">
+  <w:num w:numId="6">
     <w:abstractNumId w:val="5"/>
   </w:num>
 </w:numbering>
 </file>
 
 <file path=word/styles.xml><?xml version="1.0" encoding="utf-8"?>
-<w:styles xmlns:mc="http://schemas.openxmlformats.org/markup-compatibility/2006" xmlns:r="http://schemas.openxmlformats.org/officeDocument/2006/relationships" xmlns:w="http://schemas.openxmlformats.org/wordprocessingml/2006/main" xmlns:w14="http://schemas.microsoft.com/office/word/2010/wordml" xmlns:w15="http://schemas.microsoft.com/office/word/2012/wordml" xmlns:w16cex="http://schemas.microsoft.com/office/word/2018/wordml/cex" xmlns:w16cid="http://schemas.microsoft.com/office/word/2016/wordml/cid" xmlns:w16="http://schemas.microsoft.com/office/word/2018/wordml" xmlns:w16du="http://schemas.microsoft.com/office/word/2023/wordml/word16du" xmlns:w16sdtdh="http://schemas.microsoft.com/office/word/2020/wordml/sdtdatahash" xmlns:w16sdtfl="http://schemas.microsoft.com/office/word/2024/wordml/sdtformatlock" xmlns:w16se="http://schemas.microsoft.com/office/word/2015/wordml/symex" mc:Ignorable="w14 w15 w16se w16cid w16 w16cex w16sdtdh w16sdtfl w16du">
+<w:styles xmlns:mc="http://schemas.openxmlformats.org/markup-compatibility/2006" xmlns:r="http://schemas.openxmlformats.org/officeDocument/2006/relationships" xmlns:w="http://schemas.openxmlformats.org/wordprocessingml/2006/main" xmlns:w14="http://schemas.microsoft.com/office/word/2010/wordml" xmlns:w15="http://schemas.microsoft.com/office/word/2012/wordml" xmlns:w16se="http://schemas.microsoft.com/office/word/2015/wordml/symex" mc:Ignorable="w14 w15 w16se">
   <w:docDefaults>
     <w:rPrDefault>
       <w:rPr>
@@ -13299,7 +13684,7 @@
         <w:kern w:val="2"/>
         <w:sz w:val="24"/>
         <w:szCs w:val="24"/>
-        <w:lang w:val="ru-US" w:eastAsia="en-US" w:bidi="ar-SA"/>
+        <w:lang w:eastAsia="en-US" w:bidi="ar-SA"/>
         <w14:ligatures w14:val="standardContextual"/>
       </w:rPr>
     </w:rPrDefault>
@@ -13309,7 +13694,7 @@
       </w:pPr>
     </w:pPrDefault>
   </w:docDefaults>
-  <w:latentStyles w:defLockedState="0" w:defUIPriority="99" w:defSemiHidden="0" w:defUnhideWhenUsed="0" w:defQFormat="0" w:count="376">
+  <w:latentStyles w:defLockedState="0" w:defUIPriority="99" w:defSemiHidden="0" w:defUnhideWhenUsed="0" w:defQFormat="0" w:count="371">
     <w:lsdException w:name="Normal" w:uiPriority="0" w:qFormat="1"/>
     <w:lsdException w:name="heading 1" w:uiPriority="9" w:qFormat="1"/>
     <w:lsdException w:name="heading 2" w:semiHidden="1" w:uiPriority="9" w:unhideWhenUsed="1" w:qFormat="1"/>
@@ -13681,11 +14066,6 @@
     <w:lsdException w:name="List Table 5 Dark Accent 6" w:uiPriority="50"/>
     <w:lsdException w:name="List Table 6 Colorful Accent 6" w:uiPriority="51"/>
     <w:lsdException w:name="List Table 7 Colorful Accent 6" w:uiPriority="52"/>
-    <w:lsdException w:name="Mention" w:semiHidden="1" w:unhideWhenUsed="1"/>
-    <w:lsdException w:name="Smart Hyperlink" w:semiHidden="1" w:unhideWhenUsed="1"/>
-    <w:lsdException w:name="Hashtag" w:semiHidden="1" w:unhideWhenUsed="1"/>
-    <w:lsdException w:name="Unresolved Mention" w:semiHidden="1" w:unhideWhenUsed="1"/>
-    <w:lsdException w:name="Smart Link" w:semiHidden="1" w:unhideWhenUsed="1"/>
   </w:latentStyles>
   <w:style w:type="paragraph" w:default="1" w:styleId="a">
     <w:name w:val="Normal"/>
@@ -14309,8 +14689,8 @@
     <w:unhideWhenUsed/>
     <w:rsid w:val="00E575E6"/>
   </w:style>
-  <w:style w:type="paragraph" w:customStyle="1" w:styleId="Normal">
-    <w:name w:val="Normal"/>
+  <w:style w:type="paragraph" w:customStyle="1" w:styleId="11">
+    <w:name w:val="Обычный1"/>
     <w:rsid w:val="00BE3FF9"/>
     <w:pPr>
       <w:spacing w:after="0" w:line="240" w:lineRule="auto"/>
@@ -14630,7 +15010,7 @@
 </file>
 
 <file path=customXml/itemProps1.xml><?xml version="1.0" encoding="utf-8"?>
-<ds:datastoreItem xmlns:ds="http://schemas.openxmlformats.org/officeDocument/2006/customXml" ds:itemID="{057F291A-FF30-B347-AD85-74738F7BE2FB}">
+<ds:datastoreItem xmlns:ds="http://schemas.openxmlformats.org/officeDocument/2006/customXml" ds:itemID="{7D3BABA9-C64B-4B6B-8929-48FFDC01E6D6}">
   <ds:schemaRefs>
     <ds:schemaRef ds:uri="http://schemas.openxmlformats.org/officeDocument/2006/bibliography"/>
   </ds:schemaRefs>

</xml_diff>